<commit_message>
Enrich case studies with selection rationale and background
각 사례(국내외 9개)에 '선정 사유(통합 모범사례 근거)'와 '배경·개요'를
추가하여 통합 차원의 모범사례성·선정 이유를 명시. 최종 md 및 Word 재생성.

Co-Authored-By: Claude Opus 4.8 <noreply@anthropic.com>
Claude-Session: https://claude.ai/code/session_01FvjRmPktyGoCyeGhQJijKL
</commit_message>
<xml_diff>
--- a/reports/국민통합_정책보고서.docx
+++ b/reports/국민통합_정책보고서.docx
@@ -562,6 +562,20 @@
     </w:p>
     <w:p>
       <w:pPr>
+        <w:spacing w:after="40" w:before="0" w:line="312" w:lineRule="auto"/>
+        <w:ind w:left="113"/>
+      </w:pPr>
+      <w:r>
+        <w:rPr>
+          <w:rFonts w:ascii="맑은 고딕" w:hAnsi="맑은 고딕" w:eastAsia="맑은 고딕"/>
+          <w:b w:val="0"/>
+          <w:sz w:val="19"/>
+        </w:rPr>
+        <w:t>※ 각 사례는 '선정 사유(통합 모범사례 근거)'를 기준으로 발굴하였으며, 배경·정책·성과·시사점 순으로 기술함</w:t>
+      </w:r>
+    </w:p>
+    <w:p>
+      <w:pPr>
         <w:spacing w:before="160" w:after="80"/>
       </w:pPr>
       <w:r>
@@ -599,7 +613,35 @@
           <w:b w:val="0"/>
           <w:sz w:val="22"/>
         </w:rPr>
-        <w:t>○ 정책: 1995년 「국민통합·화해증진법」 제정, 조건부 사면·피해자 배상 병행</w:t>
+        <w:t>○ 선정 사유(통합 모범사례 근거)</w:t>
+      </w:r>
+    </w:p>
+    <w:p>
+      <w:pPr>
+        <w:spacing w:after="40" w:before="0" w:line="312" w:lineRule="auto"/>
+        <w:ind w:left="850"/>
+      </w:pPr>
+      <w:r>
+        <w:rPr>
+          <w:rFonts w:ascii="맑은 고딕" w:hAnsi="맑은 고딕" w:eastAsia="맑은 고딕"/>
+          <w:b w:val="0"/>
+          <w:sz w:val="21"/>
+        </w:rPr>
+        <w:t>- 가해자 처벌(뉘른베르크식 응보적 정의)의 한계를 넘어 '진실고백-사면-화해'라는 회복적 정의 모델을 세계 최초로 제도화한 사례임</w:t>
+      </w:r>
+    </w:p>
+    <w:p>
+      <w:pPr>
+        <w:spacing w:after="40" w:before="0" w:line="312" w:lineRule="auto"/>
+        <w:ind w:left="850"/>
+      </w:pPr>
+      <w:r>
+        <w:rPr>
+          <w:rFonts w:ascii="맑은 고딕" w:hAnsi="맑은 고딕" w:eastAsia="맑은 고딕"/>
+          <w:b w:val="0"/>
+          <w:sz w:val="21"/>
+        </w:rPr>
+        <w:t>- 300년 인종분리(아파르트헤이트)의 극단적 흑백 분열을 내전·보복 없이 평화적 체제전환으로 전환, 이행기정의(transitional justice)의 국제 표준으로 정립됨</w:t>
       </w:r>
     </w:p>
     <w:p>
@@ -613,7 +655,35 @@
           <w:b w:val="0"/>
           <w:sz w:val="22"/>
         </w:rPr>
-        <w:t>○ 성과: 피해자 진술 2.2만건 접수, 사면 신청 7,112건 중 849건 인용</w:t>
+        <w:t>○ 배경·개요</w:t>
+      </w:r>
+    </w:p>
+    <w:p>
+      <w:pPr>
+        <w:spacing w:after="40" w:before="0" w:line="312" w:lineRule="auto"/>
+        <w:ind w:left="850"/>
+      </w:pPr>
+      <w:r>
+        <w:rPr>
+          <w:rFonts w:ascii="맑은 고딕" w:hAnsi="맑은 고딕" w:eastAsia="맑은 고딕"/>
+          <w:b w:val="0"/>
+          <w:sz w:val="21"/>
+        </w:rPr>
+        <w:t>- 1948~1994년 아파르트헤이트 체제 하 대규모 인권침해로 흑백 간 극심한 사회분열 발생</w:t>
+      </w:r>
+    </w:p>
+    <w:p>
+      <w:pPr>
+        <w:spacing w:after="40" w:before="0" w:line="312" w:lineRule="auto"/>
+        <w:ind w:left="850"/>
+      </w:pPr>
+      <w:r>
+        <w:rPr>
+          <w:rFonts w:ascii="맑은 고딕" w:hAnsi="맑은 고딕" w:eastAsia="맑은 고딕"/>
+          <w:b w:val="0"/>
+          <w:sz w:val="21"/>
+        </w:rPr>
+        <w:t>- 1994년 만델라 정부 출범 후 '처벌이 아닌 진실규명·화해'를 국민통합 경로로 선택</w:t>
       </w:r>
     </w:p>
     <w:p>
@@ -627,7 +697,91 @@
           <w:b w:val="0"/>
           <w:sz w:val="22"/>
         </w:rPr>
-        <w:t>○ 시사점 → ①소통·화합 ④신뢰 : 처벌 아닌 진실규명 기반 공동체 회복 모델</w:t>
+        <w:t>○ 정책적 노력</w:t>
+      </w:r>
+    </w:p>
+    <w:p>
+      <w:pPr>
+        <w:spacing w:after="40" w:before="0" w:line="312" w:lineRule="auto"/>
+        <w:ind w:left="850"/>
+      </w:pPr>
+      <w:r>
+        <w:rPr>
+          <w:rFonts w:ascii="맑은 고딕" w:hAnsi="맑은 고딕" w:eastAsia="맑은 고딕"/>
+          <w:b w:val="0"/>
+          <w:sz w:val="21"/>
+        </w:rPr>
+        <w:t>- 1995년 「국민통합·화해증진법」 제정, 투투 대주교 위원장으로 위원 17명 위원회 구성</w:t>
+      </w:r>
+    </w:p>
+    <w:p>
+      <w:pPr>
+        <w:spacing w:after="40" w:before="0" w:line="312" w:lineRule="auto"/>
+        <w:ind w:left="850"/>
+      </w:pPr>
+      <w:r>
+        <w:rPr>
+          <w:rFonts w:ascii="맑은 고딕" w:hAnsi="맑은 고딕" w:eastAsia="맑은 고딕"/>
+          <w:b w:val="0"/>
+          <w:sz w:val="21"/>
+        </w:rPr>
+        <w:t>- 인권침해 조사·공개청문회·조건부 사면(완전한 진실고백 시)·피해자 배상 4대 기능 수행</w:t>
+      </w:r>
+    </w:p>
+    <w:p>
+      <w:pPr>
+        <w:spacing w:after="40" w:before="0" w:line="312" w:lineRule="auto"/>
+        <w:ind w:left="397"/>
+      </w:pPr>
+      <w:r>
+        <w:rPr>
+          <w:rFonts w:ascii="맑은 고딕" w:hAnsi="맑은 고딕" w:eastAsia="맑은 고딕"/>
+          <w:b w:val="0"/>
+          <w:sz w:val="22"/>
+        </w:rPr>
+        <w:t>○ 성과</w:t>
+      </w:r>
+    </w:p>
+    <w:p>
+      <w:pPr>
+        <w:spacing w:after="40" w:before="0" w:line="312" w:lineRule="auto"/>
+        <w:ind w:left="850"/>
+      </w:pPr>
+      <w:r>
+        <w:rPr>
+          <w:rFonts w:ascii="맑은 고딕" w:hAnsi="맑은 고딕" w:eastAsia="맑은 고딕"/>
+          <w:b w:val="0"/>
+          <w:sz w:val="21"/>
+        </w:rPr>
+        <w:t>- 피해자 진술 2.2만건 접수, 사면 신청 7,112건 중 849건 인용·5,392건 기각으로 '진실고백 대가 사면' 원칙 관철(단, 배상 실집행 미흡 한계 병존)</w:t>
+      </w:r>
+    </w:p>
+    <w:p>
+      <w:pPr>
+        <w:spacing w:after="40" w:before="0" w:line="312" w:lineRule="auto"/>
+        <w:ind w:left="397"/>
+      </w:pPr>
+      <w:r>
+        <w:rPr>
+          <w:rFonts w:ascii="맑은 고딕" w:hAnsi="맑은 고딕" w:eastAsia="맑은 고딕"/>
+          <w:b w:val="0"/>
+          <w:sz w:val="22"/>
+        </w:rPr>
+        <w:t>○ 통합적 의의 및 시사점 → ①소통·화합 ④신뢰</w:t>
+      </w:r>
+    </w:p>
+    <w:p>
+      <w:pPr>
+        <w:spacing w:after="40" w:before="0" w:line="312" w:lineRule="auto"/>
+        <w:ind w:left="850"/>
+      </w:pPr>
+      <w:r>
+        <w:rPr>
+          <w:rFonts w:ascii="맑은 고딕" w:hAnsi="맑은 고딕" w:eastAsia="맑은 고딕"/>
+          <w:b w:val="0"/>
+          <w:sz w:val="21"/>
+        </w:rPr>
+        <w:t>- 가해·피해 대립을 '진실규명 기반 공동체 회복'으로 전환한 점이 정치·과거사 갈등 치유의 원형으로 기능함</w:t>
       </w:r>
     </w:p>
     <w:p>
@@ -655,7 +809,35 @@
           <w:b w:val="0"/>
           <w:sz w:val="22"/>
         </w:rPr>
-        <w:t>○ 정책: 1991년 연대부가세(소득·법인세 5.5% 부가)·연대협약을 통한 동독 집중 투입</w:t>
+        <w:t>○ 선정 사유(통합 모범사례 근거)</w:t>
+      </w:r>
+    </w:p>
+    <w:p>
+      <w:pPr>
+        <w:spacing w:after="40" w:before="0" w:line="312" w:lineRule="auto"/>
+        <w:ind w:left="850"/>
+      </w:pPr>
+      <w:r>
+        <w:rPr>
+          <w:rFonts w:ascii="맑은 고딕" w:hAnsi="맑은 고딕" w:eastAsia="맑은 고딕"/>
+          <w:b w:val="0"/>
+          <w:sz w:val="21"/>
+        </w:rPr>
+        <w:t>- 분단·이질 체제의 통합이라는 한국과 가장 유사한 조건에서, 구호적 지원이 아닌 '연대세'라는 항구적 조세제도로 동서 격차를 실제로 좁힌 유일 사례임</w:t>
+      </w:r>
+    </w:p>
+    <w:p>
+      <w:pPr>
+        <w:spacing w:after="40" w:before="0" w:line="312" w:lineRule="auto"/>
+        <w:ind w:left="850"/>
+      </w:pPr>
+      <w:r>
+        <w:rPr>
+          <w:rFonts w:ascii="맑은 고딕" w:hAnsi="맑은 고딕" w:eastAsia="맑은 고딕"/>
+          <w:b w:val="0"/>
+          <w:sz w:val="21"/>
+        </w:rPr>
+        <w:t>- 부담(고소득층·서독)과 수혜(동독)를 제도로 연결한 '연대의 제도화' 모범이며, 30년 장기추진의 성과·한계를 동시에 보여주는 준거임</w:t>
       </w:r>
     </w:p>
     <w:p>
@@ -669,7 +851,35 @@
           <w:b w:val="0"/>
           <w:sz w:val="22"/>
         </w:rPr>
-        <w:t>○ 성과: 동독 경제력 서독 대비 43%(1990)→약 75%(2018), 소득 약 85% 수렴</w:t>
+        <w:t>○ 배경·개요</w:t>
+      </w:r>
+    </w:p>
+    <w:p>
+      <w:pPr>
+        <w:spacing w:after="40" w:before="0" w:line="312" w:lineRule="auto"/>
+        <w:ind w:left="850"/>
+      </w:pPr>
+      <w:r>
+        <w:rPr>
+          <w:rFonts w:ascii="맑은 고딕" w:hAnsi="맑은 고딕" w:eastAsia="맑은 고딕"/>
+          <w:b w:val="0"/>
+          <w:sz w:val="21"/>
+        </w:rPr>
+        <w:t>- 1990년 통일 시점 동독 경제력이 서독의 약 43%로 극심한 동서 격차 존재(KIEP)</w:t>
+      </w:r>
+    </w:p>
+    <w:p>
+      <w:pPr>
+        <w:spacing w:after="40" w:before="0" w:line="312" w:lineRule="auto"/>
+        <w:ind w:left="850"/>
+      </w:pPr>
+      <w:r>
+        <w:rPr>
+          <w:rFonts w:ascii="맑은 고딕" w:hAnsi="맑은 고딕" w:eastAsia="맑은 고딕"/>
+          <w:b w:val="0"/>
+          <w:sz w:val="21"/>
+        </w:rPr>
+        <w:t>- 동독 산업기반 붕괴·교역망 단절로 대규모 재정이전 불가피</w:t>
       </w:r>
     </w:p>
     <w:p>
@@ -683,7 +893,105 @@
           <w:b w:val="0"/>
           <w:sz w:val="22"/>
         </w:rPr>
-        <w:t>○ 시사점 → ②격차해소 ⑦상생·연대 : '연대(부담공유)' 재원의 장기·안정 확보(단, 30년+ 소요)</w:t>
+        <w:t>○ 정책적 노력</w:t>
+      </w:r>
+    </w:p>
+    <w:p>
+      <w:pPr>
+        <w:spacing w:after="40" w:before="0" w:line="312" w:lineRule="auto"/>
+        <w:ind w:left="850"/>
+      </w:pPr>
+      <w:r>
+        <w:rPr>
+          <w:rFonts w:ascii="맑은 고딕" w:hAnsi="맑은 고딕" w:eastAsia="맑은 고딕"/>
+          <w:b w:val="0"/>
+          <w:sz w:val="21"/>
+        </w:rPr>
+        <w:t>- 1991년 연대부가세(소득·법인세의 5.5% 부가) 도입, '동방재건'·연대협약Ⅰ·Ⅱ로 동독 집중 투입</w:t>
+      </w:r>
+    </w:p>
+    <w:p>
+      <w:pPr>
+        <w:spacing w:after="40" w:before="0" w:line="312" w:lineRule="auto"/>
+        <w:ind w:left="850"/>
+      </w:pPr>
+      <w:r>
+        <w:rPr>
+          <w:rFonts w:ascii="맑은 고딕" w:hAnsi="맑은 고딕" w:eastAsia="맑은 고딕"/>
+          <w:b w:val="0"/>
+          <w:sz w:val="21"/>
+        </w:rPr>
+        <w:t>- 2021년 개혁으로 납세자 약 90% 면제, 고소득자 중심 부담 유지</w:t>
+      </w:r>
+    </w:p>
+    <w:p>
+      <w:pPr>
+        <w:spacing w:after="40" w:before="0" w:line="312" w:lineRule="auto"/>
+        <w:ind w:left="397"/>
+      </w:pPr>
+      <w:r>
+        <w:rPr>
+          <w:rFonts w:ascii="맑은 고딕" w:hAnsi="맑은 고딕" w:eastAsia="맑은 고딕"/>
+          <w:b w:val="0"/>
+          <w:sz w:val="22"/>
+        </w:rPr>
+        <w:t>○ 성과</w:t>
+      </w:r>
+    </w:p>
+    <w:p>
+      <w:pPr>
+        <w:spacing w:after="40" w:before="0" w:line="312" w:lineRule="auto"/>
+        <w:ind w:left="850"/>
+      </w:pPr>
+      <w:r>
+        <w:rPr>
+          <w:rFonts w:ascii="맑은 고딕" w:hAnsi="맑은 고딕" w:eastAsia="맑은 고딕"/>
+          <w:b w:val="0"/>
+          <w:sz w:val="21"/>
+        </w:rPr>
+        <w:t>- 동독 경제력 서독 대비 43%(1990)→약 75%(2018), 2019년 동독 소득 서독의 약 85% 도달</w:t>
+      </w:r>
+    </w:p>
+    <w:p>
+      <w:pPr>
+        <w:spacing w:after="40" w:before="0" w:line="312" w:lineRule="auto"/>
+        <w:ind w:left="1247"/>
+      </w:pPr>
+      <w:r>
+        <w:rPr>
+          <w:rFonts w:ascii="맑은 고딕" w:hAnsi="맑은 고딕" w:eastAsia="맑은 고딕"/>
+          <w:b w:val="0"/>
+          <w:sz w:val="21"/>
+        </w:rPr>
+        <w:t>· 2025. 3. 독일 연방헌법재판소, 연대세 존속 합헌 결정(단, 제조업 부가가치 서독 절반 등 격차 잔존)</w:t>
+      </w:r>
+    </w:p>
+    <w:p>
+      <w:pPr>
+        <w:spacing w:after="40" w:before="0" w:line="312" w:lineRule="auto"/>
+        <w:ind w:left="397"/>
+      </w:pPr>
+      <w:r>
+        <w:rPr>
+          <w:rFonts w:ascii="맑은 고딕" w:hAnsi="맑은 고딕" w:eastAsia="맑은 고딕"/>
+          <w:b w:val="0"/>
+          <w:sz w:val="22"/>
+        </w:rPr>
+        <w:t>○ 통합적 의의 및 시사점 → ②격차해소 ⑦상생·연대</w:t>
+      </w:r>
+    </w:p>
+    <w:p>
+      <w:pPr>
+        <w:spacing w:after="40" w:before="0" w:line="312" w:lineRule="auto"/>
+        <w:ind w:left="850"/>
+      </w:pPr>
+      <w:r>
+        <w:rPr>
+          <w:rFonts w:ascii="맑은 고딕" w:hAnsi="맑은 고딕" w:eastAsia="맑은 고딕"/>
+          <w:b w:val="0"/>
+          <w:sz w:val="21"/>
+        </w:rPr>
+        <w:t>- '연대(부담공유)' 재원의 장기·안정 확보가 격차완화의 핵심 조건임을 입증(단, 30년+ 장기전 유의)</w:t>
       </w:r>
     </w:p>
     <w:p>
@@ -711,7 +1019,35 @@
           <w:b w:val="0"/>
           <w:sz w:val="22"/>
         </w:rPr>
-        <w:t>○ 정책: 1971년 세계 최초 다문화 국가정책 채택→1988년 「다문화주의법」 법제화</w:t>
+        <w:t>○ 선정 사유(통합 모범사례 근거)</w:t>
+      </w:r>
+    </w:p>
+    <w:p>
+      <w:pPr>
+        <w:spacing w:after="40" w:before="0" w:line="312" w:lineRule="auto"/>
+        <w:ind w:left="850"/>
+      </w:pPr>
+      <w:r>
+        <w:rPr>
+          <w:rFonts w:ascii="맑은 고딕" w:hAnsi="맑은 고딕" w:eastAsia="맑은 고딕"/>
+          <w:b w:val="0"/>
+          <w:sz w:val="21"/>
+        </w:rPr>
+        <w:t>- 다양성을 '갈등 요인'이 아닌 '국가 정체성'으로 전환한 발상의 전환 사례로, 세계 최초로 다문화주의를 국가정책→법률로 승격시킴</w:t>
+      </w:r>
+    </w:p>
+    <w:p>
+      <w:pPr>
+        <w:spacing w:after="40" w:before="0" w:line="312" w:lineRule="auto"/>
+        <w:ind w:left="850"/>
+      </w:pPr>
+      <w:r>
+        <w:rPr>
+          <w:rFonts w:ascii="맑은 고딕" w:hAnsi="맑은 고딕" w:eastAsia="맑은 고딕"/>
+          <w:b w:val="0"/>
+          <w:sz w:val="21"/>
+        </w:rPr>
+        <w:t>- 이민·다인종 사회통합의 국제 준거모델로, 이주민 증가 국면의 한국에 직접 적용가능성이 높아 선정함</w:t>
       </w:r>
     </w:p>
     <w:p>
@@ -725,7 +1061,21 @@
           <w:b w:val="0"/>
           <w:sz w:val="22"/>
         </w:rPr>
-        <w:t>○ 성과: 다문화주의를 국가 정체성으로 정착, 이민사회 통합 국제 준거모델화</w:t>
+        <w:t>○ 배경·개요</w:t>
+      </w:r>
+    </w:p>
+    <w:p>
+      <w:pPr>
+        <w:spacing w:after="40" w:before="0" w:line="312" w:lineRule="auto"/>
+        <w:ind w:left="850"/>
+      </w:pPr>
+      <w:r>
+        <w:rPr>
+          <w:rFonts w:ascii="맑은 고딕" w:hAnsi="맑은 고딕" w:eastAsia="맑은 고딕"/>
+          <w:b w:val="0"/>
+          <w:sz w:val="21"/>
+        </w:rPr>
+        <w:t>- 영어·프랑스어 이중언어 사회에 다양한 이민집단 유입, 문화갈등·소수집단 배제 우려 대두</w:t>
       </w:r>
     </w:p>
     <w:p>
@@ -739,7 +1089,91 @@
           <w:b w:val="0"/>
           <w:sz w:val="22"/>
         </w:rPr>
-        <w:t>○ 시사점 → ⑥포용·존중 ⑤기회균등 : '다양성 인정+주류 참여 보장' 법·제도 병행</w:t>
+        <w:t>○ 정책적 노력</w:t>
+      </w:r>
+    </w:p>
+    <w:p>
+      <w:pPr>
+        <w:spacing w:after="40" w:before="0" w:line="312" w:lineRule="auto"/>
+        <w:ind w:left="850"/>
+      </w:pPr>
+      <w:r>
+        <w:rPr>
+          <w:rFonts w:ascii="맑은 고딕" w:hAnsi="맑은 고딕" w:eastAsia="맑은 고딕"/>
+          <w:b w:val="0"/>
+          <w:sz w:val="21"/>
+        </w:rPr>
+        <w:t>- 1971년 트뤼도 총리, 세계 최초 다문화주의 국가정책 채택→1988년 「다문화주의법」 제정으로 법제화 완성</w:t>
+      </w:r>
+    </w:p>
+    <w:p>
+      <w:pPr>
+        <w:spacing w:after="40" w:before="0" w:line="312" w:lineRule="auto"/>
+        <w:ind w:left="850"/>
+      </w:pPr>
+      <w:r>
+        <w:rPr>
+          <w:rFonts w:ascii="맑은 고딕" w:hAnsi="맑은 고딕" w:eastAsia="맑은 고딕"/>
+          <w:b w:val="0"/>
+          <w:sz w:val="21"/>
+        </w:rPr>
+        <w:t>- 소수집단의 주류 제도 참여·평등 참여 보장, 차별 장벽 제거·문화 간 교류 지원 규정</w:t>
+      </w:r>
+    </w:p>
+    <w:p>
+      <w:pPr>
+        <w:spacing w:after="40" w:before="0" w:line="312" w:lineRule="auto"/>
+        <w:ind w:left="397"/>
+      </w:pPr>
+      <w:r>
+        <w:rPr>
+          <w:rFonts w:ascii="맑은 고딕" w:hAnsi="맑은 고딕" w:eastAsia="맑은 고딕"/>
+          <w:b w:val="0"/>
+          <w:sz w:val="22"/>
+        </w:rPr>
+        <w:t>○ 성과</w:t>
+      </w:r>
+    </w:p>
+    <w:p>
+      <w:pPr>
+        <w:spacing w:after="40" w:before="0" w:line="312" w:lineRule="auto"/>
+        <w:ind w:left="850"/>
+      </w:pPr>
+      <w:r>
+        <w:rPr>
+          <w:rFonts w:ascii="맑은 고딕" w:hAnsi="맑은 고딕" w:eastAsia="맑은 고딕"/>
+          <w:b w:val="0"/>
+          <w:sz w:val="21"/>
+        </w:rPr>
+        <w:t>- 다문화주의를 국가 정체성으로 정착, 이민사회 통합의 국제 준거모델화(정량지표는 원자료별 상이, 일반적 평가)</w:t>
+      </w:r>
+    </w:p>
+    <w:p>
+      <w:pPr>
+        <w:spacing w:after="40" w:before="0" w:line="312" w:lineRule="auto"/>
+        <w:ind w:left="397"/>
+      </w:pPr>
+      <w:r>
+        <w:rPr>
+          <w:rFonts w:ascii="맑은 고딕" w:hAnsi="맑은 고딕" w:eastAsia="맑은 고딕"/>
+          <w:b w:val="0"/>
+          <w:sz w:val="22"/>
+        </w:rPr>
+        <w:t>○ 통합적 의의 및 시사점 → ⑥포용·존중 ⑤기회균등</w:t>
+      </w:r>
+    </w:p>
+    <w:p>
+      <w:pPr>
+        <w:spacing w:after="40" w:before="0" w:line="312" w:lineRule="auto"/>
+        <w:ind w:left="850"/>
+      </w:pPr>
+      <w:r>
+        <w:rPr>
+          <w:rFonts w:ascii="맑은 고딕" w:hAnsi="맑은 고딕" w:eastAsia="맑은 고딕"/>
+          <w:b w:val="0"/>
+          <w:sz w:val="21"/>
+        </w:rPr>
+        <w:t>- '다양성 인정 + 주류 참여 보장'의 법·제도 병행이 다원사회 통합의 요체임</w:t>
       </w:r>
     </w:p>
     <w:p>
@@ -767,7 +1201,35 @@
           <w:b w:val="0"/>
           <w:sz w:val="22"/>
         </w:rPr>
-        <w:t>○ 정책: 전통 분쟁해결 현대화한 지역기반 재판제도 운영(2002~2012)</w:t>
+        <w:t>○ 선정 사유(통합 모범사례 근거)</w:t>
+      </w:r>
+    </w:p>
+    <w:p>
+      <w:pPr>
+        <w:spacing w:after="40" w:before="0" w:line="312" w:lineRule="auto"/>
+        <w:ind w:left="850"/>
+      </w:pPr>
+      <w:r>
+        <w:rPr>
+          <w:rFonts w:ascii="맑은 고딕" w:hAnsi="맑은 고딕" w:eastAsia="맑은 고딕"/>
+          <w:b w:val="0"/>
+          <w:sz w:val="21"/>
+        </w:rPr>
+        <w:t>- 100일 대량학살 후 가해자·피해자가 같은 마을에 공존해야 하는 극한 조건에서, 전통 공동체 재판으로 대규모 사건을 신속 처리하며 재통합을 추진한 사례임</w:t>
+      </w:r>
+    </w:p>
+    <w:p>
+      <w:pPr>
+        <w:spacing w:after="40" w:before="0" w:line="312" w:lineRule="auto"/>
+        <w:ind w:left="850"/>
+      </w:pPr>
+      <w:r>
+        <w:rPr>
+          <w:rFonts w:ascii="맑은 고딕" w:hAnsi="맑은 고딕" w:eastAsia="맑은 고딕"/>
+          <w:b w:val="0"/>
+          <w:sz w:val="21"/>
+        </w:rPr>
+        <w:t>- '성공'과 '절차 공정성 논란'을 동시에 보유하여, 진실규명형 통합의 성공요건(공정성)을 역으로 입증하는 반면교사로 선정함</w:t>
       </w:r>
     </w:p>
     <w:p>
@@ -781,7 +1243,21 @@
           <w:b w:val="0"/>
           <w:sz w:val="22"/>
         </w:rPr>
-        <w:t>○ 성과: 학살 관련 195.9만건 처리, 유죄율 약 86%(단, 절차 공정성 논란 상존)</w:t>
+        <w:t>○ 배경·개요</w:t>
+      </w:r>
+    </w:p>
+    <w:p>
+      <w:pPr>
+        <w:spacing w:after="40" w:before="0" w:line="312" w:lineRule="auto"/>
+        <w:ind w:left="850"/>
+      </w:pPr>
+      <w:r>
+        <w:rPr>
+          <w:rFonts w:ascii="맑은 고딕" w:hAnsi="맑은 고딕" w:eastAsia="맑은 고딕"/>
+          <w:b w:val="0"/>
+          <w:sz w:val="21"/>
+        </w:rPr>
+        <w:t>- 1994년 대량학살로 후투·투치 종족 극단 분열, 정규 사법으로 처리 불가능한 사건 적체</w:t>
       </w:r>
     </w:p>
     <w:p>
@@ -795,7 +1271,105 @@
           <w:b w:val="0"/>
           <w:sz w:val="22"/>
         </w:rPr>
-        <w:t>○ 시사점 → ①소통·화합 ④신뢰 : 절차 공정성·중립성 미확보 시 신뢰 회복 실패 위험</w:t>
+        <w:t>○ 정책적 노력</w:t>
+      </w:r>
+    </w:p>
+    <w:p>
+      <w:pPr>
+        <w:spacing w:after="40" w:before="0" w:line="312" w:lineRule="auto"/>
+        <w:ind w:left="850"/>
+      </w:pPr>
+      <w:r>
+        <w:rPr>
+          <w:rFonts w:ascii="맑은 고딕" w:hAnsi="맑은 고딕" w:eastAsia="맑은 고딕"/>
+          <w:b w:val="0"/>
+          <w:sz w:val="21"/>
+        </w:rPr>
+        <w:t>- 전통 분쟁해결 방식을 현대화한 지역기반 재판제도 '가차차 법정' 운영(2002~2012)</w:t>
+      </w:r>
+    </w:p>
+    <w:p>
+      <w:pPr>
+        <w:spacing w:after="40" w:before="0" w:line="312" w:lineRule="auto"/>
+        <w:ind w:left="850"/>
+      </w:pPr>
+      <w:r>
+        <w:rPr>
+          <w:rFonts w:ascii="맑은 고딕" w:hAnsi="맑은 고딕" w:eastAsia="맑은 고딕"/>
+          <w:b w:val="0"/>
+          <w:sz w:val="21"/>
+        </w:rPr>
+        <w:t>- 주민 참여형 재판으로 진실규명·처벌·공동체 재통합 목표 결합</w:t>
+      </w:r>
+    </w:p>
+    <w:p>
+      <w:pPr>
+        <w:spacing w:after="40" w:before="0" w:line="312" w:lineRule="auto"/>
+        <w:ind w:left="397"/>
+      </w:pPr>
+      <w:r>
+        <w:rPr>
+          <w:rFonts w:ascii="맑은 고딕" w:hAnsi="맑은 고딕" w:eastAsia="맑은 고딕"/>
+          <w:b w:val="0"/>
+          <w:sz w:val="22"/>
+        </w:rPr>
+        <w:t>○ 성과</w:t>
+      </w:r>
+    </w:p>
+    <w:p>
+      <w:pPr>
+        <w:spacing w:after="40" w:before="0" w:line="312" w:lineRule="auto"/>
+        <w:ind w:left="850"/>
+      </w:pPr>
+      <w:r>
+        <w:rPr>
+          <w:rFonts w:ascii="맑은 고딕" w:hAnsi="맑은 고딕" w:eastAsia="맑은 고딕"/>
+          <w:b w:val="0"/>
+          <w:sz w:val="21"/>
+        </w:rPr>
+        <w:t>- 학살 관련 195.9만건 처리, 유죄율 약 86%로 불처벌 관행 해소 기여</w:t>
+      </w:r>
+    </w:p>
+    <w:p>
+      <w:pPr>
+        <w:spacing w:after="40" w:before="0" w:line="312" w:lineRule="auto"/>
+        <w:ind w:left="1247"/>
+      </w:pPr>
+      <w:r>
+        <w:rPr>
+          <w:rFonts w:ascii="맑은 고딕" w:hAnsi="맑은 고딕" w:eastAsia="맑은 고딕"/>
+          <w:b w:val="0"/>
+          <w:sz w:val="21"/>
+        </w:rPr>
+        <w:t>· 절차적 공정성 논란·정치 개입 지적으로 '부분적 성공' 평가(HRW, 2011)</w:t>
+      </w:r>
+    </w:p>
+    <w:p>
+      <w:pPr>
+        <w:spacing w:after="40" w:before="0" w:line="312" w:lineRule="auto"/>
+        <w:ind w:left="397"/>
+      </w:pPr>
+      <w:r>
+        <w:rPr>
+          <w:rFonts w:ascii="맑은 고딕" w:hAnsi="맑은 고딕" w:eastAsia="맑은 고딕"/>
+          <w:b w:val="0"/>
+          <w:sz w:val="22"/>
+        </w:rPr>
+        <w:t>○ 통합적 의의 및 시사점 → ①소통·화합 ④신뢰</w:t>
+      </w:r>
+    </w:p>
+    <w:p>
+      <w:pPr>
+        <w:spacing w:after="40" w:before="0" w:line="312" w:lineRule="auto"/>
+        <w:ind w:left="850"/>
+      </w:pPr>
+      <w:r>
+        <w:rPr>
+          <w:rFonts w:ascii="맑은 고딕" w:hAnsi="맑은 고딕" w:eastAsia="맑은 고딕"/>
+          <w:b w:val="0"/>
+          <w:sz w:val="21"/>
+        </w:rPr>
+        <w:t>- 공동체 참여형 진실규명의 유효성 확인, 단 절차 공정성·중립성 미확보 시 신뢰 회복 실패 위험</w:t>
       </w:r>
     </w:p>
     <w:p>
@@ -823,7 +1397,35 @@
           <w:b w:val="0"/>
           <w:sz w:val="22"/>
         </w:rPr>
-        <w:t>○ 정책: 1998년 성금요일협정, 비례식 권력공유 자치정부·3대 관계축 제도화</w:t>
+        <w:t>○ 선정 사유(통합 모범사례 근거)</w:t>
+      </w:r>
+    </w:p>
+    <w:p>
+      <w:pPr>
+        <w:spacing w:after="40" w:before="0" w:line="312" w:lineRule="auto"/>
+        <w:ind w:left="850"/>
+      </w:pPr>
+      <w:r>
+        <w:rPr>
+          <w:rFonts w:ascii="맑은 고딕" w:hAnsi="맑은 고딕" w:eastAsia="맑은 고딕"/>
+          <w:b w:val="0"/>
+          <w:sz w:val="21"/>
+        </w:rPr>
+        <w:t>- 30년 유혈 종파분쟁('The Troubles')을 무력이 아닌 '권력공유' 제도설계로 종식시킨, 적대적 양진영 정치갈등 관리의 대표 사례임</w:t>
+      </w:r>
+    </w:p>
+    <w:p>
+      <w:pPr>
+        <w:spacing w:after="40" w:before="0" w:line="312" w:lineRule="auto"/>
+        <w:ind w:left="850"/>
+      </w:pPr>
+      <w:r>
+        <w:rPr>
+          <w:rFonts w:ascii="맑은 고딕" w:hAnsi="맑은 고딕" w:eastAsia="맑은 고딕"/>
+          <w:b w:val="0"/>
+          <w:sz w:val="21"/>
+        </w:rPr>
+        <w:t>- 승자독식이 아닌 '비례적 공동 통치'를 헌정에 담아, 한국의 최상위 갈등(여야 94%) 대응에 직접 시사점을 주어 선정함</w:t>
       </w:r>
     </w:p>
     <w:p>
@@ -837,7 +1439,21 @@
           <w:b w:val="0"/>
           <w:sz w:val="22"/>
         </w:rPr>
-        <w:t>○ 성과: 국민투표 찬성(아일랜드 94%·북아일랜드 71%), 유혈분쟁 종식</w:t>
+        <w:t>○ 배경·개요</w:t>
+      </w:r>
+    </w:p>
+    <w:p>
+      <w:pPr>
+        <w:spacing w:after="40" w:before="0" w:line="312" w:lineRule="auto"/>
+        <w:ind w:left="850"/>
+      </w:pPr>
+      <w:r>
+        <w:rPr>
+          <w:rFonts w:ascii="맑은 고딕" w:hAnsi="맑은 고딕" w:eastAsia="맑은 고딕"/>
+          <w:b w:val="0"/>
+          <w:sz w:val="21"/>
+        </w:rPr>
+        <w:t>- 1960년대 말 이후 신교(연합주의)·구교(민족주의) 간 유혈분쟁 장기 지속</w:t>
       </w:r>
     </w:p>
     <w:p>
@@ -851,7 +1467,105 @@
           <w:b w:val="0"/>
           <w:sz w:val="22"/>
         </w:rPr>
-        <w:t>○ 시사점 → ①소통·화합 ⑥포용·존중 : 적대 진영 갈등의 '제도적 상호 인정' 장치</w:t>
+        <w:t>○ 정책적 노력</w:t>
+      </w:r>
+    </w:p>
+    <w:p>
+      <w:pPr>
+        <w:spacing w:after="40" w:before="0" w:line="312" w:lineRule="auto"/>
+        <w:ind w:left="850"/>
+      </w:pPr>
+      <w:r>
+        <w:rPr>
+          <w:rFonts w:ascii="맑은 고딕" w:hAnsi="맑은 고딕" w:eastAsia="맑은 고딕"/>
+          <w:b w:val="0"/>
+          <w:sz w:val="21"/>
+        </w:rPr>
+        <w:t>- 1998년 벨파스트(성금요일)협정 체결, 돈트(D'Hondt)식 비례 권력공유 자치정부 구성</w:t>
+      </w:r>
+    </w:p>
+    <w:p>
+      <w:pPr>
+        <w:spacing w:after="40" w:before="0" w:line="312" w:lineRule="auto"/>
+        <w:ind w:left="850"/>
+      </w:pPr>
+      <w:r>
+        <w:rPr>
+          <w:rFonts w:ascii="맑은 고딕" w:hAnsi="맑은 고딕" w:eastAsia="맑은 고딕"/>
+          <w:b w:val="0"/>
+          <w:sz w:val="21"/>
+        </w:rPr>
+        <w:t>- 3대 관계축(자치의회·남북협력·영-아일랜드 협의) 제도화, 상호 존중·시민권 명문화</w:t>
+      </w:r>
+    </w:p>
+    <w:p>
+      <w:pPr>
+        <w:spacing w:after="40" w:before="0" w:line="312" w:lineRule="auto"/>
+        <w:ind w:left="397"/>
+      </w:pPr>
+      <w:r>
+        <w:rPr>
+          <w:rFonts w:ascii="맑은 고딕" w:hAnsi="맑은 고딕" w:eastAsia="맑은 고딕"/>
+          <w:b w:val="0"/>
+          <w:sz w:val="22"/>
+        </w:rPr>
+        <w:t>○ 성과</w:t>
+      </w:r>
+    </w:p>
+    <w:p>
+      <w:pPr>
+        <w:spacing w:after="40" w:before="0" w:line="312" w:lineRule="auto"/>
+        <w:ind w:left="850"/>
+      </w:pPr>
+      <w:r>
+        <w:rPr>
+          <w:rFonts w:ascii="맑은 고딕" w:hAnsi="맑은 고딕" w:eastAsia="맑은 고딕"/>
+          <w:b w:val="0"/>
+          <w:sz w:val="21"/>
+        </w:rPr>
+        <w:t>- 1998. 5. 국민투표 찬성(아일랜드 94%·북아일랜드 71%), 유혈분쟁 종식·자치정부 안정화</w:t>
+      </w:r>
+    </w:p>
+    <w:p>
+      <w:pPr>
+        <w:spacing w:after="40" w:before="0" w:line="312" w:lineRule="auto"/>
+        <w:ind w:left="1247"/>
+      </w:pPr>
+      <w:r>
+        <w:rPr>
+          <w:rFonts w:ascii="맑은 고딕" w:hAnsi="맑은 고딕" w:eastAsia="맑은 고딕"/>
+          <w:b w:val="0"/>
+          <w:sz w:val="21"/>
+        </w:rPr>
+        <w:t>· 개신교 찬성 52%로 공동체 온도차 상존, 브렉시트 이후 국경 긴장 재부상</w:t>
+      </w:r>
+    </w:p>
+    <w:p>
+      <w:pPr>
+        <w:spacing w:after="40" w:before="0" w:line="312" w:lineRule="auto"/>
+        <w:ind w:left="397"/>
+      </w:pPr>
+      <w:r>
+        <w:rPr>
+          <w:rFonts w:ascii="맑은 고딕" w:hAnsi="맑은 고딕" w:eastAsia="맑은 고딕"/>
+          <w:b w:val="0"/>
+          <w:sz w:val="22"/>
+        </w:rPr>
+        <w:t>○ 통합적 의의 및 시사점 → ①소통·화합 ⑥포용·존중</w:t>
+      </w:r>
+    </w:p>
+    <w:p>
+      <w:pPr>
+        <w:spacing w:after="40" w:before="0" w:line="312" w:lineRule="auto"/>
+        <w:ind w:left="850"/>
+      </w:pPr>
+      <w:r>
+        <w:rPr>
+          <w:rFonts w:ascii="맑은 고딕" w:hAnsi="맑은 고딕" w:eastAsia="맑은 고딕"/>
+          <w:b w:val="0"/>
+          <w:sz w:val="21"/>
+        </w:rPr>
+        <w:t>- 적대 진영 갈등을 '권력공유·비례참여'라는 제도적 상호 인정 장치로 관리한 점이 핵심임</w:t>
       </w:r>
     </w:p>
     <w:p>
@@ -879,7 +1593,35 @@
           <w:b w:val="0"/>
           <w:sz w:val="22"/>
         </w:rPr>
-        <w:t>○ 정책: 1989년 공공주택 단지·블록별 종족 구성비 상한(쿼터) 규제</w:t>
+        <w:t>○ 선정 사유(통합 모범사례 근거)</w:t>
+      </w:r>
+    </w:p>
+    <w:p>
+      <w:pPr>
+        <w:spacing w:after="40" w:before="0" w:line="312" w:lineRule="auto"/>
+        <w:ind w:left="850"/>
+      </w:pPr>
+      <w:r>
+        <w:rPr>
+          <w:rFonts w:ascii="맑은 고딕" w:hAnsi="맑은 고딕" w:eastAsia="맑은 고딕"/>
+          <w:b w:val="0"/>
+          <w:sz w:val="21"/>
+        </w:rPr>
+        <w:t>- 통합을 선언·캠페인이 아닌 '주거'라는 생활공간 설계로 구조화한 사례로, 다종족 사회의 공간적 분리(게토화)를 사전 예방함</w:t>
+      </w:r>
+    </w:p>
+    <w:p>
+      <w:pPr>
+        <w:spacing w:after="40" w:before="0" w:line="312" w:lineRule="auto"/>
+        <w:ind w:left="850"/>
+      </w:pPr>
+      <w:r>
+        <w:rPr>
+          <w:rFonts w:ascii="맑은 고딕" w:hAnsi="맑은 고딕" w:eastAsia="맑은 고딕"/>
+          <w:b w:val="0"/>
+          <w:sz w:val="21"/>
+        </w:rPr>
+        <w:t>- 인구 80%가 사는 공공주택에서 종족 혼주를 강제해 '일상적 접촉'을 제도화, 생활밀착형 통합수단의 대표 모델로 선정함</w:t>
       </w:r>
     </w:p>
     <w:p>
@@ -893,7 +1635,21 @@
           <w:b w:val="0"/>
           <w:sz w:val="22"/>
         </w:rPr>
-        <w:t>○ 성과: 인구 약 80% 거주 공공주택에서 종족 간 혼주(混住) 상시 접촉 제도화</w:t>
+        <w:t>○ 배경·개요</w:t>
+      </w:r>
+    </w:p>
+    <w:p>
+      <w:pPr>
+        <w:spacing w:after="40" w:before="0" w:line="312" w:lineRule="auto"/>
+        <w:ind w:left="850"/>
+      </w:pPr>
+      <w:r>
+        <w:rPr>
+          <w:rFonts w:ascii="맑은 고딕" w:hAnsi="맑은 고딕" w:eastAsia="맑은 고딕"/>
+          <w:b w:val="0"/>
+          <w:sz w:val="21"/>
+        </w:rPr>
+        <w:t>- 1980년대 공공주택 단지의 종족별 거주지 분리 재심화 조짐 발생(일부 지역 특정 종족 30·90% 초과)</w:t>
       </w:r>
     </w:p>
     <w:p>
@@ -907,7 +1663,105 @@
           <w:b w:val="0"/>
           <w:sz w:val="22"/>
         </w:rPr>
-        <w:t>○ 시사점 → ⑥포용·존중 ⑦상생·연대 : '일상적 상호작용'으로 주거분리 예방</w:t>
+        <w:t>○ 정책적 노력</w:t>
+      </w:r>
+    </w:p>
+    <w:p>
+      <w:pPr>
+        <w:spacing w:after="40" w:before="0" w:line="312" w:lineRule="auto"/>
+        <w:ind w:left="850"/>
+      </w:pPr>
+      <w:r>
+        <w:rPr>
+          <w:rFonts w:ascii="맑은 고딕" w:hAnsi="맑은 고딕" w:eastAsia="맑은 고딕"/>
+          <w:b w:val="0"/>
+          <w:sz w:val="21"/>
+        </w:rPr>
+        <w:t>- 1989년 종족통합정책(EIP) 시행, 이웃·블록 단위 종족 구성비 상한(쿼터) 규제</w:t>
+      </w:r>
+    </w:p>
+    <w:p>
+      <w:pPr>
+        <w:spacing w:after="40" w:before="0" w:line="312" w:lineRule="auto"/>
+        <w:ind w:left="850"/>
+      </w:pPr>
+      <w:r>
+        <w:rPr>
+          <w:rFonts w:ascii="맑은 고딕" w:hAnsi="맑은 고딕" w:eastAsia="맑은 고딕"/>
+          <w:b w:val="0"/>
+          <w:sz w:val="21"/>
+        </w:rPr>
+        <w:t>- 2010년 소수집단 상한 상향 등 지속 조정</w:t>
+      </w:r>
+    </w:p>
+    <w:p>
+      <w:pPr>
+        <w:spacing w:after="40" w:before="0" w:line="312" w:lineRule="auto"/>
+        <w:ind w:left="397"/>
+      </w:pPr>
+      <w:r>
+        <w:rPr>
+          <w:rFonts w:ascii="맑은 고딕" w:hAnsi="맑은 고딕" w:eastAsia="맑은 고딕"/>
+          <w:b w:val="0"/>
+          <w:sz w:val="22"/>
+        </w:rPr>
+        <w:t>○ 성과</w:t>
+      </w:r>
+    </w:p>
+    <w:p>
+      <w:pPr>
+        <w:spacing w:after="40" w:before="0" w:line="312" w:lineRule="auto"/>
+        <w:ind w:left="850"/>
+      </w:pPr>
+      <w:r>
+        <w:rPr>
+          <w:rFonts w:ascii="맑은 고딕" w:hAnsi="맑은 고딕" w:eastAsia="맑은 고딕"/>
+          <w:b w:val="0"/>
+          <w:sz w:val="21"/>
+        </w:rPr>
+        <w:t>- 인구 약 80% 거주 공공주택에서 종족 간 상시 접촉·혼주 구조 제도화</w:t>
+      </w:r>
+    </w:p>
+    <w:p>
+      <w:pPr>
+        <w:spacing w:after="40" w:before="0" w:line="312" w:lineRule="auto"/>
+        <w:ind w:left="1247"/>
+      </w:pPr>
+      <w:r>
+        <w:rPr>
+          <w:rFonts w:ascii="맑은 고딕" w:hAnsi="맑은 고딕" w:eastAsia="맑은 고딕"/>
+          <w:b w:val="0"/>
+          <w:sz w:val="21"/>
+        </w:rPr>
+        <w:t>· 쿼터 도달 이웃 비율 1989년 28%→2003년 25%로 완화(단, 일부 종족 집중 잔존)</w:t>
+      </w:r>
+    </w:p>
+    <w:p>
+      <w:pPr>
+        <w:spacing w:after="40" w:before="0" w:line="312" w:lineRule="auto"/>
+        <w:ind w:left="397"/>
+      </w:pPr>
+      <w:r>
+        <w:rPr>
+          <w:rFonts w:ascii="맑은 고딕" w:hAnsi="맑은 고딕" w:eastAsia="맑은 고딕"/>
+          <w:b w:val="0"/>
+          <w:sz w:val="22"/>
+        </w:rPr>
+        <w:t>○ 통합적 의의 및 시사점 → ⑥포용·존중 ⑦상생·연대</w:t>
+      </w:r>
+    </w:p>
+    <w:p>
+      <w:pPr>
+        <w:spacing w:after="40" w:before="0" w:line="312" w:lineRule="auto"/>
+        <w:ind w:left="850"/>
+      </w:pPr>
+      <w:r>
+        <w:rPr>
+          <w:rFonts w:ascii="맑은 고딕" w:hAnsi="맑은 고딕" w:eastAsia="맑은 고딕"/>
+          <w:b w:val="0"/>
+          <w:sz w:val="21"/>
+        </w:rPr>
+        <w:t>- '혼주를 통한 일상적 상호작용'으로 분리를 예방, 주거 양극화 대응 수단으로 참고 가능</w:t>
       </w:r>
     </w:p>
     <w:p>
@@ -949,7 +1803,35 @@
           <w:b w:val="0"/>
           <w:sz w:val="22"/>
         </w:rPr>
-        <w:t>○ 정책: 2022년 대통령 직속 1호 위원회 출범, 분야별 특별위원회 운영</w:t>
+        <w:t>○ 선정 사유(통합 모범사례 근거)</w:t>
+      </w:r>
+    </w:p>
+    <w:p>
+      <w:pPr>
+        <w:spacing w:after="40" w:before="0" w:line="312" w:lineRule="auto"/>
+        <w:ind w:left="850"/>
+      </w:pPr>
+      <w:r>
+        <w:rPr>
+          <w:rFonts w:ascii="맑은 고딕" w:hAnsi="맑은 고딕" w:eastAsia="맑은 고딕"/>
+          <w:b w:val="0"/>
+          <w:sz w:val="21"/>
+        </w:rPr>
+        <w:t>- 통합을 일회성 사업이 아닌 국정 최우선 과제로 격상, '대통령 직속 1호 위원회'로 제도화한 국내 상설 인프라임</w:t>
+      </w:r>
+    </w:p>
+    <w:p>
+      <w:pPr>
+        <w:spacing w:after="40" w:before="0" w:line="312" w:lineRule="auto"/>
+        <w:ind w:left="850"/>
+      </w:pPr>
+      <w:r>
+        <w:rPr>
+          <w:rFonts w:ascii="맑은 고딕" w:hAnsi="맑은 고딕" w:eastAsia="맑은 고딕"/>
+          <w:b w:val="0"/>
+          <w:sz w:val="21"/>
+        </w:rPr>
+        <w:t>- 진단(인식조사)-의제(특위)-정책제안을 잇는 통합 거버넌스의 국내 원형으로, 향후 정책의 실행 플랫폼이 될 수 있어 선정함</w:t>
       </w:r>
     </w:p>
     <w:p>
@@ -963,7 +1845,21 @@
           <w:b w:val="0"/>
           <w:sz w:val="22"/>
         </w:rPr>
-        <w:t>○ 성과: 5대 사회갈등 국민인식조사 등 진단·의제 지속 생산</w:t>
+        <w:t>○ 배경·개요</w:t>
+      </w:r>
+    </w:p>
+    <w:p>
+      <w:pPr>
+        <w:spacing w:after="40" w:before="0" w:line="312" w:lineRule="auto"/>
+        <w:ind w:left="850"/>
+      </w:pPr>
+      <w:r>
+        <w:rPr>
+          <w:rFonts w:ascii="맑은 고딕" w:hAnsi="맑은 고딕" w:eastAsia="맑은 고딕"/>
+          <w:b w:val="0"/>
+          <w:sz w:val="21"/>
+        </w:rPr>
+        <w:t>- 정치·이념, 계층·양극화, 세대·지역 등 다층 갈등 고착에 대응할 상설 조정기구 필요</w:t>
       </w:r>
     </w:p>
     <w:p>
@@ -977,7 +1873,77 @@
           <w:b w:val="0"/>
           <w:sz w:val="22"/>
         </w:rPr>
-        <w:t>○ 시사점 → ①⑥⑦ : 진단-의제-정책제안 연계 및 이행력(법제화·부처연계) 제고 과제</w:t>
+        <w:t>○ 정책적 노력</w:t>
+      </w:r>
+    </w:p>
+    <w:p>
+      <w:pPr>
+        <w:spacing w:after="40" w:before="0" w:line="312" w:lineRule="auto"/>
+        <w:ind w:left="850"/>
+      </w:pPr>
+      <w:r>
+        <w:rPr>
+          <w:rFonts w:ascii="맑은 고딕" w:hAnsi="맑은 고딕" w:eastAsia="맑은 고딕"/>
+          <w:b w:val="0"/>
+          <w:sz w:val="21"/>
+        </w:rPr>
+        <w:t>- 2022년 대통령 직속 1호 위원회 출범, 분야별 특별위원회(이주민·소상공인 등) 운영</w:t>
+      </w:r>
+    </w:p>
+    <w:p>
+      <w:pPr>
+        <w:spacing w:after="40" w:before="0" w:line="312" w:lineRule="auto"/>
+        <w:ind w:left="397"/>
+      </w:pPr>
+      <w:r>
+        <w:rPr>
+          <w:rFonts w:ascii="맑은 고딕" w:hAnsi="맑은 고딕" w:eastAsia="맑은 고딕"/>
+          <w:b w:val="0"/>
+          <w:sz w:val="22"/>
+        </w:rPr>
+        <w:t>○ 성과</w:t>
+      </w:r>
+    </w:p>
+    <w:p>
+      <w:pPr>
+        <w:spacing w:after="40" w:before="0" w:line="312" w:lineRule="auto"/>
+        <w:ind w:left="850"/>
+      </w:pPr>
+      <w:r>
+        <w:rPr>
+          <w:rFonts w:ascii="맑은 고딕" w:hAnsi="맑은 고딕" w:eastAsia="맑은 고딕"/>
+          <w:b w:val="0"/>
+          <w:sz w:val="21"/>
+        </w:rPr>
+        <w:t>- 5대 사회갈등 국민인식조사 등 진단·의제 지속 생산(특위 정책제안 이행 정량실적은 추가 확인 필요)</w:t>
+      </w:r>
+    </w:p>
+    <w:p>
+      <w:pPr>
+        <w:spacing w:after="40" w:before="0" w:line="312" w:lineRule="auto"/>
+        <w:ind w:left="397"/>
+      </w:pPr>
+      <w:r>
+        <w:rPr>
+          <w:rFonts w:ascii="맑은 고딕" w:hAnsi="맑은 고딕" w:eastAsia="맑은 고딕"/>
+          <w:b w:val="0"/>
+          <w:sz w:val="22"/>
+        </w:rPr>
+        <w:t>○ 통합적 의의 및 시사점 → ①소통·화합 ⑥포용·존중 ⑦상생·연대</w:t>
+      </w:r>
+    </w:p>
+    <w:p>
+      <w:pPr>
+        <w:spacing w:after="40" w:before="0" w:line="312" w:lineRule="auto"/>
+        <w:ind w:left="850"/>
+      </w:pPr>
+      <w:r>
+        <w:rPr>
+          <w:rFonts w:ascii="맑은 고딕" w:hAnsi="맑은 고딕" w:eastAsia="맑은 고딕"/>
+          <w:b w:val="0"/>
+          <w:sz w:val="21"/>
+        </w:rPr>
+        <w:t>- 통합 전담 상설 틀을 이미 보유, 진단-정책제안-이행(법제화·부처연계) 연계 강화가 과제</w:t>
       </w:r>
     </w:p>
     <w:p>
@@ -1005,7 +1971,35 @@
           <w:b w:val="0"/>
           <w:sz w:val="22"/>
         </w:rPr>
-        <w:t>○ 정책: 2020년 기본법 개정·2기 출범, 진실규명·명예회복·화해 권고</w:t>
+        <w:t>○ 선정 사유(통합 모범사례 근거)</w:t>
+      </w:r>
+    </w:p>
+    <w:p>
+      <w:pPr>
+        <w:spacing w:after="40" w:before="0" w:line="312" w:lineRule="auto"/>
+        <w:ind w:left="850"/>
+      </w:pPr>
+      <w:r>
+        <w:rPr>
+          <w:rFonts w:ascii="맑은 고딕" w:hAnsi="맑은 고딕" w:eastAsia="맑은 고딕"/>
+          <w:b w:val="0"/>
+          <w:sz w:val="21"/>
+        </w:rPr>
+        <w:t>- 남아공 TRC·르완다 가차차와 동일 계열의 '진실규명 기반 통합'을 한국이 자체 법·제도로 구현한 국내 대표 사례임</w:t>
+      </w:r>
+    </w:p>
+    <w:p>
+      <w:pPr>
+        <w:spacing w:after="40" w:before="0" w:line="312" w:lineRule="auto"/>
+        <w:ind w:left="850"/>
+      </w:pPr>
+      <w:r>
+        <w:rPr>
+          <w:rFonts w:ascii="맑은 고딕" w:hAnsi="맑은 고딕" w:eastAsia="맑은 고딕"/>
+          <w:b w:val="0"/>
+          <w:sz w:val="21"/>
+        </w:rPr>
+        <w:t>- 국가폭력 피해의 진실규명→명예회복→화해로 이어지는 국내형 회복적 통합 경로를 실증하여 선정함</w:t>
       </w:r>
     </w:p>
     <w:p>
@@ -1019,7 +2013,21 @@
           <w:b w:val="0"/>
           <w:sz w:val="22"/>
         </w:rPr>
-        <w:t>○ 성과: 접수 2.09만건 중 약 90% 처리, 진실규명 1.19만건 결정</w:t>
+        <w:t>○ 배경·개요</w:t>
+      </w:r>
+    </w:p>
+    <w:p>
+      <w:pPr>
+        <w:spacing w:after="40" w:before="0" w:line="312" w:lineRule="auto"/>
+        <w:ind w:left="850"/>
+      </w:pPr>
+      <w:r>
+        <w:rPr>
+          <w:rFonts w:ascii="맑은 고딕" w:hAnsi="맑은 고딕" w:eastAsia="맑은 고딕"/>
+          <w:b w:val="0"/>
+          <w:sz w:val="21"/>
+        </w:rPr>
+        <w:t>- 항일운동, 한국전쟁 전후 민간인 희생, 권위주의기 인권침해 등 미해결 과거사 잔존</w:t>
       </w:r>
     </w:p>
     <w:p>
@@ -1033,7 +2041,77 @@
           <w:b w:val="0"/>
           <w:sz w:val="22"/>
         </w:rPr>
-        <w:t>○ 시사점 → ④신뢰 ③공정 ①소통·화합 : 국내판 '진실규명 기반 통합' 제도적 경로</w:t>
+        <w:t>○ 정책적 노력</w:t>
+      </w:r>
+    </w:p>
+    <w:p>
+      <w:pPr>
+        <w:spacing w:after="40" w:before="0" w:line="312" w:lineRule="auto"/>
+        <w:ind w:left="850"/>
+      </w:pPr>
+      <w:r>
+        <w:rPr>
+          <w:rFonts w:ascii="맑은 고딕" w:hAnsi="맑은 고딕" w:eastAsia="맑은 고딕"/>
+          <w:b w:val="0"/>
+          <w:sz w:val="21"/>
+        </w:rPr>
+        <w:t>- 2020년 기본법 개정·2기 위원회 출범, 진실규명·명예회복·화해 권고 수행</w:t>
+      </w:r>
+    </w:p>
+    <w:p>
+      <w:pPr>
+        <w:spacing w:after="40" w:before="0" w:line="312" w:lineRule="auto"/>
+        <w:ind w:left="397"/>
+      </w:pPr>
+      <w:r>
+        <w:rPr>
+          <w:rFonts w:ascii="맑은 고딕" w:hAnsi="맑은 고딕" w:eastAsia="맑은 고딕"/>
+          <w:b w:val="0"/>
+          <w:sz w:val="22"/>
+        </w:rPr>
+        <w:t>○ 성과</w:t>
+      </w:r>
+    </w:p>
+    <w:p>
+      <w:pPr>
+        <w:spacing w:after="40" w:before="0" w:line="312" w:lineRule="auto"/>
+        <w:ind w:left="850"/>
+      </w:pPr>
+      <w:r>
+        <w:rPr>
+          <w:rFonts w:ascii="맑은 고딕" w:hAnsi="맑은 고딕" w:eastAsia="맑은 고딕"/>
+          <w:b w:val="0"/>
+          <w:sz w:val="21"/>
+        </w:rPr>
+        <w:t>- 접수 2.09만건 중 약 90%(1.88만건) 처리, 진실규명 1.19만건 결정(형제복지원·선감학원 등 규명)</w:t>
+      </w:r>
+    </w:p>
+    <w:p>
+      <w:pPr>
+        <w:spacing w:after="40" w:before="0" w:line="312" w:lineRule="auto"/>
+        <w:ind w:left="397"/>
+      </w:pPr>
+      <w:r>
+        <w:rPr>
+          <w:rFonts w:ascii="맑은 고딕" w:hAnsi="맑은 고딕" w:eastAsia="맑은 고딕"/>
+          <w:b w:val="0"/>
+          <w:sz w:val="22"/>
+        </w:rPr>
+        <w:t>○ 통합적 의의 및 시사점 → ④신뢰 ③공정 ①소통·화합</w:t>
+      </w:r>
+    </w:p>
+    <w:p>
+      <w:pPr>
+        <w:spacing w:after="40" w:before="0" w:line="312" w:lineRule="auto"/>
+        <w:ind w:left="850"/>
+      </w:pPr>
+      <w:r>
+        <w:rPr>
+          <w:rFonts w:ascii="맑은 고딕" w:hAnsi="맑은 고딕" w:eastAsia="맑은 고딕"/>
+          <w:b w:val="0"/>
+          <w:sz w:val="21"/>
+        </w:rPr>
+        <w:t>- 과거사 진실규명이 국가·제도 신뢰 회복 및 공동체 화해의 국내 제도적 경로임을 확인</w:t>
       </w:r>
     </w:p>
     <w:p>
@@ -1061,7 +2139,35 @@
           <w:b w:val="0"/>
           <w:sz w:val="22"/>
         </w:rPr>
-        <w:t>○ 정책: 2003년 「국가균형발전특별법」 제정, 혁신도시 10개 조성·공공기관 지방이전</w:t>
+        <w:t>○ 선정 사유(통합 모범사례 근거)</w:t>
+      </w:r>
+    </w:p>
+    <w:p>
+      <w:pPr>
+        <w:spacing w:after="40" w:before="0" w:line="312" w:lineRule="auto"/>
+        <w:ind w:left="850"/>
+      </w:pPr>
+      <w:r>
+        <w:rPr>
+          <w:rFonts w:ascii="맑은 고딕" w:hAnsi="맑은 고딕" w:eastAsia="맑은 고딕"/>
+          <w:b w:val="0"/>
+          <w:sz w:val="21"/>
+        </w:rPr>
+        <w:t>- 수도권 일극집중이라는 한국 고유의 지역격차(수도권-지방 갈등 78%)에 국가 차원 재분배로 대응한 국내 대표 정책임</w:t>
+      </w:r>
+    </w:p>
+    <w:p>
+      <w:pPr>
+        <w:spacing w:after="40" w:before="0" w:line="312" w:lineRule="auto"/>
+        <w:ind w:left="850"/>
+      </w:pPr>
+      <w:r>
+        <w:rPr>
+          <w:rFonts w:ascii="맑은 고딕" w:hAnsi="맑은 고딕" w:eastAsia="맑은 고딕"/>
+          <w:b w:val="0"/>
+          <w:sz w:val="21"/>
+        </w:rPr>
+        <w:t>- 독일 연대세와 같은 '재분배형 통합'의 국내 사례로서 성과와 한계를 함께 제공하여 선정함</w:t>
       </w:r>
     </w:p>
     <w:p>
@@ -1075,7 +2181,21 @@
           <w:b w:val="0"/>
           <w:sz w:val="22"/>
         </w:rPr>
-        <w:t>○ 성과: 공공기관 지방 재배치로 지역 거점 육성(단, 성과 체감·지속성 한계)</w:t>
+        <w:t>○ 배경·개요</w:t>
+      </w:r>
+    </w:p>
+    <w:p>
+      <w:pPr>
+        <w:spacing w:after="40" w:before="0" w:line="312" w:lineRule="auto"/>
+        <w:ind w:left="850"/>
+      </w:pPr>
+      <w:r>
+        <w:rPr>
+          <w:rFonts w:ascii="맑은 고딕" w:hAnsi="맑은 고딕" w:eastAsia="맑은 고딕"/>
+          <w:b w:val="0"/>
+          <w:sz w:val="21"/>
+        </w:rPr>
+        <w:t>- 공공기관 약 85%가 수도권 소재 등 일극집중이 지역갈등·불균형의 핵심 원인</w:t>
       </w:r>
     </w:p>
     <w:p>
@@ -1089,7 +2209,77 @@
           <w:b w:val="0"/>
           <w:sz w:val="22"/>
         </w:rPr>
-        <w:t>○ 시사점 → ②격차해소 ⑦상생·연대 ⑤기회균등 : 재원·거버넌스 보강 필요</w:t>
+        <w:t>○ 정책적 노력</w:t>
+      </w:r>
+    </w:p>
+    <w:p>
+      <w:pPr>
+        <w:spacing w:after="40" w:before="0" w:line="312" w:lineRule="auto"/>
+        <w:ind w:left="850"/>
+      </w:pPr>
+      <w:r>
+        <w:rPr>
+          <w:rFonts w:ascii="맑은 고딕" w:hAnsi="맑은 고딕" w:eastAsia="맑은 고딕"/>
+          <w:b w:val="0"/>
+          <w:sz w:val="21"/>
+        </w:rPr>
+        <w:t>- 2003년 「국가균형발전특별법」 제정, 혁신도시 10개 조성·공공기관 지방이전, 세종시로 행정기능 분산</w:t>
+      </w:r>
+    </w:p>
+    <w:p>
+      <w:pPr>
+        <w:spacing w:after="40" w:before="0" w:line="312" w:lineRule="auto"/>
+        <w:ind w:left="397"/>
+      </w:pPr>
+      <w:r>
+        <w:rPr>
+          <w:rFonts w:ascii="맑은 고딕" w:hAnsi="맑은 고딕" w:eastAsia="맑은 고딕"/>
+          <w:b w:val="0"/>
+          <w:sz w:val="22"/>
+        </w:rPr>
+        <w:t>○ 성과</w:t>
+      </w:r>
+    </w:p>
+    <w:p>
+      <w:pPr>
+        <w:spacing w:after="40" w:before="0" w:line="312" w:lineRule="auto"/>
+        <w:ind w:left="850"/>
+      </w:pPr>
+      <w:r>
+        <w:rPr>
+          <w:rFonts w:ascii="맑은 고딕" w:hAnsi="맑은 고딕" w:eastAsia="맑은 고딕"/>
+          <w:b w:val="0"/>
+          <w:sz w:val="21"/>
+        </w:rPr>
+        <w:t>- 공공기관 지방 재배치로 지역 거점 육성 시도(단, 인프라 편중·성과 체감·지속성 한계 지적)</w:t>
+      </w:r>
+    </w:p>
+    <w:p>
+      <w:pPr>
+        <w:spacing w:after="40" w:before="0" w:line="312" w:lineRule="auto"/>
+        <w:ind w:left="397"/>
+      </w:pPr>
+      <w:r>
+        <w:rPr>
+          <w:rFonts w:ascii="맑은 고딕" w:hAnsi="맑은 고딕" w:eastAsia="맑은 고딕"/>
+          <w:b w:val="0"/>
+          <w:sz w:val="22"/>
+        </w:rPr>
+        <w:t>○ 통합적 의의 및 시사점 → ②격차해소 ⑦상생·연대 ⑤기회균등</w:t>
+      </w:r>
+    </w:p>
+    <w:p>
+      <w:pPr>
+        <w:spacing w:after="40" w:before="0" w:line="312" w:lineRule="auto"/>
+        <w:ind w:left="850"/>
+      </w:pPr>
+      <w:r>
+        <w:rPr>
+          <w:rFonts w:ascii="맑은 고딕" w:hAnsi="맑은 고딕" w:eastAsia="맑은 고딕"/>
+          <w:b w:val="0"/>
+          <w:sz w:val="21"/>
+        </w:rPr>
+        <w:t>- 국내 대표 재분배·분산 정책이나, 독일형 연대 재원·거버넌스 보강으로 성과 지속성 확보 필요</w:t>
       </w:r>
     </w:p>
     <w:p>

</xml_diff>

<commit_message>
Add experiential (soft) national-integration cases and neighbor-sharing chapter
국민 참여·경험형(상향식) 통합 사례 8개(금모으기·2002 거리응원·태안 자원봉사·
프로야구·남아공 럭비·英 빅런치·이웃의 날·美 나이트아웃) 신설. 이웃 경험 공유가
통합 키워드를 구현하는 원리(접촉이론·집합적열광·사회적자본)와 키워드 매트릭스,
'힙한 통합 경험' 기획(안) 추가. Word 변환기에 표 렌더링 기능 추가.

Co-Authored-By: Claude Opus 4.8 <noreply@anthropic.com>
Claude-Session: https://claude.ai/code/session_01FvjRmPktyGoCyeGhQJijKL
</commit_message>
<xml_diff>
--- a/reports/국민통합_정책보고서.docx
+++ b/reports/국민통합_정책보고서.docx
@@ -557,7 +557,7 @@
           <w:color w:val="1F4E79"/>
           <w:sz w:val="30"/>
         </w:rPr>
-        <w:t>Ⅲ. 국내외 국민통합 사례 및 정책적 노력</w:t>
+        <w:t>Ⅲ. 국내외 국민통합 사례 (1) — 제도형(하향식) 정책 사례</w:t>
       </w:r>
     </w:p>
     <w:p>
@@ -2436,7 +2436,2322 @@
           <w:color w:val="1F4E79"/>
           <w:sz w:val="30"/>
         </w:rPr>
-        <w:t>Ⅳ. 종합 시사점 및 정책 제언</w:t>
+        <w:t>Ⅳ. 국내외 국민통합 사례 (2) — 국민 참여·경험형(소프트) 사례 및 이웃 공유 효과</w:t>
+      </w:r>
+    </w:p>
+    <w:p>
+      <w:pPr>
+        <w:spacing w:before="160" w:after="80"/>
+      </w:pPr>
+      <w:r>
+        <w:rPr>
+          <w:rFonts w:ascii="맑은 고딕" w:hAnsi="맑은 고딕" w:eastAsia="맑은 고딕"/>
+          <w:b/>
+          <w:color w:val="2E2E2E"/>
+          <w:sz w:val="25"/>
+        </w:rPr>
+        <w:t>1. 개관 — 왜 '경험형' 통합인가</w:t>
+      </w:r>
+    </w:p>
+    <w:p>
+      <w:pPr>
+        <w:spacing w:after="60" w:before="0" w:line="312" w:lineRule="auto"/>
+        <w:ind w:left="0"/>
+      </w:pPr>
+      <w:r>
+        <w:rPr>
+          <w:rFonts w:ascii="맑은 고딕" w:hAnsi="맑은 고딕" w:eastAsia="맑은 고딕"/>
+          <w:b/>
+          <w:sz w:val="23"/>
+        </w:rPr>
+        <w:t>□ 제도형(하향식)과 경험형(상향식)의 상호 보완 필요</w:t>
+      </w:r>
+    </w:p>
+    <w:p>
+      <w:pPr>
+        <w:spacing w:after="40" w:before="0" w:line="312" w:lineRule="auto"/>
+        <w:ind w:left="397"/>
+      </w:pPr>
+      <w:r>
+        <w:rPr>
+          <w:rFonts w:ascii="맑은 고딕" w:hAnsi="맑은 고딕" w:eastAsia="맑은 고딕"/>
+          <w:b w:val="0"/>
+          <w:sz w:val="22"/>
+        </w:rPr>
+        <w:t>○ 제도형(Ⅲ장) — 법·재정·기구로 갈등을 '관리'하나 국민 체감·자발성 한계</w:t>
+      </w:r>
+    </w:p>
+    <w:p>
+      <w:pPr>
+        <w:spacing w:after="40" w:before="0" w:line="312" w:lineRule="auto"/>
+        <w:ind w:left="397"/>
+      </w:pPr>
+      <w:r>
+        <w:rPr>
+          <w:rFonts w:ascii="맑은 고딕" w:hAnsi="맑은 고딕" w:eastAsia="맑은 고딕"/>
+          <w:b w:val="0"/>
+          <w:sz w:val="22"/>
+        </w:rPr>
+        <w:t>○ 경험형 — 국민이 직접 '함께한 경험'으로 일체감을 체득, 통합을 생활에서 실감</w:t>
+      </w:r>
+    </w:p>
+    <w:p>
+      <w:pPr>
+        <w:spacing w:after="40" w:before="0" w:line="312" w:lineRule="auto"/>
+        <w:ind w:left="1247"/>
+      </w:pPr>
+      <w:r>
+        <w:rPr>
+          <w:rFonts w:ascii="맑은 고딕" w:hAnsi="맑은 고딕" w:eastAsia="맑은 고딕"/>
+          <w:b w:val="0"/>
+          <w:sz w:val="21"/>
+        </w:rPr>
+        <w:t>· 실제 통합은 제도 위에 '공유된 경험'이 얹힐 때 완성됨</w:t>
+      </w:r>
+    </w:p>
+    <w:p>
+      <w:pPr>
+        <w:spacing w:after="60" w:before="0" w:line="312" w:lineRule="auto"/>
+        <w:ind w:left="0"/>
+      </w:pPr>
+      <w:r>
+        <w:rPr>
+          <w:rFonts w:ascii="맑은 고딕" w:hAnsi="맑은 고딕" w:eastAsia="맑은 고딕"/>
+          <w:b/>
+          <w:sz w:val="23"/>
+        </w:rPr>
+        <w:t>□ 경험 공유가 통합을 만드는 학술적 근거</w:t>
+      </w:r>
+    </w:p>
+    <w:p>
+      <w:pPr>
+        <w:spacing w:after="40" w:before="0" w:line="312" w:lineRule="auto"/>
+        <w:ind w:left="397"/>
+      </w:pPr>
+      <w:r>
+        <w:rPr>
+          <w:rFonts w:ascii="맑은 고딕" w:hAnsi="맑은 고딕" w:eastAsia="맑은 고딕"/>
+          <w:b w:val="0"/>
+          <w:sz w:val="22"/>
+        </w:rPr>
+        <w:t>○ 접촉이론(Allport) — 동등한 지위의 집단이 공동목표로 협력 시 편견·적대 감소</w:t>
+      </w:r>
+    </w:p>
+    <w:p>
+      <w:pPr>
+        <w:spacing w:after="40" w:before="0" w:line="312" w:lineRule="auto"/>
+        <w:ind w:left="397"/>
+      </w:pPr>
+      <w:r>
+        <w:rPr>
+          <w:rFonts w:ascii="맑은 고딕" w:hAnsi="맑은 고딕" w:eastAsia="맑은 고딕"/>
+          <w:b w:val="0"/>
+          <w:sz w:val="22"/>
+        </w:rPr>
+        <w:t>○ 집합적 열광(Durkheim, collective effervescence) — 함께 겪는 정서적 고조가 '우리'라는 연대의식 생성</w:t>
+      </w:r>
+    </w:p>
+    <w:p>
+      <w:pPr>
+        <w:spacing w:after="40" w:before="0" w:line="312" w:lineRule="auto"/>
+        <w:ind w:left="397"/>
+      </w:pPr>
+      <w:r>
+        <w:rPr>
+          <w:rFonts w:ascii="맑은 고딕" w:hAnsi="맑은 고딕" w:eastAsia="맑은 고딕"/>
+          <w:b w:val="0"/>
+          <w:sz w:val="22"/>
+        </w:rPr>
+        <w:t>○ 교량형 사회적 자본(Putnam, bridging capital) — 이질집단 간 반복 상호작용이 사회적 신뢰 축적</w:t>
+      </w:r>
+    </w:p>
+    <w:p>
+      <w:pPr>
+        <w:spacing w:after="40" w:before="0" w:line="312" w:lineRule="auto"/>
+        <w:ind w:left="1247"/>
+      </w:pPr>
+      <w:r>
+        <w:rPr>
+          <w:rFonts w:ascii="맑은 고딕" w:hAnsi="맑은 고딕" w:eastAsia="맑은 고딕"/>
+          <w:b w:val="0"/>
+          <w:sz w:val="21"/>
+        </w:rPr>
+        <w:t>· 위 3개 기제가 소프트 경험이 통합 키워드로 전환되는 원리</w:t>
+      </w:r>
+    </w:p>
+    <w:p>
+      <w:pPr>
+        <w:spacing w:before="160" w:after="80"/>
+      </w:pPr>
+      <w:r>
+        <w:rPr>
+          <w:rFonts w:ascii="맑은 고딕" w:hAnsi="맑은 고딕" w:eastAsia="맑은 고딕"/>
+          <w:b/>
+          <w:color w:val="2E2E2E"/>
+          <w:sz w:val="25"/>
+        </w:rPr>
+        <w:t>2. 국내 경험형 사례</w:t>
+      </w:r>
+    </w:p>
+    <w:p>
+      <w:pPr>
+        <w:spacing w:after="60" w:before="0" w:line="312" w:lineRule="auto"/>
+        <w:ind w:left="0"/>
+      </w:pPr>
+      <w:r>
+        <w:rPr>
+          <w:rFonts w:ascii="맑은 고딕" w:hAnsi="맑은 고딕" w:eastAsia="맑은 고딕"/>
+          <w:b/>
+          <w:sz w:val="23"/>
+        </w:rPr>
+        <w:t>□ 사례 A. 금모으기 운동(1998) — 위기극복 공동경험</w:t>
+      </w:r>
+    </w:p>
+    <w:p>
+      <w:pPr>
+        <w:spacing w:after="40" w:before="0" w:line="312" w:lineRule="auto"/>
+        <w:ind w:left="397"/>
+      </w:pPr>
+      <w:r>
+        <w:rPr>
+          <w:rFonts w:ascii="맑은 고딕" w:hAnsi="맑은 고딕" w:eastAsia="맑은 고딕"/>
+          <w:b w:val="0"/>
+          <w:sz w:val="22"/>
+        </w:rPr>
+        <w:t>○ 선정 사유: IMF 외환위기라는 국가위기에 국민 351만명이 자발적으로 금 227톤을 모아 공동운명체 의식을 실증한 상향식 통합의 원형</w:t>
+      </w:r>
+    </w:p>
+    <w:p>
+      <w:pPr>
+        <w:spacing w:after="40" w:before="0" w:line="312" w:lineRule="auto"/>
+        <w:ind w:left="397"/>
+      </w:pPr>
+      <w:r>
+        <w:rPr>
+          <w:rFonts w:ascii="맑은 고딕" w:hAnsi="맑은 고딕" w:eastAsia="맑은 고딕"/>
+          <w:b w:val="0"/>
+          <w:sz w:val="22"/>
+        </w:rPr>
+        <w:t>○ 개요·성과: 1998. 1~4월 전국민 참여, 약 21.7억 달러 상당 금 수출로 외채상환 기여(한국민족문화대백과)</w:t>
+      </w:r>
+    </w:p>
+    <w:p>
+      <w:pPr>
+        <w:spacing w:after="40" w:before="0" w:line="312" w:lineRule="auto"/>
+        <w:ind w:left="397"/>
+      </w:pPr>
+      <w:r>
+        <w:rPr>
+          <w:rFonts w:ascii="맑은 고딕" w:hAnsi="맑은 고딕" w:eastAsia="맑은 고딕"/>
+          <w:b w:val="0"/>
+          <w:sz w:val="22"/>
+        </w:rPr>
+        <w:t>○ 통합 효과 → ⑦상생·연대 ④신뢰 ②격차초월 : 빈부·계층 구분 없이 '함께 희생'하는 경험이 공동체 신뢰 형성</w:t>
+      </w:r>
+    </w:p>
+    <w:p>
+      <w:pPr>
+        <w:spacing w:after="60" w:before="0" w:line="312" w:lineRule="auto"/>
+        <w:ind w:left="0"/>
+      </w:pPr>
+      <w:r>
+        <w:rPr>
+          <w:rFonts w:ascii="맑은 고딕" w:hAnsi="맑은 고딕" w:eastAsia="맑은 고딕"/>
+          <w:b/>
+          <w:sz w:val="23"/>
+        </w:rPr>
+        <w:t>□ 사례 B. 2002 월드컵 거리응원 — 세대·계층 초월 집합적 열광</w:t>
+      </w:r>
+    </w:p>
+    <w:p>
+      <w:pPr>
+        <w:spacing w:after="40" w:before="0" w:line="312" w:lineRule="auto"/>
+        <w:ind w:left="397"/>
+      </w:pPr>
+      <w:r>
+        <w:rPr>
+          <w:rFonts w:ascii="맑은 고딕" w:hAnsi="맑은 고딕" w:eastAsia="맑은 고딕"/>
+          <w:b w:val="0"/>
+          <w:sz w:val="22"/>
+        </w:rPr>
+        <w:t>○ 선정 사유: 연인원 약 2천만명(전국민 약 43%)이 광장에서 함께 응원, 세대·지역·계층을 초월한 자발적 축제형 통합의 대표</w:t>
+      </w:r>
+    </w:p>
+    <w:p>
+      <w:pPr>
+        <w:spacing w:after="40" w:before="0" w:line="312" w:lineRule="auto"/>
+        <w:ind w:left="397"/>
+      </w:pPr>
+      <w:r>
+        <w:rPr>
+          <w:rFonts w:ascii="맑은 고딕" w:hAnsi="맑은 고딕" w:eastAsia="맑은 고딕"/>
+          <w:b w:val="0"/>
+          <w:sz w:val="22"/>
+        </w:rPr>
+        <w:t>○ 개요·성과: 붉은악마 주도 개방형 거리응원, 서울 시청·광화문에만 누적 800만명 이상 운집(국가기록원)</w:t>
+      </w:r>
+    </w:p>
+    <w:p>
+      <w:pPr>
+        <w:spacing w:after="40" w:before="0" w:line="312" w:lineRule="auto"/>
+        <w:ind w:left="397"/>
+      </w:pPr>
+      <w:r>
+        <w:rPr>
+          <w:rFonts w:ascii="맑은 고딕" w:hAnsi="맑은 고딕" w:eastAsia="맑은 고딕"/>
+          <w:b w:val="0"/>
+          <w:sz w:val="22"/>
+        </w:rPr>
+        <w:t>○ 통합 효과 → ①소통·화합 ⑥포용·존중 ⑤기회균등 : 남녀노소 누구나 동등하게 참여하는 개방형 경험이 일체감 창출</w:t>
+      </w:r>
+    </w:p>
+    <w:p>
+      <w:pPr>
+        <w:spacing w:after="60" w:before="0" w:line="312" w:lineRule="auto"/>
+        <w:ind w:left="0"/>
+      </w:pPr>
+      <w:r>
+        <w:rPr>
+          <w:rFonts w:ascii="맑은 고딕" w:hAnsi="맑은 고딕" w:eastAsia="맑은 고딕"/>
+          <w:b/>
+          <w:sz w:val="23"/>
+        </w:rPr>
+        <w:t>□ 사례 C. 태안 기름유출 방제 자원봉사(2007) — 공동체 회복 경험</w:t>
+      </w:r>
+    </w:p>
+    <w:p>
+      <w:pPr>
+        <w:spacing w:after="40" w:before="0" w:line="312" w:lineRule="auto"/>
+        <w:ind w:left="397"/>
+      </w:pPr>
+      <w:r>
+        <w:rPr>
+          <w:rFonts w:ascii="맑은 고딕" w:hAnsi="맑은 고딕" w:eastAsia="맑은 고딕"/>
+          <w:b w:val="0"/>
+          <w:sz w:val="22"/>
+        </w:rPr>
+        <w:t>○ 선정 사유: 전국에서 자발적으로 모인 123만 자원봉사자가 재난을 함께 극복, '연대의 기억'으로 유네스코 세계기록유산 등재(2022)</w:t>
+      </w:r>
+    </w:p>
+    <w:p>
+      <w:pPr>
+        <w:spacing w:after="40" w:before="0" w:line="312" w:lineRule="auto"/>
+        <w:ind w:left="397"/>
+      </w:pPr>
+      <w:r>
+        <w:rPr>
+          <w:rFonts w:ascii="맑은 고딕" w:hAnsi="맑은 고딕" w:eastAsia="맑은 고딕"/>
+          <w:b w:val="0"/>
+          <w:sz w:val="22"/>
+        </w:rPr>
+        <w:t>○ 개요·성과: 하루 최대 6만명 참여, 초등학생~공무원·시민단체가 함께 방제, 10년 만에 생태 회복(경향신문 등)</w:t>
+      </w:r>
+    </w:p>
+    <w:p>
+      <w:pPr>
+        <w:spacing w:after="40" w:before="0" w:line="312" w:lineRule="auto"/>
+        <w:ind w:left="397"/>
+      </w:pPr>
+      <w:r>
+        <w:rPr>
+          <w:rFonts w:ascii="맑은 고딕" w:hAnsi="맑은 고딕" w:eastAsia="맑은 고딕"/>
+          <w:b w:val="0"/>
+          <w:sz w:val="22"/>
+        </w:rPr>
+        <w:t>○ 통합 효과 → ⑦상생·연대 ④신뢰 : 타인의 고통에 함께하는 경험이 지역·타인에 대한 신뢰·연대로 전환</w:t>
+      </w:r>
+    </w:p>
+    <w:p>
+      <w:pPr>
+        <w:spacing w:after="60" w:before="0" w:line="312" w:lineRule="auto"/>
+        <w:ind w:left="0"/>
+      </w:pPr>
+      <w:r>
+        <w:rPr>
+          <w:rFonts w:ascii="맑은 고딕" w:hAnsi="맑은 고딕" w:eastAsia="맑은 고딕"/>
+          <w:b/>
+          <w:sz w:val="23"/>
+        </w:rPr>
+        <w:t>□ 사례 D. 프로야구 지역연고 응원문화 — 일상적·반복적 공유의례</w:t>
+      </w:r>
+    </w:p>
+    <w:p>
+      <w:pPr>
+        <w:spacing w:after="40" w:before="0" w:line="312" w:lineRule="auto"/>
+        <w:ind w:left="397"/>
+      </w:pPr>
+      <w:r>
+        <w:rPr>
+          <w:rFonts w:ascii="맑은 고딕" w:hAnsi="맑은 고딕" w:eastAsia="맑은 고딕"/>
+          <w:b w:val="0"/>
+          <w:sz w:val="22"/>
+        </w:rPr>
+        <w:t>○ 선정 사유: 지역 정체성을 매개로 매주 반복되는 응원 의례가 세대를 잇는 생활밀착형 통합 경험, 특별 이벤트가 아닌 '일상 반복' 모델로 선정</w:t>
+      </w:r>
+    </w:p>
+    <w:p>
+      <w:pPr>
+        <w:spacing w:after="40" w:before="0" w:line="312" w:lineRule="auto"/>
+        <w:ind w:left="397"/>
+      </w:pPr>
+      <w:r>
+        <w:rPr>
+          <w:rFonts w:ascii="맑은 고딕" w:hAnsi="맑은 고딕" w:eastAsia="맑은 고딕"/>
+          <w:b w:val="0"/>
+          <w:sz w:val="22"/>
+        </w:rPr>
+        <w:t>○ 개요·특징: 지역 연고 구단 중심 가족·이웃 단위 관람, 응원가·먹거리 공유 등 참여형 문화 형성</w:t>
+      </w:r>
+    </w:p>
+    <w:p>
+      <w:pPr>
+        <w:spacing w:after="40" w:before="0" w:line="312" w:lineRule="auto"/>
+        <w:ind w:left="397"/>
+      </w:pPr>
+      <w:r>
+        <w:rPr>
+          <w:rFonts w:ascii="맑은 고딕" w:hAnsi="맑은 고딕" w:eastAsia="맑은 고딕"/>
+          <w:b w:val="0"/>
+          <w:sz w:val="22"/>
+        </w:rPr>
+        <w:t>○ 통합 효과 → ①소통·화합 ⑦상생·연대 : 지역공동체의 반복적 결속의례로 세대·이웃 유대 강화(단, 지역대립 조장 아닌 '공유의례'로 설계 필요)</w:t>
+      </w:r>
+    </w:p>
+    <w:p>
+      <w:pPr>
+        <w:spacing w:after="40" w:before="0" w:line="312" w:lineRule="auto"/>
+        <w:ind w:left="1247"/>
+      </w:pPr>
+      <w:r>
+        <w:rPr>
+          <w:rFonts w:ascii="맑은 고딕" w:hAnsi="맑은 고딕" w:eastAsia="맑은 고딕"/>
+          <w:b w:val="0"/>
+          <w:sz w:val="21"/>
+        </w:rPr>
+        <w:t>· (추가 참고) 코로나19 시민연대(대구 의료진 지원·마스크 나눔, 2020), 김장·연탄 나눔, 헌혈 릴레이 등도 이웃 단위 나눔 경험형 통합 자원</w:t>
+      </w:r>
+    </w:p>
+    <w:p>
+      <w:pPr>
+        <w:spacing w:before="160" w:after="80"/>
+      </w:pPr>
+      <w:r>
+        <w:rPr>
+          <w:rFonts w:ascii="맑은 고딕" w:hAnsi="맑은 고딕" w:eastAsia="맑은 고딕"/>
+          <w:b/>
+          <w:color w:val="2E2E2E"/>
+          <w:sz w:val="25"/>
+        </w:rPr>
+        <w:t>3. 국외 경험형 사례</w:t>
+      </w:r>
+    </w:p>
+    <w:p>
+      <w:pPr>
+        <w:spacing w:after="60" w:before="0" w:line="312" w:lineRule="auto"/>
+        <w:ind w:left="0"/>
+      </w:pPr>
+      <w:r>
+        <w:rPr>
+          <w:rFonts w:ascii="맑은 고딕" w:hAnsi="맑은 고딕" w:eastAsia="맑은 고딕"/>
+          <w:b/>
+          <w:sz w:val="23"/>
+        </w:rPr>
+        <w:t>□ 사례 E. 남아공 1995 럭비월드컵(만델라) — 스포츠를 통한 화해</w:t>
+      </w:r>
+    </w:p>
+    <w:p>
+      <w:pPr>
+        <w:spacing w:after="40" w:before="0" w:line="312" w:lineRule="auto"/>
+        <w:ind w:left="397"/>
+      </w:pPr>
+      <w:r>
+        <w:rPr>
+          <w:rFonts w:ascii="맑은 고딕" w:hAnsi="맑은 고딕" w:eastAsia="맑은 고딕"/>
+          <w:b w:val="0"/>
+          <w:sz w:val="22"/>
+        </w:rPr>
+        <w:t>○ 선정 사유: 만델라가 백인 상징이던 럭비를 흑백 공동응원으로 전환, '스포츠 경험 공유'로 인종화해를 이룬 세계적 상징 사례</w:t>
+      </w:r>
+    </w:p>
+    <w:p>
+      <w:pPr>
+        <w:spacing w:after="40" w:before="0" w:line="312" w:lineRule="auto"/>
+        <w:ind w:left="397"/>
+      </w:pPr>
+      <w:r>
+        <w:rPr>
+          <w:rFonts w:ascii="맑은 고딕" w:hAnsi="맑은 고딕" w:eastAsia="맑은 고딕"/>
+          <w:b w:val="0"/>
+          <w:sz w:val="22"/>
+        </w:rPr>
+        <w:t>○ 개요·성과: 1995. 6. 만델라가 스프링복스 저지를 입고 우승컵 시상, 흑백이 한 팀('One Team, One Country')으로 결집(HISTORY)</w:t>
+      </w:r>
+    </w:p>
+    <w:p>
+      <w:pPr>
+        <w:spacing w:after="40" w:before="0" w:line="312" w:lineRule="auto"/>
+        <w:ind w:left="397"/>
+      </w:pPr>
+      <w:r>
+        <w:rPr>
+          <w:rFonts w:ascii="맑은 고딕" w:hAnsi="맑은 고딕" w:eastAsia="맑은 고딕"/>
+          <w:b w:val="0"/>
+          <w:sz w:val="22"/>
+        </w:rPr>
+        <w:t>○ 통합 효과 → ①소통·화합 ⑥포용·존중 : 적대집단이 '같은 팀을 응원하는 경험'을 공유함으로써 상징적 화해 달성</w:t>
+      </w:r>
+    </w:p>
+    <w:p>
+      <w:pPr>
+        <w:spacing w:after="60" w:before="0" w:line="312" w:lineRule="auto"/>
+        <w:ind w:left="0"/>
+      </w:pPr>
+      <w:r>
+        <w:rPr>
+          <w:rFonts w:ascii="맑은 고딕" w:hAnsi="맑은 고딕" w:eastAsia="맑은 고딕"/>
+          <w:b/>
+          <w:sz w:val="23"/>
+        </w:rPr>
+        <w:t>□ 사례 F. 영국 '빅 런치(The Big Lunch)' — 이웃 공동식사 축제</w:t>
+      </w:r>
+    </w:p>
+    <w:p>
+      <w:pPr>
+        <w:spacing w:after="40" w:before="0" w:line="312" w:lineRule="auto"/>
+        <w:ind w:left="397"/>
+      </w:pPr>
+      <w:r>
+        <w:rPr>
+          <w:rFonts w:ascii="맑은 고딕" w:hAnsi="맑은 고딕" w:eastAsia="맑은 고딕"/>
+          <w:b w:val="0"/>
+          <w:sz w:val="22"/>
+        </w:rPr>
+        <w:t>○ 선정 사유: 이웃과 '함께 밥 먹기'라는 가장 소프트한 경험을 전국 연례행사로 제도화, 본 과제('이웃과 경험 공유')에 가장 직접 부합하여 선정</w:t>
+      </w:r>
+    </w:p>
+    <w:p>
+      <w:pPr>
+        <w:spacing w:after="40" w:before="0" w:line="312" w:lineRule="auto"/>
+        <w:ind w:left="397"/>
+      </w:pPr>
+      <w:r>
+        <w:rPr>
+          <w:rFonts w:ascii="맑은 고딕" w:hAnsi="맑은 고딕" w:eastAsia="맑은 고딕"/>
+          <w:b w:val="0"/>
+          <w:sz w:val="22"/>
+        </w:rPr>
+        <w:t>○ 개요·성과: 2009년 에덴프로젝트 시작, 매년 평균 600만명 이상 참여, 2022년 1,720만명(영국 인구 1/4)·신규 이웃친분 1,170만건 형성(Eden Project)</w:t>
+      </w:r>
+    </w:p>
+    <w:p>
+      <w:pPr>
+        <w:spacing w:after="40" w:before="0" w:line="312" w:lineRule="auto"/>
+        <w:ind w:left="397"/>
+      </w:pPr>
+      <w:r>
+        <w:rPr>
+          <w:rFonts w:ascii="맑은 고딕" w:hAnsi="맑은 고딕" w:eastAsia="맑은 고딕"/>
+          <w:b w:val="0"/>
+          <w:sz w:val="22"/>
+        </w:rPr>
+        <w:t>○ 통합 효과 → ④신뢰 ①소통·화합 ⑥포용·존중 : 참여자 79%가 '공동체 소속감 강화' 응답, 이웃 간 교량형 신뢰 축적</w:t>
+      </w:r>
+    </w:p>
+    <w:p>
+      <w:pPr>
+        <w:spacing w:after="60" w:before="0" w:line="312" w:lineRule="auto"/>
+        <w:ind w:left="0"/>
+      </w:pPr>
+      <w:r>
+        <w:rPr>
+          <w:rFonts w:ascii="맑은 고딕" w:hAnsi="맑은 고딕" w:eastAsia="맑은 고딕"/>
+          <w:b/>
+          <w:sz w:val="23"/>
+        </w:rPr>
+        <w:t>□ 사례 G. 프랑스발 '이웃의 날(Fête des Voisins / European Neighbours' Day)' — 이웃 관계망 축제</w:t>
+      </w:r>
+    </w:p>
+    <w:p>
+      <w:pPr>
+        <w:spacing w:after="40" w:before="0" w:line="312" w:lineRule="auto"/>
+        <w:ind w:left="397"/>
+      </w:pPr>
+      <w:r>
+        <w:rPr>
+          <w:rFonts w:ascii="맑은 고딕" w:hAnsi="맑은 고딕" w:eastAsia="맑은 고딕"/>
+          <w:b w:val="0"/>
+          <w:sz w:val="22"/>
+        </w:rPr>
+        <w:t>○ 선정 사유: 1999년 파리 한 동네에서 시작, 이웃 간 고립 해소를 목표로 유럽·세계로 확산된 '이웃 공유' 운동의 국제 표준</w:t>
+      </w:r>
+    </w:p>
+    <w:p>
+      <w:pPr>
+        <w:spacing w:after="40" w:before="0" w:line="312" w:lineRule="auto"/>
+        <w:ind w:left="397"/>
+      </w:pPr>
+      <w:r>
+        <w:rPr>
+          <w:rFonts w:ascii="맑은 고딕" w:hAnsi="맑은 고딕" w:eastAsia="맑은 고딕"/>
+          <w:b w:val="0"/>
+          <w:sz w:val="22"/>
+        </w:rPr>
+        <w:t>○ 개요·성과: 1999년 파리 800개 건물·1만명 → 2019년 50개국 3천만명 규모로 성장(European Neighbours' Day)</w:t>
+      </w:r>
+    </w:p>
+    <w:p>
+      <w:pPr>
+        <w:spacing w:after="40" w:before="0" w:line="312" w:lineRule="auto"/>
+        <w:ind w:left="397"/>
+      </w:pPr>
+      <w:r>
+        <w:rPr>
+          <w:rFonts w:ascii="맑은 고딕" w:hAnsi="맑은 고딕" w:eastAsia="맑은 고딕"/>
+          <w:b w:val="0"/>
+          <w:sz w:val="22"/>
+        </w:rPr>
+        <w:t>○ 통합 효과 → ④신뢰 ⑥포용·존중 ⑦상생·연대 : 도시 익명사회의 이웃 단절을 정기적 만남 경험으로 완화</w:t>
+      </w:r>
+    </w:p>
+    <w:p>
+      <w:pPr>
+        <w:spacing w:after="60" w:before="0" w:line="312" w:lineRule="auto"/>
+        <w:ind w:left="0"/>
+      </w:pPr>
+      <w:r>
+        <w:rPr>
+          <w:rFonts w:ascii="맑은 고딕" w:hAnsi="맑은 고딕" w:eastAsia="맑은 고딕"/>
+          <w:b/>
+          <w:sz w:val="23"/>
+        </w:rPr>
+        <w:t>□ 사례 H. 미국 '내셔널 나이트 아웃(National Night Out)' — 이웃 방범 커뮤니티 축제</w:t>
+      </w:r>
+    </w:p>
+    <w:p>
+      <w:pPr>
+        <w:spacing w:after="40" w:before="0" w:line="312" w:lineRule="auto"/>
+        <w:ind w:left="397"/>
+      </w:pPr>
+      <w:r>
+        <w:rPr>
+          <w:rFonts w:ascii="맑은 고딕" w:hAnsi="맑은 고딕" w:eastAsia="맑은 고딕"/>
+          <w:b w:val="0"/>
+          <w:sz w:val="22"/>
+        </w:rPr>
+        <w:t>○ 선정 사유: 이웃 간 결속을 '안전·방범'과 결합, 경험 공유가 지역안전(신뢰)으로 연결되는 목적결합형 모델로 선정</w:t>
+      </w:r>
+    </w:p>
+    <w:p>
+      <w:pPr>
+        <w:spacing w:after="40" w:before="0" w:line="312" w:lineRule="auto"/>
+        <w:ind w:left="397"/>
+      </w:pPr>
+      <w:r>
+        <w:rPr>
+          <w:rFonts w:ascii="맑은 고딕" w:hAnsi="맑은 고딕" w:eastAsia="맑은 고딕"/>
+          <w:b w:val="0"/>
+          <w:sz w:val="22"/>
+        </w:rPr>
+        <w:t>○ 개요·특징: 매년 8월 지역 단위로 주민·경찰이 함께 블록파티·바비큐 개최, 수천개 지역사회 참여</w:t>
+      </w:r>
+    </w:p>
+    <w:p>
+      <w:pPr>
+        <w:spacing w:after="40" w:before="0" w:line="312" w:lineRule="auto"/>
+        <w:ind w:left="397"/>
+      </w:pPr>
+      <w:r>
+        <w:rPr>
+          <w:rFonts w:ascii="맑은 고딕" w:hAnsi="맑은 고딕" w:eastAsia="맑은 고딕"/>
+          <w:b w:val="0"/>
+          <w:sz w:val="22"/>
+        </w:rPr>
+        <w:t>○ 통합 효과 → ④신뢰 ⑦상생·연대 : 이웃·공공(경찰) 간 대면 경험이 지역 신뢰·안전 인식 제고</w:t>
+      </w:r>
+    </w:p>
+    <w:p>
+      <w:pPr>
+        <w:spacing w:after="40" w:before="0" w:line="312" w:lineRule="auto"/>
+        <w:ind w:left="1247"/>
+      </w:pPr>
+      <w:r>
+        <w:rPr>
+          <w:rFonts w:ascii="맑은 고딕" w:hAnsi="맑은 고딕" w:eastAsia="맑은 고딕"/>
+          <w:b w:val="0"/>
+          <w:sz w:val="21"/>
+        </w:rPr>
+        <w:t>· (추가 참고) 독일 2006 월드컵 자국개최('여름동화')로 통일 후 국민정체성 결집, 영국발 파크런(parkrun) 무료 주말 달리기의 전세계 이웃 커뮤니티화 등도 경험형 통합 자원</w:t>
+      </w:r>
+    </w:p>
+    <w:p>
+      <w:pPr>
+        <w:spacing w:before="160" w:after="80"/>
+      </w:pPr>
+      <w:r>
+        <w:rPr>
+          <w:rFonts w:ascii="맑은 고딕" w:hAnsi="맑은 고딕" w:eastAsia="맑은 고딕"/>
+          <w:b/>
+          <w:color w:val="2E2E2E"/>
+          <w:sz w:val="25"/>
+        </w:rPr>
+        <w:t>4. [핵심] 이웃 간 경험 공유 → 통합 키워드 구현 원리</w:t>
+      </w:r>
+    </w:p>
+    <w:p>
+      <w:pPr>
+        <w:spacing w:after="60" w:before="0" w:line="312" w:lineRule="auto"/>
+        <w:ind w:left="0"/>
+      </w:pPr>
+      <w:r>
+        <w:rPr>
+          <w:rFonts w:ascii="맑은 고딕" w:hAnsi="맑은 고딕" w:eastAsia="맑은 고딕"/>
+          <w:b/>
+          <w:sz w:val="23"/>
+        </w:rPr>
+        <w:t>□ 경험의 '요소'가 각 통합 키워드로 전환되는 경로</w:t>
+      </w:r>
+    </w:p>
+    <w:p>
+      <w:pPr>
+        <w:spacing w:after="40" w:before="0" w:line="312" w:lineRule="auto"/>
+        <w:ind w:left="397"/>
+      </w:pPr>
+      <w:r>
+        <w:rPr>
+          <w:rFonts w:ascii="맑은 고딕" w:hAnsi="맑은 고딕" w:eastAsia="맑은 고딕"/>
+          <w:b w:val="0"/>
+          <w:sz w:val="22"/>
+        </w:rPr>
+        <w:t>○ 함께 참여(개방·평등) → ⑤기회균등 ③공정 : 누구나 동등 조건으로 참여하는 경험이 '기회의 평등' 체감 제공</w:t>
+      </w:r>
+    </w:p>
+    <w:p>
+      <w:pPr>
+        <w:spacing w:after="40" w:before="0" w:line="312" w:lineRule="auto"/>
+        <w:ind w:left="397"/>
+      </w:pPr>
+      <w:r>
+        <w:rPr>
+          <w:rFonts w:ascii="맑은 고딕" w:hAnsi="맑은 고딕" w:eastAsia="맑은 고딕"/>
+          <w:b w:val="0"/>
+          <w:sz w:val="22"/>
+        </w:rPr>
+        <w:t>○ 함께 느낌(정서적 고조) → ①소통·화합 : 같은 감정을 공유하는 순간 '우리'라는 일체감 형성(집합적 열광)</w:t>
+      </w:r>
+    </w:p>
+    <w:p>
+      <w:pPr>
+        <w:spacing w:after="40" w:before="0" w:line="312" w:lineRule="auto"/>
+        <w:ind w:left="397"/>
+      </w:pPr>
+      <w:r>
+        <w:rPr>
+          <w:rFonts w:ascii="맑은 고딕" w:hAnsi="맑은 고딕" w:eastAsia="맑은 고딕"/>
+          <w:b w:val="0"/>
+          <w:sz w:val="22"/>
+        </w:rPr>
+        <w:t>○ 함께 극복·기여(공동목표) → ⑦상생·연대 ②격차초월 : 위기·과제를 함께 넘는 경험이 계층·지역 넘는 연대 생성</w:t>
+      </w:r>
+    </w:p>
+    <w:p>
+      <w:pPr>
+        <w:spacing w:after="40" w:before="0" w:line="312" w:lineRule="auto"/>
+        <w:ind w:left="397"/>
+      </w:pPr>
+      <w:r>
+        <w:rPr>
+          <w:rFonts w:ascii="맑은 고딕" w:hAnsi="맑은 고딕" w:eastAsia="맑은 고딕"/>
+          <w:b w:val="0"/>
+          <w:sz w:val="22"/>
+        </w:rPr>
+        <w:t>○ 반복적 대면(이웃 관계망) → ④신뢰 : 정기적 이웃 접촉이 낯선 타인에 대한 사회적 신뢰(교량형 자본)로 축적</w:t>
+      </w:r>
+    </w:p>
+    <w:p>
+      <w:pPr>
+        <w:spacing w:after="40" w:before="0" w:line="312" w:lineRule="auto"/>
+        <w:ind w:left="397"/>
+      </w:pPr>
+      <w:r>
+        <w:rPr>
+          <w:rFonts w:ascii="맑은 고딕" w:hAnsi="맑은 고딕" w:eastAsia="맑은 고딕"/>
+          <w:b w:val="0"/>
+          <w:sz w:val="22"/>
+        </w:rPr>
+        <w:t>○ 다름과 함께(이질집단 접촉) → ⑥포용·존중 : 다른 세대·배경과 어울리는 경험이 편견 감소·상호 존중 촉진</w:t>
+      </w:r>
+    </w:p>
+    <w:p>
+      <w:pPr>
+        <w:spacing w:after="60" w:before="0" w:line="312" w:lineRule="auto"/>
+        <w:ind w:left="0"/>
+      </w:pPr>
+      <w:r>
+        <w:rPr>
+          <w:rFonts w:ascii="맑은 고딕" w:hAnsi="맑은 고딕" w:eastAsia="맑은 고딕"/>
+          <w:b/>
+          <w:sz w:val="23"/>
+        </w:rPr>
+        <w:t>□ 경험형 사례 × 통합 키워드 매트릭스 (●: 주 연결)</w:t>
+      </w:r>
+    </w:p>
+    <w:tbl>
+      <w:tblPr>
+        <w:tblStyle w:val="TableGrid"/>
+        <w:tblW w:type="auto" w:w="0"/>
+        <w:jc w:val="center"/>
+        <w:tblLook w:firstColumn="1" w:firstRow="1" w:lastColumn="0" w:lastRow="0" w:noHBand="0" w:noVBand="1" w:val="04A0"/>
+      </w:tblPr>
+      <w:tblGrid>
+        <w:gridCol w:w="1080"/>
+        <w:gridCol w:w="1080"/>
+        <w:gridCol w:w="1080"/>
+        <w:gridCol w:w="1080"/>
+        <w:gridCol w:w="1080"/>
+        <w:gridCol w:w="1080"/>
+        <w:gridCol w:w="1080"/>
+        <w:gridCol w:w="1080"/>
+      </w:tblGrid>
+      <w:tr>
+        <w:tc>
+          <w:tcPr>
+            <w:tcW w:type="dxa" w:w="1080"/>
+          </w:tcPr>
+          <w:p>
+            <w:pPr>
+              <w:jc w:val="left"/>
+            </w:pPr>
+            <w:r/>
+            <w:r>
+              <w:rPr>
+                <w:rFonts w:ascii="맑은 고딕" w:hAnsi="맑은 고딕" w:eastAsia="맑은 고딕"/>
+                <w:b/>
+                <w:sz w:val="17"/>
+              </w:rPr>
+              <w:t>경험형 사례</w:t>
+            </w:r>
+          </w:p>
+        </w:tc>
+        <w:tc>
+          <w:tcPr>
+            <w:tcW w:type="dxa" w:w="1080"/>
+          </w:tcPr>
+          <w:p>
+            <w:pPr>
+              <w:jc w:val="center"/>
+            </w:pPr>
+            <w:r/>
+            <w:r>
+              <w:rPr>
+                <w:rFonts w:ascii="맑은 고딕" w:hAnsi="맑은 고딕" w:eastAsia="맑은 고딕"/>
+                <w:b/>
+                <w:sz w:val="17"/>
+              </w:rPr>
+              <w:t>①소통·화합</w:t>
+            </w:r>
+          </w:p>
+        </w:tc>
+        <w:tc>
+          <w:tcPr>
+            <w:tcW w:type="dxa" w:w="1080"/>
+          </w:tcPr>
+          <w:p>
+            <w:pPr>
+              <w:jc w:val="center"/>
+            </w:pPr>
+            <w:r/>
+            <w:r>
+              <w:rPr>
+                <w:rFonts w:ascii="맑은 고딕" w:hAnsi="맑은 고딕" w:eastAsia="맑은 고딕"/>
+                <w:b/>
+                <w:sz w:val="17"/>
+              </w:rPr>
+              <w:t>②격차해소</w:t>
+            </w:r>
+          </w:p>
+        </w:tc>
+        <w:tc>
+          <w:tcPr>
+            <w:tcW w:type="dxa" w:w="1080"/>
+          </w:tcPr>
+          <w:p>
+            <w:pPr>
+              <w:jc w:val="center"/>
+            </w:pPr>
+            <w:r/>
+            <w:r>
+              <w:rPr>
+                <w:rFonts w:ascii="맑은 고딕" w:hAnsi="맑은 고딕" w:eastAsia="맑은 고딕"/>
+                <w:b/>
+                <w:sz w:val="17"/>
+              </w:rPr>
+              <w:t>③공정</w:t>
+            </w:r>
+          </w:p>
+        </w:tc>
+        <w:tc>
+          <w:tcPr>
+            <w:tcW w:type="dxa" w:w="1080"/>
+          </w:tcPr>
+          <w:p>
+            <w:pPr>
+              <w:jc w:val="center"/>
+            </w:pPr>
+            <w:r/>
+            <w:r>
+              <w:rPr>
+                <w:rFonts w:ascii="맑은 고딕" w:hAnsi="맑은 고딕" w:eastAsia="맑은 고딕"/>
+                <w:b/>
+                <w:sz w:val="17"/>
+              </w:rPr>
+              <w:t>④신뢰</w:t>
+            </w:r>
+          </w:p>
+        </w:tc>
+        <w:tc>
+          <w:tcPr>
+            <w:tcW w:type="dxa" w:w="1080"/>
+          </w:tcPr>
+          <w:p>
+            <w:pPr>
+              <w:jc w:val="center"/>
+            </w:pPr>
+            <w:r/>
+            <w:r>
+              <w:rPr>
+                <w:rFonts w:ascii="맑은 고딕" w:hAnsi="맑은 고딕" w:eastAsia="맑은 고딕"/>
+                <w:b/>
+                <w:sz w:val="17"/>
+              </w:rPr>
+              <w:t>⑤기회균등</w:t>
+            </w:r>
+          </w:p>
+        </w:tc>
+        <w:tc>
+          <w:tcPr>
+            <w:tcW w:type="dxa" w:w="1080"/>
+          </w:tcPr>
+          <w:p>
+            <w:pPr>
+              <w:jc w:val="center"/>
+            </w:pPr>
+            <w:r/>
+            <w:r>
+              <w:rPr>
+                <w:rFonts w:ascii="맑은 고딕" w:hAnsi="맑은 고딕" w:eastAsia="맑은 고딕"/>
+                <w:b/>
+                <w:sz w:val="17"/>
+              </w:rPr>
+              <w:t>⑥포용·존중</w:t>
+            </w:r>
+          </w:p>
+        </w:tc>
+        <w:tc>
+          <w:tcPr>
+            <w:tcW w:type="dxa" w:w="1080"/>
+          </w:tcPr>
+          <w:p>
+            <w:pPr>
+              <w:jc w:val="center"/>
+            </w:pPr>
+            <w:r/>
+            <w:r>
+              <w:rPr>
+                <w:rFonts w:ascii="맑은 고딕" w:hAnsi="맑은 고딕" w:eastAsia="맑은 고딕"/>
+                <w:b/>
+                <w:sz w:val="17"/>
+              </w:rPr>
+              <w:t>⑦상생·연대</w:t>
+            </w:r>
+          </w:p>
+        </w:tc>
+      </w:tr>
+      <w:tr>
+        <w:tc>
+          <w:tcPr>
+            <w:tcW w:type="dxa" w:w="1080"/>
+          </w:tcPr>
+          <w:p>
+            <w:pPr>
+              <w:jc w:val="left"/>
+            </w:pPr>
+            <w:r/>
+            <w:r>
+              <w:rPr>
+                <w:rFonts w:ascii="맑은 고딕" w:hAnsi="맑은 고딕" w:eastAsia="맑은 고딕"/>
+                <w:b w:val="0"/>
+                <w:sz w:val="17"/>
+              </w:rPr>
+              <w:t>A. 금모으기(1998)</w:t>
+            </w:r>
+          </w:p>
+        </w:tc>
+        <w:tc>
+          <w:tcPr>
+            <w:tcW w:type="dxa" w:w="1080"/>
+          </w:tcPr>
+          <w:p>
+            <w:pPr>
+              <w:jc w:val="center"/>
+            </w:pPr>
+            <w:r/>
+            <w:r>
+              <w:rPr>
+                <w:rFonts w:ascii="맑은 고딕" w:hAnsi="맑은 고딕" w:eastAsia="맑은 고딕"/>
+                <w:b w:val="0"/>
+                <w:sz w:val="17"/>
+              </w:rPr>
+            </w:r>
+          </w:p>
+        </w:tc>
+        <w:tc>
+          <w:tcPr>
+            <w:tcW w:type="dxa" w:w="1080"/>
+          </w:tcPr>
+          <w:p>
+            <w:pPr>
+              <w:jc w:val="center"/>
+            </w:pPr>
+            <w:r/>
+            <w:r>
+              <w:rPr>
+                <w:rFonts w:ascii="맑은 고딕" w:hAnsi="맑은 고딕" w:eastAsia="맑은 고딕"/>
+                <w:b w:val="0"/>
+                <w:sz w:val="17"/>
+              </w:rPr>
+              <w:t>●</w:t>
+            </w:r>
+          </w:p>
+        </w:tc>
+        <w:tc>
+          <w:tcPr>
+            <w:tcW w:type="dxa" w:w="1080"/>
+          </w:tcPr>
+          <w:p>
+            <w:pPr>
+              <w:jc w:val="center"/>
+            </w:pPr>
+            <w:r/>
+            <w:r>
+              <w:rPr>
+                <w:rFonts w:ascii="맑은 고딕" w:hAnsi="맑은 고딕" w:eastAsia="맑은 고딕"/>
+                <w:b w:val="0"/>
+                <w:sz w:val="17"/>
+              </w:rPr>
+            </w:r>
+          </w:p>
+        </w:tc>
+        <w:tc>
+          <w:tcPr>
+            <w:tcW w:type="dxa" w:w="1080"/>
+          </w:tcPr>
+          <w:p>
+            <w:pPr>
+              <w:jc w:val="center"/>
+            </w:pPr>
+            <w:r/>
+            <w:r>
+              <w:rPr>
+                <w:rFonts w:ascii="맑은 고딕" w:hAnsi="맑은 고딕" w:eastAsia="맑은 고딕"/>
+                <w:b w:val="0"/>
+                <w:sz w:val="17"/>
+              </w:rPr>
+              <w:t>●</w:t>
+            </w:r>
+          </w:p>
+        </w:tc>
+        <w:tc>
+          <w:tcPr>
+            <w:tcW w:type="dxa" w:w="1080"/>
+          </w:tcPr>
+          <w:p>
+            <w:pPr>
+              <w:jc w:val="center"/>
+            </w:pPr>
+            <w:r/>
+            <w:r>
+              <w:rPr>
+                <w:rFonts w:ascii="맑은 고딕" w:hAnsi="맑은 고딕" w:eastAsia="맑은 고딕"/>
+                <w:b w:val="0"/>
+                <w:sz w:val="17"/>
+              </w:rPr>
+            </w:r>
+          </w:p>
+        </w:tc>
+        <w:tc>
+          <w:tcPr>
+            <w:tcW w:type="dxa" w:w="1080"/>
+          </w:tcPr>
+          <w:p>
+            <w:pPr>
+              <w:jc w:val="center"/>
+            </w:pPr>
+            <w:r/>
+            <w:r>
+              <w:rPr>
+                <w:rFonts w:ascii="맑은 고딕" w:hAnsi="맑은 고딕" w:eastAsia="맑은 고딕"/>
+                <w:b w:val="0"/>
+                <w:sz w:val="17"/>
+              </w:rPr>
+            </w:r>
+          </w:p>
+        </w:tc>
+        <w:tc>
+          <w:tcPr>
+            <w:tcW w:type="dxa" w:w="1080"/>
+          </w:tcPr>
+          <w:p>
+            <w:pPr>
+              <w:jc w:val="center"/>
+            </w:pPr>
+            <w:r/>
+            <w:r>
+              <w:rPr>
+                <w:rFonts w:ascii="맑은 고딕" w:hAnsi="맑은 고딕" w:eastAsia="맑은 고딕"/>
+                <w:b w:val="0"/>
+                <w:sz w:val="17"/>
+              </w:rPr>
+              <w:t>●</w:t>
+            </w:r>
+          </w:p>
+        </w:tc>
+      </w:tr>
+      <w:tr>
+        <w:tc>
+          <w:tcPr>
+            <w:tcW w:type="dxa" w:w="1080"/>
+          </w:tcPr>
+          <w:p>
+            <w:pPr>
+              <w:jc w:val="left"/>
+            </w:pPr>
+            <w:r/>
+            <w:r>
+              <w:rPr>
+                <w:rFonts w:ascii="맑은 고딕" w:hAnsi="맑은 고딕" w:eastAsia="맑은 고딕"/>
+                <w:b w:val="0"/>
+                <w:sz w:val="17"/>
+              </w:rPr>
+              <w:t>B. 2002 거리응원</w:t>
+            </w:r>
+          </w:p>
+        </w:tc>
+        <w:tc>
+          <w:tcPr>
+            <w:tcW w:type="dxa" w:w="1080"/>
+          </w:tcPr>
+          <w:p>
+            <w:pPr>
+              <w:jc w:val="center"/>
+            </w:pPr>
+            <w:r/>
+            <w:r>
+              <w:rPr>
+                <w:rFonts w:ascii="맑은 고딕" w:hAnsi="맑은 고딕" w:eastAsia="맑은 고딕"/>
+                <w:b w:val="0"/>
+                <w:sz w:val="17"/>
+              </w:rPr>
+              <w:t>●</w:t>
+            </w:r>
+          </w:p>
+        </w:tc>
+        <w:tc>
+          <w:tcPr>
+            <w:tcW w:type="dxa" w:w="1080"/>
+          </w:tcPr>
+          <w:p>
+            <w:pPr>
+              <w:jc w:val="center"/>
+            </w:pPr>
+            <w:r/>
+            <w:r>
+              <w:rPr>
+                <w:rFonts w:ascii="맑은 고딕" w:hAnsi="맑은 고딕" w:eastAsia="맑은 고딕"/>
+                <w:b w:val="0"/>
+                <w:sz w:val="17"/>
+              </w:rPr>
+            </w:r>
+          </w:p>
+        </w:tc>
+        <w:tc>
+          <w:tcPr>
+            <w:tcW w:type="dxa" w:w="1080"/>
+          </w:tcPr>
+          <w:p>
+            <w:pPr>
+              <w:jc w:val="center"/>
+            </w:pPr>
+            <w:r/>
+            <w:r>
+              <w:rPr>
+                <w:rFonts w:ascii="맑은 고딕" w:hAnsi="맑은 고딕" w:eastAsia="맑은 고딕"/>
+                <w:b w:val="0"/>
+                <w:sz w:val="17"/>
+              </w:rPr>
+              <w:t>○</w:t>
+            </w:r>
+          </w:p>
+        </w:tc>
+        <w:tc>
+          <w:tcPr>
+            <w:tcW w:type="dxa" w:w="1080"/>
+          </w:tcPr>
+          <w:p>
+            <w:pPr>
+              <w:jc w:val="center"/>
+            </w:pPr>
+            <w:r/>
+            <w:r>
+              <w:rPr>
+                <w:rFonts w:ascii="맑은 고딕" w:hAnsi="맑은 고딕" w:eastAsia="맑은 고딕"/>
+                <w:b w:val="0"/>
+                <w:sz w:val="17"/>
+              </w:rPr>
+            </w:r>
+          </w:p>
+        </w:tc>
+        <w:tc>
+          <w:tcPr>
+            <w:tcW w:type="dxa" w:w="1080"/>
+          </w:tcPr>
+          <w:p>
+            <w:pPr>
+              <w:jc w:val="center"/>
+            </w:pPr>
+            <w:r/>
+            <w:r>
+              <w:rPr>
+                <w:rFonts w:ascii="맑은 고딕" w:hAnsi="맑은 고딕" w:eastAsia="맑은 고딕"/>
+                <w:b w:val="0"/>
+                <w:sz w:val="17"/>
+              </w:rPr>
+              <w:t>●</w:t>
+            </w:r>
+          </w:p>
+        </w:tc>
+        <w:tc>
+          <w:tcPr>
+            <w:tcW w:type="dxa" w:w="1080"/>
+          </w:tcPr>
+          <w:p>
+            <w:pPr>
+              <w:jc w:val="center"/>
+            </w:pPr>
+            <w:r/>
+            <w:r>
+              <w:rPr>
+                <w:rFonts w:ascii="맑은 고딕" w:hAnsi="맑은 고딕" w:eastAsia="맑은 고딕"/>
+                <w:b w:val="0"/>
+                <w:sz w:val="17"/>
+              </w:rPr>
+              <w:t>●</w:t>
+            </w:r>
+          </w:p>
+        </w:tc>
+        <w:tc>
+          <w:tcPr>
+            <w:tcW w:type="dxa" w:w="1080"/>
+          </w:tcPr>
+          <w:p>
+            <w:pPr>
+              <w:jc w:val="center"/>
+            </w:pPr>
+            <w:r/>
+            <w:r>
+              <w:rPr>
+                <w:rFonts w:ascii="맑은 고딕" w:hAnsi="맑은 고딕" w:eastAsia="맑은 고딕"/>
+                <w:b w:val="0"/>
+                <w:sz w:val="17"/>
+              </w:rPr>
+            </w:r>
+          </w:p>
+        </w:tc>
+      </w:tr>
+      <w:tr>
+        <w:tc>
+          <w:tcPr>
+            <w:tcW w:type="dxa" w:w="1080"/>
+          </w:tcPr>
+          <w:p>
+            <w:pPr>
+              <w:jc w:val="left"/>
+            </w:pPr>
+            <w:r/>
+            <w:r>
+              <w:rPr>
+                <w:rFonts w:ascii="맑은 고딕" w:hAnsi="맑은 고딕" w:eastAsia="맑은 고딕"/>
+                <w:b w:val="0"/>
+                <w:sz w:val="17"/>
+              </w:rPr>
+              <w:t>C. 태안 자원봉사</w:t>
+            </w:r>
+          </w:p>
+        </w:tc>
+        <w:tc>
+          <w:tcPr>
+            <w:tcW w:type="dxa" w:w="1080"/>
+          </w:tcPr>
+          <w:p>
+            <w:pPr>
+              <w:jc w:val="center"/>
+            </w:pPr>
+            <w:r/>
+            <w:r>
+              <w:rPr>
+                <w:rFonts w:ascii="맑은 고딕" w:hAnsi="맑은 고딕" w:eastAsia="맑은 고딕"/>
+                <w:b w:val="0"/>
+                <w:sz w:val="17"/>
+              </w:rPr>
+            </w:r>
+          </w:p>
+        </w:tc>
+        <w:tc>
+          <w:tcPr>
+            <w:tcW w:type="dxa" w:w="1080"/>
+          </w:tcPr>
+          <w:p>
+            <w:pPr>
+              <w:jc w:val="center"/>
+            </w:pPr>
+            <w:r/>
+            <w:r>
+              <w:rPr>
+                <w:rFonts w:ascii="맑은 고딕" w:hAnsi="맑은 고딕" w:eastAsia="맑은 고딕"/>
+                <w:b w:val="0"/>
+                <w:sz w:val="17"/>
+              </w:rPr>
+              <w:t>○</w:t>
+            </w:r>
+          </w:p>
+        </w:tc>
+        <w:tc>
+          <w:tcPr>
+            <w:tcW w:type="dxa" w:w="1080"/>
+          </w:tcPr>
+          <w:p>
+            <w:pPr>
+              <w:jc w:val="center"/>
+            </w:pPr>
+            <w:r/>
+            <w:r>
+              <w:rPr>
+                <w:rFonts w:ascii="맑은 고딕" w:hAnsi="맑은 고딕" w:eastAsia="맑은 고딕"/>
+                <w:b w:val="0"/>
+                <w:sz w:val="17"/>
+              </w:rPr>
+            </w:r>
+          </w:p>
+        </w:tc>
+        <w:tc>
+          <w:tcPr>
+            <w:tcW w:type="dxa" w:w="1080"/>
+          </w:tcPr>
+          <w:p>
+            <w:pPr>
+              <w:jc w:val="center"/>
+            </w:pPr>
+            <w:r/>
+            <w:r>
+              <w:rPr>
+                <w:rFonts w:ascii="맑은 고딕" w:hAnsi="맑은 고딕" w:eastAsia="맑은 고딕"/>
+                <w:b w:val="0"/>
+                <w:sz w:val="17"/>
+              </w:rPr>
+              <w:t>●</w:t>
+            </w:r>
+          </w:p>
+        </w:tc>
+        <w:tc>
+          <w:tcPr>
+            <w:tcW w:type="dxa" w:w="1080"/>
+          </w:tcPr>
+          <w:p>
+            <w:pPr>
+              <w:jc w:val="center"/>
+            </w:pPr>
+            <w:r/>
+            <w:r>
+              <w:rPr>
+                <w:rFonts w:ascii="맑은 고딕" w:hAnsi="맑은 고딕" w:eastAsia="맑은 고딕"/>
+                <w:b w:val="0"/>
+                <w:sz w:val="17"/>
+              </w:rPr>
+            </w:r>
+          </w:p>
+        </w:tc>
+        <w:tc>
+          <w:tcPr>
+            <w:tcW w:type="dxa" w:w="1080"/>
+          </w:tcPr>
+          <w:p>
+            <w:pPr>
+              <w:jc w:val="center"/>
+            </w:pPr>
+            <w:r/>
+            <w:r>
+              <w:rPr>
+                <w:rFonts w:ascii="맑은 고딕" w:hAnsi="맑은 고딕" w:eastAsia="맑은 고딕"/>
+                <w:b w:val="0"/>
+                <w:sz w:val="17"/>
+              </w:rPr>
+            </w:r>
+          </w:p>
+        </w:tc>
+        <w:tc>
+          <w:tcPr>
+            <w:tcW w:type="dxa" w:w="1080"/>
+          </w:tcPr>
+          <w:p>
+            <w:pPr>
+              <w:jc w:val="center"/>
+            </w:pPr>
+            <w:r/>
+            <w:r>
+              <w:rPr>
+                <w:rFonts w:ascii="맑은 고딕" w:hAnsi="맑은 고딕" w:eastAsia="맑은 고딕"/>
+                <w:b w:val="0"/>
+                <w:sz w:val="17"/>
+              </w:rPr>
+              <w:t>●</w:t>
+            </w:r>
+          </w:p>
+        </w:tc>
+      </w:tr>
+      <w:tr>
+        <w:tc>
+          <w:tcPr>
+            <w:tcW w:type="dxa" w:w="1080"/>
+          </w:tcPr>
+          <w:p>
+            <w:pPr>
+              <w:jc w:val="left"/>
+            </w:pPr>
+            <w:r/>
+            <w:r>
+              <w:rPr>
+                <w:rFonts w:ascii="맑은 고딕" w:hAnsi="맑은 고딕" w:eastAsia="맑은 고딕"/>
+                <w:b w:val="0"/>
+                <w:sz w:val="17"/>
+              </w:rPr>
+              <w:t>D. 프로야구 응원</w:t>
+            </w:r>
+          </w:p>
+        </w:tc>
+        <w:tc>
+          <w:tcPr>
+            <w:tcW w:type="dxa" w:w="1080"/>
+          </w:tcPr>
+          <w:p>
+            <w:pPr>
+              <w:jc w:val="center"/>
+            </w:pPr>
+            <w:r/>
+            <w:r>
+              <w:rPr>
+                <w:rFonts w:ascii="맑은 고딕" w:hAnsi="맑은 고딕" w:eastAsia="맑은 고딕"/>
+                <w:b w:val="0"/>
+                <w:sz w:val="17"/>
+              </w:rPr>
+              <w:t>●</w:t>
+            </w:r>
+          </w:p>
+        </w:tc>
+        <w:tc>
+          <w:tcPr>
+            <w:tcW w:type="dxa" w:w="1080"/>
+          </w:tcPr>
+          <w:p>
+            <w:pPr>
+              <w:jc w:val="center"/>
+            </w:pPr>
+            <w:r/>
+            <w:r>
+              <w:rPr>
+                <w:rFonts w:ascii="맑은 고딕" w:hAnsi="맑은 고딕" w:eastAsia="맑은 고딕"/>
+                <w:b w:val="0"/>
+                <w:sz w:val="17"/>
+              </w:rPr>
+            </w:r>
+          </w:p>
+        </w:tc>
+        <w:tc>
+          <w:tcPr>
+            <w:tcW w:type="dxa" w:w="1080"/>
+          </w:tcPr>
+          <w:p>
+            <w:pPr>
+              <w:jc w:val="center"/>
+            </w:pPr>
+            <w:r/>
+            <w:r>
+              <w:rPr>
+                <w:rFonts w:ascii="맑은 고딕" w:hAnsi="맑은 고딕" w:eastAsia="맑은 고딕"/>
+                <w:b w:val="0"/>
+                <w:sz w:val="17"/>
+              </w:rPr>
+            </w:r>
+          </w:p>
+        </w:tc>
+        <w:tc>
+          <w:tcPr>
+            <w:tcW w:type="dxa" w:w="1080"/>
+          </w:tcPr>
+          <w:p>
+            <w:pPr>
+              <w:jc w:val="center"/>
+            </w:pPr>
+            <w:r/>
+            <w:r>
+              <w:rPr>
+                <w:rFonts w:ascii="맑은 고딕" w:hAnsi="맑은 고딕" w:eastAsia="맑은 고딕"/>
+                <w:b w:val="0"/>
+                <w:sz w:val="17"/>
+              </w:rPr>
+              <w:t>○</w:t>
+            </w:r>
+          </w:p>
+        </w:tc>
+        <w:tc>
+          <w:tcPr>
+            <w:tcW w:type="dxa" w:w="1080"/>
+          </w:tcPr>
+          <w:p>
+            <w:pPr>
+              <w:jc w:val="center"/>
+            </w:pPr>
+            <w:r/>
+            <w:r>
+              <w:rPr>
+                <w:rFonts w:ascii="맑은 고딕" w:hAnsi="맑은 고딕" w:eastAsia="맑은 고딕"/>
+                <w:b w:val="0"/>
+                <w:sz w:val="17"/>
+              </w:rPr>
+            </w:r>
+          </w:p>
+        </w:tc>
+        <w:tc>
+          <w:tcPr>
+            <w:tcW w:type="dxa" w:w="1080"/>
+          </w:tcPr>
+          <w:p>
+            <w:pPr>
+              <w:jc w:val="center"/>
+            </w:pPr>
+            <w:r/>
+            <w:r>
+              <w:rPr>
+                <w:rFonts w:ascii="맑은 고딕" w:hAnsi="맑은 고딕" w:eastAsia="맑은 고딕"/>
+                <w:b w:val="0"/>
+                <w:sz w:val="17"/>
+              </w:rPr>
+            </w:r>
+          </w:p>
+        </w:tc>
+        <w:tc>
+          <w:tcPr>
+            <w:tcW w:type="dxa" w:w="1080"/>
+          </w:tcPr>
+          <w:p>
+            <w:pPr>
+              <w:jc w:val="center"/>
+            </w:pPr>
+            <w:r/>
+            <w:r>
+              <w:rPr>
+                <w:rFonts w:ascii="맑은 고딕" w:hAnsi="맑은 고딕" w:eastAsia="맑은 고딕"/>
+                <w:b w:val="0"/>
+                <w:sz w:val="17"/>
+              </w:rPr>
+              <w:t>●</w:t>
+            </w:r>
+          </w:p>
+        </w:tc>
+      </w:tr>
+      <w:tr>
+        <w:tc>
+          <w:tcPr>
+            <w:tcW w:type="dxa" w:w="1080"/>
+          </w:tcPr>
+          <w:p>
+            <w:pPr>
+              <w:jc w:val="left"/>
+            </w:pPr>
+            <w:r/>
+            <w:r>
+              <w:rPr>
+                <w:rFonts w:ascii="맑은 고딕" w:hAnsi="맑은 고딕" w:eastAsia="맑은 고딕"/>
+                <w:b w:val="0"/>
+                <w:sz w:val="17"/>
+              </w:rPr>
+              <w:t>E. 남아공 럭비(1995)</w:t>
+            </w:r>
+          </w:p>
+        </w:tc>
+        <w:tc>
+          <w:tcPr>
+            <w:tcW w:type="dxa" w:w="1080"/>
+          </w:tcPr>
+          <w:p>
+            <w:pPr>
+              <w:jc w:val="center"/>
+            </w:pPr>
+            <w:r/>
+            <w:r>
+              <w:rPr>
+                <w:rFonts w:ascii="맑은 고딕" w:hAnsi="맑은 고딕" w:eastAsia="맑은 고딕"/>
+                <w:b w:val="0"/>
+                <w:sz w:val="17"/>
+              </w:rPr>
+              <w:t>●</w:t>
+            </w:r>
+          </w:p>
+        </w:tc>
+        <w:tc>
+          <w:tcPr>
+            <w:tcW w:type="dxa" w:w="1080"/>
+          </w:tcPr>
+          <w:p>
+            <w:pPr>
+              <w:jc w:val="center"/>
+            </w:pPr>
+            <w:r/>
+            <w:r>
+              <w:rPr>
+                <w:rFonts w:ascii="맑은 고딕" w:hAnsi="맑은 고딕" w:eastAsia="맑은 고딕"/>
+                <w:b w:val="0"/>
+                <w:sz w:val="17"/>
+              </w:rPr>
+            </w:r>
+          </w:p>
+        </w:tc>
+        <w:tc>
+          <w:tcPr>
+            <w:tcW w:type="dxa" w:w="1080"/>
+          </w:tcPr>
+          <w:p>
+            <w:pPr>
+              <w:jc w:val="center"/>
+            </w:pPr>
+            <w:r/>
+            <w:r>
+              <w:rPr>
+                <w:rFonts w:ascii="맑은 고딕" w:hAnsi="맑은 고딕" w:eastAsia="맑은 고딕"/>
+                <w:b w:val="0"/>
+                <w:sz w:val="17"/>
+              </w:rPr>
+            </w:r>
+          </w:p>
+        </w:tc>
+        <w:tc>
+          <w:tcPr>
+            <w:tcW w:type="dxa" w:w="1080"/>
+          </w:tcPr>
+          <w:p>
+            <w:pPr>
+              <w:jc w:val="center"/>
+            </w:pPr>
+            <w:r/>
+            <w:r>
+              <w:rPr>
+                <w:rFonts w:ascii="맑은 고딕" w:hAnsi="맑은 고딕" w:eastAsia="맑은 고딕"/>
+                <w:b w:val="0"/>
+                <w:sz w:val="17"/>
+              </w:rPr>
+              <w:t>○</w:t>
+            </w:r>
+          </w:p>
+        </w:tc>
+        <w:tc>
+          <w:tcPr>
+            <w:tcW w:type="dxa" w:w="1080"/>
+          </w:tcPr>
+          <w:p>
+            <w:pPr>
+              <w:jc w:val="center"/>
+            </w:pPr>
+            <w:r/>
+            <w:r>
+              <w:rPr>
+                <w:rFonts w:ascii="맑은 고딕" w:hAnsi="맑은 고딕" w:eastAsia="맑은 고딕"/>
+                <w:b w:val="0"/>
+                <w:sz w:val="17"/>
+              </w:rPr>
+            </w:r>
+          </w:p>
+        </w:tc>
+        <w:tc>
+          <w:tcPr>
+            <w:tcW w:type="dxa" w:w="1080"/>
+          </w:tcPr>
+          <w:p>
+            <w:pPr>
+              <w:jc w:val="center"/>
+            </w:pPr>
+            <w:r/>
+            <w:r>
+              <w:rPr>
+                <w:rFonts w:ascii="맑은 고딕" w:hAnsi="맑은 고딕" w:eastAsia="맑은 고딕"/>
+                <w:b w:val="0"/>
+                <w:sz w:val="17"/>
+              </w:rPr>
+              <w:t>●</w:t>
+            </w:r>
+          </w:p>
+        </w:tc>
+        <w:tc>
+          <w:tcPr>
+            <w:tcW w:type="dxa" w:w="1080"/>
+          </w:tcPr>
+          <w:p>
+            <w:pPr>
+              <w:jc w:val="center"/>
+            </w:pPr>
+            <w:r/>
+            <w:r>
+              <w:rPr>
+                <w:rFonts w:ascii="맑은 고딕" w:hAnsi="맑은 고딕" w:eastAsia="맑은 고딕"/>
+                <w:b w:val="0"/>
+                <w:sz w:val="17"/>
+              </w:rPr>
+            </w:r>
+          </w:p>
+        </w:tc>
+      </w:tr>
+      <w:tr>
+        <w:tc>
+          <w:tcPr>
+            <w:tcW w:type="dxa" w:w="1080"/>
+          </w:tcPr>
+          <w:p>
+            <w:pPr>
+              <w:jc w:val="left"/>
+            </w:pPr>
+            <w:r/>
+            <w:r>
+              <w:rPr>
+                <w:rFonts w:ascii="맑은 고딕" w:hAnsi="맑은 고딕" w:eastAsia="맑은 고딕"/>
+                <w:b w:val="0"/>
+                <w:sz w:val="17"/>
+              </w:rPr>
+              <w:t>F. 영국 빅 런치</w:t>
+            </w:r>
+          </w:p>
+        </w:tc>
+        <w:tc>
+          <w:tcPr>
+            <w:tcW w:type="dxa" w:w="1080"/>
+          </w:tcPr>
+          <w:p>
+            <w:pPr>
+              <w:jc w:val="center"/>
+            </w:pPr>
+            <w:r/>
+            <w:r>
+              <w:rPr>
+                <w:rFonts w:ascii="맑은 고딕" w:hAnsi="맑은 고딕" w:eastAsia="맑은 고딕"/>
+                <w:b w:val="0"/>
+                <w:sz w:val="17"/>
+              </w:rPr>
+              <w:t>●</w:t>
+            </w:r>
+          </w:p>
+        </w:tc>
+        <w:tc>
+          <w:tcPr>
+            <w:tcW w:type="dxa" w:w="1080"/>
+          </w:tcPr>
+          <w:p>
+            <w:pPr>
+              <w:jc w:val="center"/>
+            </w:pPr>
+            <w:r/>
+            <w:r>
+              <w:rPr>
+                <w:rFonts w:ascii="맑은 고딕" w:hAnsi="맑은 고딕" w:eastAsia="맑은 고딕"/>
+                <w:b w:val="0"/>
+                <w:sz w:val="17"/>
+              </w:rPr>
+            </w:r>
+          </w:p>
+        </w:tc>
+        <w:tc>
+          <w:tcPr>
+            <w:tcW w:type="dxa" w:w="1080"/>
+          </w:tcPr>
+          <w:p>
+            <w:pPr>
+              <w:jc w:val="center"/>
+            </w:pPr>
+            <w:r/>
+            <w:r>
+              <w:rPr>
+                <w:rFonts w:ascii="맑은 고딕" w:hAnsi="맑은 고딕" w:eastAsia="맑은 고딕"/>
+                <w:b w:val="0"/>
+                <w:sz w:val="17"/>
+              </w:rPr>
+            </w:r>
+          </w:p>
+        </w:tc>
+        <w:tc>
+          <w:tcPr>
+            <w:tcW w:type="dxa" w:w="1080"/>
+          </w:tcPr>
+          <w:p>
+            <w:pPr>
+              <w:jc w:val="center"/>
+            </w:pPr>
+            <w:r/>
+            <w:r>
+              <w:rPr>
+                <w:rFonts w:ascii="맑은 고딕" w:hAnsi="맑은 고딕" w:eastAsia="맑은 고딕"/>
+                <w:b w:val="0"/>
+                <w:sz w:val="17"/>
+              </w:rPr>
+              <w:t>●</w:t>
+            </w:r>
+          </w:p>
+        </w:tc>
+        <w:tc>
+          <w:tcPr>
+            <w:tcW w:type="dxa" w:w="1080"/>
+          </w:tcPr>
+          <w:p>
+            <w:pPr>
+              <w:jc w:val="center"/>
+            </w:pPr>
+            <w:r/>
+            <w:r>
+              <w:rPr>
+                <w:rFonts w:ascii="맑은 고딕" w:hAnsi="맑은 고딕" w:eastAsia="맑은 고딕"/>
+                <w:b w:val="0"/>
+                <w:sz w:val="17"/>
+              </w:rPr>
+            </w:r>
+          </w:p>
+        </w:tc>
+        <w:tc>
+          <w:tcPr>
+            <w:tcW w:type="dxa" w:w="1080"/>
+          </w:tcPr>
+          <w:p>
+            <w:pPr>
+              <w:jc w:val="center"/>
+            </w:pPr>
+            <w:r/>
+            <w:r>
+              <w:rPr>
+                <w:rFonts w:ascii="맑은 고딕" w:hAnsi="맑은 고딕" w:eastAsia="맑은 고딕"/>
+                <w:b w:val="0"/>
+                <w:sz w:val="17"/>
+              </w:rPr>
+              <w:t>●</w:t>
+            </w:r>
+          </w:p>
+        </w:tc>
+        <w:tc>
+          <w:tcPr>
+            <w:tcW w:type="dxa" w:w="1080"/>
+          </w:tcPr>
+          <w:p>
+            <w:pPr>
+              <w:jc w:val="center"/>
+            </w:pPr>
+            <w:r/>
+            <w:r>
+              <w:rPr>
+                <w:rFonts w:ascii="맑은 고딕" w:hAnsi="맑은 고딕" w:eastAsia="맑은 고딕"/>
+                <w:b w:val="0"/>
+                <w:sz w:val="17"/>
+              </w:rPr>
+              <w:t>○</w:t>
+            </w:r>
+          </w:p>
+        </w:tc>
+      </w:tr>
+      <w:tr>
+        <w:tc>
+          <w:tcPr>
+            <w:tcW w:type="dxa" w:w="1080"/>
+          </w:tcPr>
+          <w:p>
+            <w:pPr>
+              <w:jc w:val="left"/>
+            </w:pPr>
+            <w:r/>
+            <w:r>
+              <w:rPr>
+                <w:rFonts w:ascii="맑은 고딕" w:hAnsi="맑은 고딕" w:eastAsia="맑은 고딕"/>
+                <w:b w:val="0"/>
+                <w:sz w:val="17"/>
+              </w:rPr>
+              <w:t>G. 이웃의 날</w:t>
+            </w:r>
+          </w:p>
+        </w:tc>
+        <w:tc>
+          <w:tcPr>
+            <w:tcW w:type="dxa" w:w="1080"/>
+          </w:tcPr>
+          <w:p>
+            <w:pPr>
+              <w:jc w:val="center"/>
+            </w:pPr>
+            <w:r/>
+            <w:r>
+              <w:rPr>
+                <w:rFonts w:ascii="맑은 고딕" w:hAnsi="맑은 고딕" w:eastAsia="맑은 고딕"/>
+                <w:b w:val="0"/>
+                <w:sz w:val="17"/>
+              </w:rPr>
+            </w:r>
+          </w:p>
+        </w:tc>
+        <w:tc>
+          <w:tcPr>
+            <w:tcW w:type="dxa" w:w="1080"/>
+          </w:tcPr>
+          <w:p>
+            <w:pPr>
+              <w:jc w:val="center"/>
+            </w:pPr>
+            <w:r/>
+            <w:r>
+              <w:rPr>
+                <w:rFonts w:ascii="맑은 고딕" w:hAnsi="맑은 고딕" w:eastAsia="맑은 고딕"/>
+                <w:b w:val="0"/>
+                <w:sz w:val="17"/>
+              </w:rPr>
+            </w:r>
+          </w:p>
+        </w:tc>
+        <w:tc>
+          <w:tcPr>
+            <w:tcW w:type="dxa" w:w="1080"/>
+          </w:tcPr>
+          <w:p>
+            <w:pPr>
+              <w:jc w:val="center"/>
+            </w:pPr>
+            <w:r/>
+            <w:r>
+              <w:rPr>
+                <w:rFonts w:ascii="맑은 고딕" w:hAnsi="맑은 고딕" w:eastAsia="맑은 고딕"/>
+                <w:b w:val="0"/>
+                <w:sz w:val="17"/>
+              </w:rPr>
+            </w:r>
+          </w:p>
+        </w:tc>
+        <w:tc>
+          <w:tcPr>
+            <w:tcW w:type="dxa" w:w="1080"/>
+          </w:tcPr>
+          <w:p>
+            <w:pPr>
+              <w:jc w:val="center"/>
+            </w:pPr>
+            <w:r/>
+            <w:r>
+              <w:rPr>
+                <w:rFonts w:ascii="맑은 고딕" w:hAnsi="맑은 고딕" w:eastAsia="맑은 고딕"/>
+                <w:b w:val="0"/>
+                <w:sz w:val="17"/>
+              </w:rPr>
+              <w:t>●</w:t>
+            </w:r>
+          </w:p>
+        </w:tc>
+        <w:tc>
+          <w:tcPr>
+            <w:tcW w:type="dxa" w:w="1080"/>
+          </w:tcPr>
+          <w:p>
+            <w:pPr>
+              <w:jc w:val="center"/>
+            </w:pPr>
+            <w:r/>
+            <w:r>
+              <w:rPr>
+                <w:rFonts w:ascii="맑은 고딕" w:hAnsi="맑은 고딕" w:eastAsia="맑은 고딕"/>
+                <w:b w:val="0"/>
+                <w:sz w:val="17"/>
+              </w:rPr>
+            </w:r>
+          </w:p>
+        </w:tc>
+        <w:tc>
+          <w:tcPr>
+            <w:tcW w:type="dxa" w:w="1080"/>
+          </w:tcPr>
+          <w:p>
+            <w:pPr>
+              <w:jc w:val="center"/>
+            </w:pPr>
+            <w:r/>
+            <w:r>
+              <w:rPr>
+                <w:rFonts w:ascii="맑은 고딕" w:hAnsi="맑은 고딕" w:eastAsia="맑은 고딕"/>
+                <w:b w:val="0"/>
+                <w:sz w:val="17"/>
+              </w:rPr>
+              <w:t>●</w:t>
+            </w:r>
+          </w:p>
+        </w:tc>
+        <w:tc>
+          <w:tcPr>
+            <w:tcW w:type="dxa" w:w="1080"/>
+          </w:tcPr>
+          <w:p>
+            <w:pPr>
+              <w:jc w:val="center"/>
+            </w:pPr>
+            <w:r/>
+            <w:r>
+              <w:rPr>
+                <w:rFonts w:ascii="맑은 고딕" w:hAnsi="맑은 고딕" w:eastAsia="맑은 고딕"/>
+                <w:b w:val="0"/>
+                <w:sz w:val="17"/>
+              </w:rPr>
+              <w:t>●</w:t>
+            </w:r>
+          </w:p>
+        </w:tc>
+      </w:tr>
+      <w:tr>
+        <w:tc>
+          <w:tcPr>
+            <w:tcW w:type="dxa" w:w="1080"/>
+          </w:tcPr>
+          <w:p>
+            <w:pPr>
+              <w:jc w:val="left"/>
+            </w:pPr>
+            <w:r/>
+            <w:r>
+              <w:rPr>
+                <w:rFonts w:ascii="맑은 고딕" w:hAnsi="맑은 고딕" w:eastAsia="맑은 고딕"/>
+                <w:b w:val="0"/>
+                <w:sz w:val="17"/>
+              </w:rPr>
+              <w:t>H. 내셔널 나이트 아웃</w:t>
+            </w:r>
+          </w:p>
+        </w:tc>
+        <w:tc>
+          <w:tcPr>
+            <w:tcW w:type="dxa" w:w="1080"/>
+          </w:tcPr>
+          <w:p>
+            <w:pPr>
+              <w:jc w:val="center"/>
+            </w:pPr>
+            <w:r/>
+            <w:r>
+              <w:rPr>
+                <w:rFonts w:ascii="맑은 고딕" w:hAnsi="맑은 고딕" w:eastAsia="맑은 고딕"/>
+                <w:b w:val="0"/>
+                <w:sz w:val="17"/>
+              </w:rPr>
+            </w:r>
+          </w:p>
+        </w:tc>
+        <w:tc>
+          <w:tcPr>
+            <w:tcW w:type="dxa" w:w="1080"/>
+          </w:tcPr>
+          <w:p>
+            <w:pPr>
+              <w:jc w:val="center"/>
+            </w:pPr>
+            <w:r/>
+            <w:r>
+              <w:rPr>
+                <w:rFonts w:ascii="맑은 고딕" w:hAnsi="맑은 고딕" w:eastAsia="맑은 고딕"/>
+                <w:b w:val="0"/>
+                <w:sz w:val="17"/>
+              </w:rPr>
+            </w:r>
+          </w:p>
+        </w:tc>
+        <w:tc>
+          <w:tcPr>
+            <w:tcW w:type="dxa" w:w="1080"/>
+          </w:tcPr>
+          <w:p>
+            <w:pPr>
+              <w:jc w:val="center"/>
+            </w:pPr>
+            <w:r/>
+            <w:r>
+              <w:rPr>
+                <w:rFonts w:ascii="맑은 고딕" w:hAnsi="맑은 고딕" w:eastAsia="맑은 고딕"/>
+                <w:b w:val="0"/>
+                <w:sz w:val="17"/>
+              </w:rPr>
+            </w:r>
+          </w:p>
+        </w:tc>
+        <w:tc>
+          <w:tcPr>
+            <w:tcW w:type="dxa" w:w="1080"/>
+          </w:tcPr>
+          <w:p>
+            <w:pPr>
+              <w:jc w:val="center"/>
+            </w:pPr>
+            <w:r/>
+            <w:r>
+              <w:rPr>
+                <w:rFonts w:ascii="맑은 고딕" w:hAnsi="맑은 고딕" w:eastAsia="맑은 고딕"/>
+                <w:b w:val="0"/>
+                <w:sz w:val="17"/>
+              </w:rPr>
+              <w:t>●</w:t>
+            </w:r>
+          </w:p>
+        </w:tc>
+        <w:tc>
+          <w:tcPr>
+            <w:tcW w:type="dxa" w:w="1080"/>
+          </w:tcPr>
+          <w:p>
+            <w:pPr>
+              <w:jc w:val="center"/>
+            </w:pPr>
+            <w:r/>
+            <w:r>
+              <w:rPr>
+                <w:rFonts w:ascii="맑은 고딕" w:hAnsi="맑은 고딕" w:eastAsia="맑은 고딕"/>
+                <w:b w:val="0"/>
+                <w:sz w:val="17"/>
+              </w:rPr>
+            </w:r>
+          </w:p>
+        </w:tc>
+        <w:tc>
+          <w:tcPr>
+            <w:tcW w:type="dxa" w:w="1080"/>
+          </w:tcPr>
+          <w:p>
+            <w:pPr>
+              <w:jc w:val="center"/>
+            </w:pPr>
+            <w:r/>
+            <w:r>
+              <w:rPr>
+                <w:rFonts w:ascii="맑은 고딕" w:hAnsi="맑은 고딕" w:eastAsia="맑은 고딕"/>
+                <w:b w:val="0"/>
+                <w:sz w:val="17"/>
+              </w:rPr>
+              <w:t>○</w:t>
+            </w:r>
+          </w:p>
+        </w:tc>
+        <w:tc>
+          <w:tcPr>
+            <w:tcW w:type="dxa" w:w="1080"/>
+          </w:tcPr>
+          <w:p>
+            <w:pPr>
+              <w:jc w:val="center"/>
+            </w:pPr>
+            <w:r/>
+            <w:r>
+              <w:rPr>
+                <w:rFonts w:ascii="맑은 고딕" w:hAnsi="맑은 고딕" w:eastAsia="맑은 고딕"/>
+                <w:b w:val="0"/>
+                <w:sz w:val="17"/>
+              </w:rPr>
+              <w:t>●</w:t>
+            </w:r>
+          </w:p>
+        </w:tc>
+      </w:tr>
+    </w:tbl>
+    <w:p>
+      <w:pPr>
+        <w:spacing w:after="40" w:before="0" w:line="312" w:lineRule="auto"/>
+        <w:ind w:left="397"/>
+      </w:pPr>
+      <w:r>
+        <w:rPr>
+          <w:rFonts w:ascii="맑은 고딕" w:hAnsi="맑은 고딕" w:eastAsia="맑은 고딕"/>
+          <w:b w:val="0"/>
+          <w:sz w:val="22"/>
+        </w:rPr>
+        <w:t>○ 함의 — 경험형은 제도형이 약한 ①소통·화합·④신뢰·⑥포용에 특히 강점, 국민 체감형 통합의 핵심 수단</w:t>
+      </w:r>
+    </w:p>
+    <w:p>
+      <w:pPr>
+        <w:spacing w:before="160" w:after="80"/>
+      </w:pPr>
+      <w:r>
+        <w:rPr>
+          <w:rFonts w:ascii="맑은 고딕" w:hAnsi="맑은 고딕" w:eastAsia="맑은 고딕"/>
+          <w:b/>
+          <w:color w:val="2E2E2E"/>
+          <w:sz w:val="25"/>
+        </w:rPr>
+        <w:t>5. 정책 기획 아이디어 — '힙한 통합 경험' 설계(안)</w:t>
+      </w:r>
+    </w:p>
+    <w:p>
+      <w:pPr>
+        <w:spacing w:after="60" w:before="0" w:line="312" w:lineRule="auto"/>
+        <w:ind w:left="0"/>
+      </w:pPr>
+      <w:r>
+        <w:rPr>
+          <w:rFonts w:ascii="맑은 고딕" w:hAnsi="맑은 고딕" w:eastAsia="맑은 고딕"/>
+          <w:b/>
+          <w:sz w:val="23"/>
+        </w:rPr>
+        <w:t>□ 설계 원칙 3 — 위 사례의 공통 성공요소 도출</w:t>
+      </w:r>
+    </w:p>
+    <w:p>
+      <w:pPr>
+        <w:spacing w:after="40" w:before="0" w:line="312" w:lineRule="auto"/>
+        <w:ind w:left="397"/>
+      </w:pPr>
+      <w:r>
+        <w:rPr>
+          <w:rFonts w:ascii="맑은 고딕" w:hAnsi="맑은 고딕" w:eastAsia="맑은 고딕"/>
+          <w:b w:val="0"/>
+          <w:sz w:val="22"/>
+        </w:rPr>
+        <w:t>○ 개방성 — 남녀노소 누구나 조건 없이 참여(2002 응원·빅 런치)</w:t>
+      </w:r>
+    </w:p>
+    <w:p>
+      <w:pPr>
+        <w:spacing w:after="40" w:before="0" w:line="312" w:lineRule="auto"/>
+        <w:ind w:left="397"/>
+      </w:pPr>
+      <w:r>
+        <w:rPr>
+          <w:rFonts w:ascii="맑은 고딕" w:hAnsi="맑은 고딕" w:eastAsia="맑은 고딕"/>
+          <w:b w:val="0"/>
+          <w:sz w:val="22"/>
+        </w:rPr>
+        <w:t>○ 자발성 — 동원이 아닌 자발적 재미·의미 부여(금모으기·태안)</w:t>
+      </w:r>
+    </w:p>
+    <w:p>
+      <w:pPr>
+        <w:spacing w:after="40" w:before="0" w:line="312" w:lineRule="auto"/>
+        <w:ind w:left="397"/>
+      </w:pPr>
+      <w:r>
+        <w:rPr>
+          <w:rFonts w:ascii="맑은 고딕" w:hAnsi="맑은 고딕" w:eastAsia="맑은 고딕"/>
+          <w:b w:val="0"/>
+          <w:sz w:val="22"/>
+        </w:rPr>
+        <w:t>○ 반복성 — 일회성 아닌 정기 반복으로 관계망 축적(프로야구·이웃의 날)</w:t>
+      </w:r>
+    </w:p>
+    <w:p>
+      <w:pPr>
+        <w:spacing w:after="60" w:before="0" w:line="312" w:lineRule="auto"/>
+        <w:ind w:left="0"/>
+      </w:pPr>
+      <w:r>
+        <w:rPr>
+          <w:rFonts w:ascii="맑은 고딕" w:hAnsi="맑은 고딕" w:eastAsia="맑은 고딕"/>
+          <w:b/>
+          <w:sz w:val="23"/>
+        </w:rPr>
+        <w:t>□ 기획(안) 예시 — 이웃 단위 경험 공유 프로그램</w:t>
+      </w:r>
+    </w:p>
+    <w:p>
+      <w:pPr>
+        <w:spacing w:after="40" w:before="0" w:line="312" w:lineRule="auto"/>
+        <w:ind w:left="397"/>
+      </w:pPr>
+      <w:r>
+        <w:rPr>
+          <w:rFonts w:ascii="맑은 고딕" w:hAnsi="맑은 고딕" w:eastAsia="맑은 고딕"/>
+          <w:b w:val="0"/>
+          <w:sz w:val="22"/>
+        </w:rPr>
+        <w:t>○ '동네 큰 밥상(K-Big Lunch)' — 통·반·아파트 단위 연례 이웃 공동식사, 지자체 소액지원 → ④신뢰 ⑥포용</w:t>
+      </w:r>
+    </w:p>
+    <w:p>
+      <w:pPr>
+        <w:spacing w:after="40" w:before="0" w:line="312" w:lineRule="auto"/>
+        <w:ind w:left="397"/>
+      </w:pPr>
+      <w:r>
+        <w:rPr>
+          <w:rFonts w:ascii="맑은 고딕" w:hAnsi="맑은 고딕" w:eastAsia="맑은 고딕"/>
+          <w:b w:val="0"/>
+          <w:sz w:val="22"/>
+        </w:rPr>
+        <w:t>○ '함께 넘은 우리 동네' 릴레이 — 지역 봉사·환경정화를 축제형으로 정례화(태안 모델 일상화) → ⑦상생·연대</w:t>
+      </w:r>
+    </w:p>
+    <w:p>
+      <w:pPr>
+        <w:spacing w:after="40" w:before="0" w:line="312" w:lineRule="auto"/>
+        <w:ind w:left="397"/>
+      </w:pPr>
+      <w:r>
+        <w:rPr>
+          <w:rFonts w:ascii="맑은 고딕" w:hAnsi="맑은 고딕" w:eastAsia="맑은 고딕"/>
+          <w:b w:val="0"/>
+          <w:sz w:val="22"/>
+        </w:rPr>
+        <w:t>○ '세대잇기 응원단' — 프로야구·지역행사에 청년·어르신 혼합 응원단 운영 → ①소통·화합 ⑤기회균등</w:t>
+      </w:r>
+    </w:p>
+    <w:p>
+      <w:pPr>
+        <w:spacing w:after="40" w:before="0" w:line="312" w:lineRule="auto"/>
+        <w:ind w:left="397"/>
+      </w:pPr>
+      <w:r>
+        <w:rPr>
+          <w:rFonts w:ascii="맑은 고딕" w:hAnsi="맑은 고딕" w:eastAsia="맑은 고딕"/>
+          <w:b w:val="0"/>
+          <w:sz w:val="22"/>
+        </w:rPr>
+        <w:t>○ '이웃의 날' 한국판 — 5월 특정일 전국 이웃 만남의 날 지정, 아파트·마을 동시 개최 → ④신뢰 ⑦상생·연대</w:t>
+      </w:r>
+    </w:p>
+    <w:p>
+      <w:pPr>
+        <w:spacing w:after="40" w:before="0" w:line="312" w:lineRule="auto"/>
+        <w:ind w:left="1247"/>
+      </w:pPr>
+      <w:r>
+        <w:rPr>
+          <w:rFonts w:ascii="맑은 고딕" w:hAnsi="맑은 고딕" w:eastAsia="맑은 고딕"/>
+          <w:b w:val="0"/>
+          <w:sz w:val="21"/>
+        </w:rPr>
+        <w:t>· 공통 설계: 상향식 기획 존중 + 지자체·국민통합위는 '판'만 지원(과도한 관 주도 지양)</w:t>
+      </w:r>
+    </w:p>
+    <w:p>
+      <w:pPr>
+        <w:spacing w:before="280" w:after="120"/>
+        <w:pBdr>
+          <w:bottom w:val="single" w:sz="12" w:space="2" w:color="1F4E79"/>
+        </w:pBdr>
+      </w:pPr>
+      <w:r>
+        <w:rPr>
+          <w:rFonts w:ascii="맑은 고딕" w:hAnsi="맑은 고딕" w:eastAsia="맑은 고딕"/>
+          <w:b/>
+          <w:color w:val="1F4E79"/>
+          <w:sz w:val="30"/>
+        </w:rPr>
+        <w:t>Ⅴ. 종합 시사점 및 정책 제언</w:t>
       </w:r>
     </w:p>
     <w:p>
@@ -2679,6 +4994,48 @@
     </w:p>
     <w:p>
       <w:pPr>
+        <w:spacing w:after="60" w:before="0" w:line="312" w:lineRule="auto"/>
+        <w:ind w:left="0"/>
+      </w:pPr>
+      <w:r>
+        <w:rPr>
+          <w:rFonts w:ascii="맑은 고딕" w:hAnsi="맑은 고딕" w:eastAsia="맑은 고딕"/>
+          <w:b/>
+          <w:sz w:val="23"/>
+        </w:rPr>
+        <w:t>□ 제언 7. 국민 체감형 '경험 공유' 통합 병행 — 제도형+경험형 이원 추진</w:t>
+      </w:r>
+    </w:p>
+    <w:p>
+      <w:pPr>
+        <w:spacing w:after="40" w:before="0" w:line="312" w:lineRule="auto"/>
+        <w:ind w:left="397"/>
+      </w:pPr>
+      <w:r>
+        <w:rPr>
+          <w:rFonts w:ascii="맑은 고딕" w:hAnsi="맑은 고딕" w:eastAsia="맑은 고딕"/>
+          <w:b w:val="0"/>
+          <w:sz w:val="22"/>
+        </w:rPr>
+        <w:t>○ 제도(Ⅲ장)만으로 한계, 이웃 단위 경험 공유 프로그램(Ⅳ장)으로 국민 체감 통합 보완</w:t>
+      </w:r>
+    </w:p>
+    <w:p>
+      <w:pPr>
+        <w:spacing w:after="40" w:before="0" w:line="312" w:lineRule="auto"/>
+        <w:ind w:left="1247"/>
+      </w:pPr>
+      <w:r>
+        <w:rPr>
+          <w:rFonts w:ascii="맑은 고딕" w:hAnsi="맑은 고딕" w:eastAsia="맑은 고딕"/>
+          <w:b w:val="0"/>
+          <w:sz w:val="21"/>
+        </w:rPr>
+        <w:t>· '동네 큰 밥상'·한국판 '이웃의 날' 등 개방·자발·반복형 경험 설계, 관은 '판'만 지원</w:t>
+      </w:r>
+    </w:p>
+    <w:p>
+      <w:pPr>
         <w:spacing w:before="280" w:after="120"/>
         <w:pBdr>
           <w:bottom w:val="single" w:sz="12" w:space="2" w:color="1F4E79"/>
@@ -2691,7 +5048,7 @@
           <w:color w:val="1F4E79"/>
           <w:sz w:val="30"/>
         </w:rPr>
-        <w:t>Ⅴ. 결론</w:t>
+        <w:t>Ⅵ. 결론</w:t>
       </w:r>
     </w:p>
     <w:p>
@@ -2733,7 +5090,7 @@
           <w:b/>
           <w:sz w:val="23"/>
         </w:rPr>
-        <w:t>□ 국내외 9개 사례는 진실규명·재분배·다양성의 3대 통합 경로를 제시</w:t>
+        <w:t>□ 통합 경로는 두 갈래 — 제도형(하향식) 9개 사례(진실규명·재분배·다양성)와 경험형(상향식) 8개 사례(위기극복·축제·이웃공유)</w:t>
       </w:r>
     </w:p>
     <w:p>
@@ -2747,7 +5104,7 @@
           <w:b/>
           <w:sz w:val="23"/>
         </w:rPr>
-        <w:t>□ 상설 통합기구 이행력 강화, 연대형 재원, 공정 절차, 다원사회 제도, 기회균등 정책, 장기 설계를 핵심 과제로 제언</w:t>
+        <w:t>□ 특히 경험형은 이웃 간 '함께 참여·느낌·극복·대면·어울림'을 통해 소통·화합·신뢰·포용을 국민이 직접 체감케 하는 핵심 수단</w:t>
       </w:r>
     </w:p>
     <w:p>
@@ -2761,7 +5118,7 @@
           <w:b/>
           <w:sz w:val="23"/>
         </w:rPr>
-        <w:t>□ 진단-사례-제언의 연계를 통해 실행 가능한 국민통합 정책기반 마련 필요</w:t>
+        <w:t>□ 제도형 과제(기구 이행력·연대재원·공정절차·다원제도·기회균등·장기설계)에 경험형 '이웃 공유 기획'을 병행하여 실행 가능한 국민통합 기반 마련 필요</w:t>
       </w:r>
     </w:p>
     <w:p>

</xml_diff>

<commit_message>
Enrich domestic experiential cases (4->9)
국내 경험형 사례 대폭 보강: 전통 상호부조(두레·품앗이·계·향약), 아나바다
운동(1998), 대구 담장 허물기(1996~), 강릉단오제 지역축제, 코로나19 시민연대
(2020) 추가. 경험형 사례 총 13개(국내 9·국외 4)로 매트릭스 재구성, 결론 갱신.

Co-Authored-By: Claude Opus 4.8 <noreply@anthropic.com>
Claude-Session: https://claude.ai/code/session_01FvjRmPktyGoCyeGhQJijKL
</commit_message>
<xml_diff>
--- a/reports/국민통합_정책보고서.docx
+++ b/reports/국민통합_정책보고서.docx
@@ -2604,7 +2604,7 @@
           <w:b/>
           <w:sz w:val="23"/>
         </w:rPr>
-        <w:t>□ 사례 A. 금모으기 운동(1998) — 위기극복 공동경험</w:t>
+        <w:t>□ 사례 A. 전통 상호부조(두레·품앗이·계·향약) — 이웃 공유의 역사적 원형</w:t>
       </w:r>
     </w:p>
     <w:p>
@@ -2618,7 +2618,63 @@
           <w:b w:val="0"/>
           <w:sz w:val="22"/>
         </w:rPr>
-        <w:t>○ 선정 사유: IMF 외환위기라는 국가위기에 국민 351만명이 자발적으로 금 227톤을 모아 공동운명체 의식을 실증한 상향식 통합의 원형</w:t>
+        <w:t>○ 선정 사유: 마을 단위 공동노동·상호부조가 한국 이웃 공동체의 DNA, '함께 일하고 나누는' 경험형 통합의 자생적 원형으로 선정</w:t>
+      </w:r>
+    </w:p>
+    <w:p>
+      <w:pPr>
+        <w:spacing w:after="40" w:before="0" w:line="312" w:lineRule="auto"/>
+        <w:ind w:left="397"/>
+      </w:pPr>
+      <w:r>
+        <w:rPr>
+          <w:rFonts w:ascii="맑은 고딕" w:hAnsi="맑은 고딕" w:eastAsia="맑은 고딕"/>
+          <w:b w:val="0"/>
+          <w:sz w:val="22"/>
+        </w:rPr>
+        <w:t>○ 개요·특징: 두레(공동노동), 품앗이(노동교환), 계(경제적 상호부조), 향약(향촌 자치규약)으로 상부상조·환난상휼(患難相恤) 실천(우리역사넷)</w:t>
+      </w:r>
+    </w:p>
+    <w:p>
+      <w:pPr>
+        <w:spacing w:after="40" w:before="0" w:line="312" w:lineRule="auto"/>
+        <w:ind w:left="397"/>
+      </w:pPr>
+      <w:r>
+        <w:rPr>
+          <w:rFonts w:ascii="맑은 고딕" w:hAnsi="맑은 고딕" w:eastAsia="맑은 고딕"/>
+          <w:b w:val="0"/>
+          <w:sz w:val="22"/>
+        </w:rPr>
+        <w:t>○ 통합 효과 → ⑦상생·연대 ④신뢰 : '어려울 때 서로 돕는' 반복 경험이 마을 신뢰·연대의 기층 형성, 현대 마을공동체의 뿌리</w:t>
+      </w:r>
+    </w:p>
+    <w:p>
+      <w:pPr>
+        <w:spacing w:after="60" w:before="0" w:line="312" w:lineRule="auto"/>
+        <w:ind w:left="0"/>
+      </w:pPr>
+      <w:r>
+        <w:rPr>
+          <w:rFonts w:ascii="맑은 고딕" w:hAnsi="맑은 고딕" w:eastAsia="맑은 고딕"/>
+          <w:b/>
+          <w:sz w:val="23"/>
+        </w:rPr>
+        <w:t>□ 사례 B. 금모으기 운동(1998) — 위기극복 공동경험</w:t>
+      </w:r>
+    </w:p>
+    <w:p>
+      <w:pPr>
+        <w:spacing w:after="40" w:before="0" w:line="312" w:lineRule="auto"/>
+        <w:ind w:left="397"/>
+      </w:pPr>
+      <w:r>
+        <w:rPr>
+          <w:rFonts w:ascii="맑은 고딕" w:hAnsi="맑은 고딕" w:eastAsia="맑은 고딕"/>
+          <w:b w:val="0"/>
+          <w:sz w:val="22"/>
+        </w:rPr>
+        <w:t>○ 선정 사유: IMF 외환위기라는 국가위기에 국민 351만명이 자발적으로 금 227톤을 모아 공동운명체 의식을 실증한 상향식 통합의 대표</w:t>
       </w:r>
     </w:p>
     <w:p>
@@ -2660,7 +2716,63 @@
           <w:b/>
           <w:sz w:val="23"/>
         </w:rPr>
-        <w:t>□ 사례 B. 2002 월드컵 거리응원 — 세대·계층 초월 집합적 열광</w:t>
+        <w:t>□ 사례 C. 아나바다 운동(1998) — 나눔·순환 생활문화</w:t>
+      </w:r>
+    </w:p>
+    <w:p>
+      <w:pPr>
+        <w:spacing w:after="40" w:before="0" w:line="312" w:lineRule="auto"/>
+        <w:ind w:left="397"/>
+      </w:pPr>
+      <w:r>
+        <w:rPr>
+          <w:rFonts w:ascii="맑은 고딕" w:hAnsi="맑은 고딕" w:eastAsia="맑은 고딕"/>
+          <w:b w:val="0"/>
+          <w:sz w:val="22"/>
+        </w:rPr>
+        <w:t>○ 선정 사유: IMF기 YWCA 주도로 시작된 '아껴·나눠·바꿔·다시 쓰기' 생활운동, 절약을 넘어 이웃 나눔·공동체 의식으로 확장된 자원순환형 통합</w:t>
+      </w:r>
+    </w:p>
+    <w:p>
+      <w:pPr>
+        <w:spacing w:after="40" w:before="0" w:line="312" w:lineRule="auto"/>
+        <w:ind w:left="397"/>
+      </w:pPr>
+      <w:r>
+        <w:rPr>
+          <w:rFonts w:ascii="맑은 고딕" w:hAnsi="맑은 고딕" w:eastAsia="맑은 고딕"/>
+          <w:b w:val="0"/>
+          <w:sz w:val="22"/>
+        </w:rPr>
+        <w:t>○ 개요·특징: 벼룩시장·물품교환 등 이웃 단위 나눔장터로 정착, 오늘날 제로웨이스트·중고거래 문화로 계승</w:t>
+      </w:r>
+    </w:p>
+    <w:p>
+      <w:pPr>
+        <w:spacing w:after="40" w:before="0" w:line="312" w:lineRule="auto"/>
+        <w:ind w:left="397"/>
+      </w:pPr>
+      <w:r>
+        <w:rPr>
+          <w:rFonts w:ascii="맑은 고딕" w:hAnsi="맑은 고딕" w:eastAsia="맑은 고딕"/>
+          <w:b w:val="0"/>
+          <w:sz w:val="22"/>
+        </w:rPr>
+        <w:t>○ 통합 효과 → ⑦상생·연대 ②격차완화 ⑥포용 : '물건을 나누는 경험'이 이웃 간 접촉·나눔 관계망 형성</w:t>
+      </w:r>
+    </w:p>
+    <w:p>
+      <w:pPr>
+        <w:spacing w:after="60" w:before="0" w:line="312" w:lineRule="auto"/>
+        <w:ind w:left="0"/>
+      </w:pPr>
+      <w:r>
+        <w:rPr>
+          <w:rFonts w:ascii="맑은 고딕" w:hAnsi="맑은 고딕" w:eastAsia="맑은 고딕"/>
+          <w:b/>
+          <w:sz w:val="23"/>
+        </w:rPr>
+        <w:t>□ 사례 D. 2002 월드컵 거리응원 — 세대·계층 초월 집합적 열광</w:t>
       </w:r>
     </w:p>
     <w:p>
@@ -2716,7 +2828,7 @@
           <w:b/>
           <w:sz w:val="23"/>
         </w:rPr>
-        <w:t>□ 사례 C. 태안 기름유출 방제 자원봉사(2007) — 공동체 회복 경험</w:t>
+        <w:t>□ 사례 E. 태안 기름유출 방제 자원봉사(2007) — 재난극복 공동체 경험</w:t>
       </w:r>
     </w:p>
     <w:p>
@@ -2772,7 +2884,7 @@
           <w:b/>
           <w:sz w:val="23"/>
         </w:rPr>
-        <w:t>□ 사례 D. 프로야구 지역연고 응원문화 — 일상적·반복적 공유의례</w:t>
+        <w:t>□ 사례 F. 대구 담장 허물기 운동(1996~) — 이웃과 '공간'을 공유</w:t>
       </w:r>
     </w:p>
     <w:p>
@@ -2786,7 +2898,119 @@
           <w:b w:val="0"/>
           <w:sz w:val="22"/>
         </w:rPr>
-        <w:t>○ 선정 사유: 지역 정체성을 매개로 매주 반복되는 응원 의례가 세대를 잇는 생활밀착형 통합 경험, 특별 이벤트가 아닌 '일상 반복' 모델로 선정</w:t>
+        <w:t>○ 선정 사유: 집 담장을 허물어 이웃과 마당·골목을 공유한 생활공간 개방 운동, '이웃과 공간 공유'라는 본 과제에 직접 부합하여 선정</w:t>
+      </w:r>
+    </w:p>
+    <w:p>
+      <w:pPr>
+        <w:spacing w:after="40" w:before="0" w:line="312" w:lineRule="auto"/>
+        <w:ind w:left="397"/>
+      </w:pPr>
+      <w:r>
+        <w:rPr>
+          <w:rFonts w:ascii="맑은 고딕" w:hAnsi="맑은 고딕" w:eastAsia="맑은 고딕"/>
+          <w:b w:val="0"/>
+          <w:sz w:val="22"/>
+        </w:rPr>
+        <w:t>○ 개요·성과: 1996년 시작, 10년간 362곳 참여·담장 17km 철거·가로공원 7.8만평 조성, 전국 1,000여곳 벤치마킹(매일신문)</w:t>
+      </w:r>
+    </w:p>
+    <w:p>
+      <w:pPr>
+        <w:spacing w:after="40" w:before="0" w:line="312" w:lineRule="auto"/>
+        <w:ind w:left="397"/>
+      </w:pPr>
+      <w:r>
+        <w:rPr>
+          <w:rFonts w:ascii="맑은 고딕" w:hAnsi="맑은 고딕" w:eastAsia="맑은 고딕"/>
+          <w:b w:val="0"/>
+          <w:sz w:val="22"/>
+        </w:rPr>
+        <w:t>○ 통합 효과 → ④신뢰 ⑦상생·연대 ⑥포용 : 물리적 경계를 허무는 경험이 이웃 간 대화·신뢰 회복으로 연결</w:t>
+      </w:r>
+    </w:p>
+    <w:p>
+      <w:pPr>
+        <w:spacing w:after="60" w:before="0" w:line="312" w:lineRule="auto"/>
+        <w:ind w:left="0"/>
+      </w:pPr>
+      <w:r>
+        <w:rPr>
+          <w:rFonts w:ascii="맑은 고딕" w:hAnsi="맑은 고딕" w:eastAsia="맑은 고딕"/>
+          <w:b/>
+          <w:sz w:val="23"/>
+        </w:rPr>
+        <w:t>□ 사례 G. 강릉단오제 등 지역 공동체 축제 — 민관 공동 참여 축제</w:t>
+      </w:r>
+    </w:p>
+    <w:p>
+      <w:pPr>
+        <w:spacing w:after="40" w:before="0" w:line="312" w:lineRule="auto"/>
+        <w:ind w:left="397"/>
+      </w:pPr>
+      <w:r>
+        <w:rPr>
+          <w:rFonts w:ascii="맑은 고딕" w:hAnsi="맑은 고딕" w:eastAsia="맑은 고딕"/>
+          <w:b w:val="0"/>
+          <w:sz w:val="22"/>
+        </w:rPr>
+        <w:t>○ 선정 사유: 주민이 주체가 되어 관이 협조하는 '민관 공동 축제'로, 지역 정체성과 세대 결속을 잇는 참여형 통합 경험으로 선정</w:t>
+      </w:r>
+    </w:p>
+    <w:p>
+      <w:pPr>
+        <w:spacing w:after="40" w:before="0" w:line="312" w:lineRule="auto"/>
+        <w:ind w:left="397"/>
+      </w:pPr>
+      <w:r>
+        <w:rPr>
+          <w:rFonts w:ascii="맑은 고딕" w:hAnsi="맑은 고딕" w:eastAsia="맑은 고딕"/>
+          <w:b w:val="0"/>
+          <w:sz w:val="22"/>
+        </w:rPr>
+        <w:t>○ 개요·성과: 유네스코 인류무형문화유산(2005 선정), 신주미봉정·단오등 등 시민참여 71개 프로그램, 연 50만명 참여(국가유산청)</w:t>
+      </w:r>
+    </w:p>
+    <w:p>
+      <w:pPr>
+        <w:spacing w:after="40" w:before="0" w:line="312" w:lineRule="auto"/>
+        <w:ind w:left="397"/>
+      </w:pPr>
+      <w:r>
+        <w:rPr>
+          <w:rFonts w:ascii="맑은 고딕" w:hAnsi="맑은 고딕" w:eastAsia="맑은 고딕"/>
+          <w:b w:val="0"/>
+          <w:sz w:val="22"/>
+        </w:rPr>
+        <w:t>○ 통합 효과 → ①소통·화합 ⑦상생·연대 ⑥포용 : 세대·주민이 함께 준비·향유하는 축제 경험이 지역공동체 결속 강화</w:t>
+      </w:r>
+    </w:p>
+    <w:p>
+      <w:pPr>
+        <w:spacing w:after="60" w:before="0" w:line="312" w:lineRule="auto"/>
+        <w:ind w:left="0"/>
+      </w:pPr>
+      <w:r>
+        <w:rPr>
+          <w:rFonts w:ascii="맑은 고딕" w:hAnsi="맑은 고딕" w:eastAsia="맑은 고딕"/>
+          <w:b/>
+          <w:sz w:val="23"/>
+        </w:rPr>
+        <w:t>□ 사례 H. 프로야구 지역연고 응원문화 — 일상적·반복적 공유의례</w:t>
+      </w:r>
+    </w:p>
+    <w:p>
+      <w:pPr>
+        <w:spacing w:after="40" w:before="0" w:line="312" w:lineRule="auto"/>
+        <w:ind w:left="397"/>
+      </w:pPr>
+      <w:r>
+        <w:rPr>
+          <w:rFonts w:ascii="맑은 고딕" w:hAnsi="맑은 고딕" w:eastAsia="맑은 고딕"/>
+          <w:b w:val="0"/>
+          <w:sz w:val="22"/>
+        </w:rPr>
+        <w:t>○ 선정 사유: 지역 정체성을 매개로 매주 반복되는 응원 의례가 세대를 잇는 생활밀착형 통합 경험, '일상 반복' 모델로 선정</w:t>
       </w:r>
     </w:p>
     <w:p>
@@ -2819,6 +3043,62 @@
     </w:p>
     <w:p>
       <w:pPr>
+        <w:spacing w:after="60" w:before="0" w:line="312" w:lineRule="auto"/>
+        <w:ind w:left="0"/>
+      </w:pPr>
+      <w:r>
+        <w:rPr>
+          <w:rFonts w:ascii="맑은 고딕" w:hAnsi="맑은 고딕" w:eastAsia="맑은 고딕"/>
+          <w:b/>
+          <w:sz w:val="23"/>
+        </w:rPr>
+        <w:t>□ 사례 I. 코로나19 시민연대(2020) — 위기 대응 생활밀착 연대</w:t>
+      </w:r>
+    </w:p>
+    <w:p>
+      <w:pPr>
+        <w:spacing w:after="40" w:before="0" w:line="312" w:lineRule="auto"/>
+        <w:ind w:left="397"/>
+      </w:pPr>
+      <w:r>
+        <w:rPr>
+          <w:rFonts w:ascii="맑은 고딕" w:hAnsi="맑은 고딕" w:eastAsia="맑은 고딕"/>
+          <w:b w:val="0"/>
+          <w:sz w:val="22"/>
+        </w:rPr>
+        <w:t>○ 선정 사유: 재난 위기에 의료진 자원·나눔·상생이 자발적으로 결집, 'K-방역'의 사회적 기반이 된 최근 시민연대 경험으로 선정</w:t>
+      </w:r>
+    </w:p>
+    <w:p>
+      <w:pPr>
+        <w:spacing w:after="40" w:before="0" w:line="312" w:lineRule="auto"/>
+        <w:ind w:left="397"/>
+      </w:pPr>
+      <w:r>
+        <w:rPr>
+          <w:rFonts w:ascii="맑은 고딕" w:hAnsi="맑은 고딕" w:eastAsia="맑은 고딕"/>
+          <w:b w:val="0"/>
+          <w:sz w:val="22"/>
+        </w:rPr>
+        <w:t>○ 개요·성과: 대구 지원 의료 자원봉사 853명 이상, '덕분에 챌린지'(SNS 응원), '착한 임대인 운동'(전주 한옥마을 시작→전국 확산)(정책브리핑 등)</w:t>
+      </w:r>
+    </w:p>
+    <w:p>
+      <w:pPr>
+        <w:spacing w:after="40" w:before="0" w:line="312" w:lineRule="auto"/>
+        <w:ind w:left="397"/>
+      </w:pPr>
+      <w:r>
+        <w:rPr>
+          <w:rFonts w:ascii="맑은 고딕" w:hAnsi="맑은 고딕" w:eastAsia="맑은 고딕"/>
+          <w:b w:val="0"/>
+          <w:sz w:val="22"/>
+        </w:rPr>
+        <w:t>○ 통합 효과 → ⑦상생·연대 ④신뢰 ⑥포용 : 위기 시 '함께 견디는' 경험이 직업·지역 넘는 상생 연대 형성</w:t>
+      </w:r>
+    </w:p>
+    <w:p>
+      <w:pPr>
         <w:spacing w:after="40" w:before="0" w:line="312" w:lineRule="auto"/>
         <w:ind w:left="1247"/>
       </w:pPr>
@@ -2828,7 +3108,7 @@
           <w:b w:val="0"/>
           <w:sz w:val="21"/>
         </w:rPr>
-        <w:t>· (추가 참고) 코로나19 시민연대(대구 의료진 지원·마스크 나눔, 2020), 김장·연탄 나눔, 헌혈 릴레이 등도 이웃 단위 나눔 경험형 통합 자원</w:t>
+        <w:t>· (추가 참고) 2018 평창올림픽 남북 공동입장·단일팀(스포츠 통한 평화 경험, 단 선수 형평성 논란 병존), 김장·연탄 나눔, 사랑의 온도탑(연말 나눔), 러닝크루·생활체육 동호회 등 현대 이웃 커뮤니티도 경험형 통합 자원</w:t>
       </w:r>
     </w:p>
     <w:p>
@@ -2856,7 +3136,7 @@
           <w:b/>
           <w:sz w:val="23"/>
         </w:rPr>
-        <w:t>□ 사례 E. 남아공 1995 럭비월드컵(만델라) — 스포츠를 통한 화해</w:t>
+        <w:t>□ 사례 J. 남아공 1995 럭비월드컵(만델라) — 스포츠를 통한 화해</w:t>
       </w:r>
     </w:p>
     <w:p>
@@ -2912,7 +3192,7 @@
           <w:b/>
           <w:sz w:val="23"/>
         </w:rPr>
-        <w:t>□ 사례 F. 영국 '빅 런치(The Big Lunch)' — 이웃 공동식사 축제</w:t>
+        <w:t>□ 사례 K. 영국 '빅 런치(The Big Lunch)' — 이웃 공동식사 축제</w:t>
       </w:r>
     </w:p>
     <w:p>
@@ -2968,7 +3248,7 @@
           <w:b/>
           <w:sz w:val="23"/>
         </w:rPr>
-        <w:t>□ 사례 G. 프랑스발 '이웃의 날(Fête des Voisins / European Neighbours' Day)' — 이웃 관계망 축제</w:t>
+        <w:t>□ 사례 L. 프랑스발 '이웃의 날(Fête des Voisins / European Neighbours' Day)' — 이웃 관계망 축제</w:t>
       </w:r>
     </w:p>
     <w:p>
@@ -3024,7 +3304,7 @@
           <w:b/>
           <w:sz w:val="23"/>
         </w:rPr>
-        <w:t>□ 사례 H. 미국 '내셔널 나이트 아웃(National Night Out)' — 이웃 방범 커뮤니티 축제</w:t>
+        <w:t>□ 사례 M. 미국 '내셔널 나이트 아웃(National Night Out)' — 이웃 방범 커뮤니티 축제</w:t>
       </w:r>
     </w:p>
     <w:p>
@@ -3228,7 +3508,7 @@
                 <w:b/>
                 <w:sz w:val="17"/>
               </w:rPr>
-              <w:t>경험형 사례</w:t>
+              <w:t>경험형 사례(국내 A~I·국외 J~M)</w:t>
             </w:r>
           </w:p>
         </w:tc>
@@ -3382,7 +3662,158 @@
                 <w:b w:val="0"/>
                 <w:sz w:val="17"/>
               </w:rPr>
-              <w:t>A. 금모으기(1998)</w:t>
+              <w:t>A. 전통 상호부조(두레·품앗이)</w:t>
+            </w:r>
+          </w:p>
+        </w:tc>
+        <w:tc>
+          <w:tcPr>
+            <w:tcW w:type="dxa" w:w="1080"/>
+          </w:tcPr>
+          <w:p>
+            <w:pPr>
+              <w:jc w:val="center"/>
+            </w:pPr>
+            <w:r/>
+            <w:r>
+              <w:rPr>
+                <w:rFonts w:ascii="맑은 고딕" w:hAnsi="맑은 고딕" w:eastAsia="맑은 고딕"/>
+                <w:b w:val="0"/>
+                <w:sz w:val="17"/>
+              </w:rPr>
+            </w:r>
+          </w:p>
+        </w:tc>
+        <w:tc>
+          <w:tcPr>
+            <w:tcW w:type="dxa" w:w="1080"/>
+          </w:tcPr>
+          <w:p>
+            <w:pPr>
+              <w:jc w:val="center"/>
+            </w:pPr>
+            <w:r/>
+            <w:r>
+              <w:rPr>
+                <w:rFonts w:ascii="맑은 고딕" w:hAnsi="맑은 고딕" w:eastAsia="맑은 고딕"/>
+                <w:b w:val="0"/>
+                <w:sz w:val="17"/>
+              </w:rPr>
+              <w:t>○</w:t>
+            </w:r>
+          </w:p>
+        </w:tc>
+        <w:tc>
+          <w:tcPr>
+            <w:tcW w:type="dxa" w:w="1080"/>
+          </w:tcPr>
+          <w:p>
+            <w:pPr>
+              <w:jc w:val="center"/>
+            </w:pPr>
+            <w:r/>
+            <w:r>
+              <w:rPr>
+                <w:rFonts w:ascii="맑은 고딕" w:hAnsi="맑은 고딕" w:eastAsia="맑은 고딕"/>
+                <w:b w:val="0"/>
+                <w:sz w:val="17"/>
+              </w:rPr>
+            </w:r>
+          </w:p>
+        </w:tc>
+        <w:tc>
+          <w:tcPr>
+            <w:tcW w:type="dxa" w:w="1080"/>
+          </w:tcPr>
+          <w:p>
+            <w:pPr>
+              <w:jc w:val="center"/>
+            </w:pPr>
+            <w:r/>
+            <w:r>
+              <w:rPr>
+                <w:rFonts w:ascii="맑은 고딕" w:hAnsi="맑은 고딕" w:eastAsia="맑은 고딕"/>
+                <w:b w:val="0"/>
+                <w:sz w:val="17"/>
+              </w:rPr>
+              <w:t>●</w:t>
+            </w:r>
+          </w:p>
+        </w:tc>
+        <w:tc>
+          <w:tcPr>
+            <w:tcW w:type="dxa" w:w="1080"/>
+          </w:tcPr>
+          <w:p>
+            <w:pPr>
+              <w:jc w:val="center"/>
+            </w:pPr>
+            <w:r/>
+            <w:r>
+              <w:rPr>
+                <w:rFonts w:ascii="맑은 고딕" w:hAnsi="맑은 고딕" w:eastAsia="맑은 고딕"/>
+                <w:b w:val="0"/>
+                <w:sz w:val="17"/>
+              </w:rPr>
+            </w:r>
+          </w:p>
+        </w:tc>
+        <w:tc>
+          <w:tcPr>
+            <w:tcW w:type="dxa" w:w="1080"/>
+          </w:tcPr>
+          <w:p>
+            <w:pPr>
+              <w:jc w:val="center"/>
+            </w:pPr>
+            <w:r/>
+            <w:r>
+              <w:rPr>
+                <w:rFonts w:ascii="맑은 고딕" w:hAnsi="맑은 고딕" w:eastAsia="맑은 고딕"/>
+                <w:b w:val="0"/>
+                <w:sz w:val="17"/>
+              </w:rPr>
+              <w:t>○</w:t>
+            </w:r>
+          </w:p>
+        </w:tc>
+        <w:tc>
+          <w:tcPr>
+            <w:tcW w:type="dxa" w:w="1080"/>
+          </w:tcPr>
+          <w:p>
+            <w:pPr>
+              <w:jc w:val="center"/>
+            </w:pPr>
+            <w:r/>
+            <w:r>
+              <w:rPr>
+                <w:rFonts w:ascii="맑은 고딕" w:hAnsi="맑은 고딕" w:eastAsia="맑은 고딕"/>
+                <w:b w:val="0"/>
+                <w:sz w:val="17"/>
+              </w:rPr>
+              <w:t>●</w:t>
+            </w:r>
+          </w:p>
+        </w:tc>
+      </w:tr>
+      <w:tr>
+        <w:tc>
+          <w:tcPr>
+            <w:tcW w:type="dxa" w:w="1080"/>
+          </w:tcPr>
+          <w:p>
+            <w:pPr>
+              <w:jc w:val="left"/>
+            </w:pPr>
+            <w:r/>
+            <w:r>
+              <w:rPr>
+                <w:rFonts w:ascii="맑은 고딕" w:hAnsi="맑은 고딕" w:eastAsia="맑은 고딕"/>
+                <w:b w:val="0"/>
+                <w:sz w:val="17"/>
+              </w:rPr>
+              <w:t>B. 금모으기(1998)</w:t>
             </w:r>
           </w:p>
         </w:tc>
@@ -3532,7 +3963,158 @@
                 <w:b w:val="0"/>
                 <w:sz w:val="17"/>
               </w:rPr>
-              <w:t>B. 2002 거리응원</w:t>
+              <w:t>C. 아나바다(1998)</w:t>
+            </w:r>
+          </w:p>
+        </w:tc>
+        <w:tc>
+          <w:tcPr>
+            <w:tcW w:type="dxa" w:w="1080"/>
+          </w:tcPr>
+          <w:p>
+            <w:pPr>
+              <w:jc w:val="center"/>
+            </w:pPr>
+            <w:r/>
+            <w:r>
+              <w:rPr>
+                <w:rFonts w:ascii="맑은 고딕" w:hAnsi="맑은 고딕" w:eastAsia="맑은 고딕"/>
+                <w:b w:val="0"/>
+                <w:sz w:val="17"/>
+              </w:rPr>
+            </w:r>
+          </w:p>
+        </w:tc>
+        <w:tc>
+          <w:tcPr>
+            <w:tcW w:type="dxa" w:w="1080"/>
+          </w:tcPr>
+          <w:p>
+            <w:pPr>
+              <w:jc w:val="center"/>
+            </w:pPr>
+            <w:r/>
+            <w:r>
+              <w:rPr>
+                <w:rFonts w:ascii="맑은 고딕" w:hAnsi="맑은 고딕" w:eastAsia="맑은 고딕"/>
+                <w:b w:val="0"/>
+                <w:sz w:val="17"/>
+              </w:rPr>
+              <w:t>●</w:t>
+            </w:r>
+          </w:p>
+        </w:tc>
+        <w:tc>
+          <w:tcPr>
+            <w:tcW w:type="dxa" w:w="1080"/>
+          </w:tcPr>
+          <w:p>
+            <w:pPr>
+              <w:jc w:val="center"/>
+            </w:pPr>
+            <w:r/>
+            <w:r>
+              <w:rPr>
+                <w:rFonts w:ascii="맑은 고딕" w:hAnsi="맑은 고딕" w:eastAsia="맑은 고딕"/>
+                <w:b w:val="0"/>
+                <w:sz w:val="17"/>
+              </w:rPr>
+            </w:r>
+          </w:p>
+        </w:tc>
+        <w:tc>
+          <w:tcPr>
+            <w:tcW w:type="dxa" w:w="1080"/>
+          </w:tcPr>
+          <w:p>
+            <w:pPr>
+              <w:jc w:val="center"/>
+            </w:pPr>
+            <w:r/>
+            <w:r>
+              <w:rPr>
+                <w:rFonts w:ascii="맑은 고딕" w:hAnsi="맑은 고딕" w:eastAsia="맑은 고딕"/>
+                <w:b w:val="0"/>
+                <w:sz w:val="17"/>
+              </w:rPr>
+              <w:t>○</w:t>
+            </w:r>
+          </w:p>
+        </w:tc>
+        <w:tc>
+          <w:tcPr>
+            <w:tcW w:type="dxa" w:w="1080"/>
+          </w:tcPr>
+          <w:p>
+            <w:pPr>
+              <w:jc w:val="center"/>
+            </w:pPr>
+            <w:r/>
+            <w:r>
+              <w:rPr>
+                <w:rFonts w:ascii="맑은 고딕" w:hAnsi="맑은 고딕" w:eastAsia="맑은 고딕"/>
+                <w:b w:val="0"/>
+                <w:sz w:val="17"/>
+              </w:rPr>
+            </w:r>
+          </w:p>
+        </w:tc>
+        <w:tc>
+          <w:tcPr>
+            <w:tcW w:type="dxa" w:w="1080"/>
+          </w:tcPr>
+          <w:p>
+            <w:pPr>
+              <w:jc w:val="center"/>
+            </w:pPr>
+            <w:r/>
+            <w:r>
+              <w:rPr>
+                <w:rFonts w:ascii="맑은 고딕" w:hAnsi="맑은 고딕" w:eastAsia="맑은 고딕"/>
+                <w:b w:val="0"/>
+                <w:sz w:val="17"/>
+              </w:rPr>
+              <w:t>○</w:t>
+            </w:r>
+          </w:p>
+        </w:tc>
+        <w:tc>
+          <w:tcPr>
+            <w:tcW w:type="dxa" w:w="1080"/>
+          </w:tcPr>
+          <w:p>
+            <w:pPr>
+              <w:jc w:val="center"/>
+            </w:pPr>
+            <w:r/>
+            <w:r>
+              <w:rPr>
+                <w:rFonts w:ascii="맑은 고딕" w:hAnsi="맑은 고딕" w:eastAsia="맑은 고딕"/>
+                <w:b w:val="0"/>
+                <w:sz w:val="17"/>
+              </w:rPr>
+              <w:t>●</w:t>
+            </w:r>
+          </w:p>
+        </w:tc>
+      </w:tr>
+      <w:tr>
+        <w:tc>
+          <w:tcPr>
+            <w:tcW w:type="dxa" w:w="1080"/>
+          </w:tcPr>
+          <w:p>
+            <w:pPr>
+              <w:jc w:val="left"/>
+            </w:pPr>
+            <w:r/>
+            <w:r>
+              <w:rPr>
+                <w:rFonts w:ascii="맑은 고딕" w:hAnsi="맑은 고딕" w:eastAsia="맑은 고딕"/>
+                <w:b w:val="0"/>
+                <w:sz w:val="17"/>
+              </w:rPr>
+              <w:t>D. 2002 거리응원</w:t>
             </w:r>
           </w:p>
         </w:tc>
@@ -3683,7 +4265,7 @@
                 <w:b w:val="0"/>
                 <w:sz w:val="17"/>
               </w:rPr>
-              <w:t>C. 태안 자원봉사</w:t>
+              <w:t>E. 태안 자원봉사(2007)</w:t>
             </w:r>
           </w:p>
         </w:tc>
@@ -3833,7 +4415,308 @@
                 <w:b w:val="0"/>
                 <w:sz w:val="17"/>
               </w:rPr>
-              <w:t>D. 프로야구 응원</w:t>
+              <w:t>F. 대구 담장 허물기</w:t>
+            </w:r>
+          </w:p>
+        </w:tc>
+        <w:tc>
+          <w:tcPr>
+            <w:tcW w:type="dxa" w:w="1080"/>
+          </w:tcPr>
+          <w:p>
+            <w:pPr>
+              <w:jc w:val="center"/>
+            </w:pPr>
+            <w:r/>
+            <w:r>
+              <w:rPr>
+                <w:rFonts w:ascii="맑은 고딕" w:hAnsi="맑은 고딕" w:eastAsia="맑은 고딕"/>
+                <w:b w:val="0"/>
+                <w:sz w:val="17"/>
+              </w:rPr>
+            </w:r>
+          </w:p>
+        </w:tc>
+        <w:tc>
+          <w:tcPr>
+            <w:tcW w:type="dxa" w:w="1080"/>
+          </w:tcPr>
+          <w:p>
+            <w:pPr>
+              <w:jc w:val="center"/>
+            </w:pPr>
+            <w:r/>
+            <w:r>
+              <w:rPr>
+                <w:rFonts w:ascii="맑은 고딕" w:hAnsi="맑은 고딕" w:eastAsia="맑은 고딕"/>
+                <w:b w:val="0"/>
+                <w:sz w:val="17"/>
+              </w:rPr>
+            </w:r>
+          </w:p>
+        </w:tc>
+        <w:tc>
+          <w:tcPr>
+            <w:tcW w:type="dxa" w:w="1080"/>
+          </w:tcPr>
+          <w:p>
+            <w:pPr>
+              <w:jc w:val="center"/>
+            </w:pPr>
+            <w:r/>
+            <w:r>
+              <w:rPr>
+                <w:rFonts w:ascii="맑은 고딕" w:hAnsi="맑은 고딕" w:eastAsia="맑은 고딕"/>
+                <w:b w:val="0"/>
+                <w:sz w:val="17"/>
+              </w:rPr>
+            </w:r>
+          </w:p>
+        </w:tc>
+        <w:tc>
+          <w:tcPr>
+            <w:tcW w:type="dxa" w:w="1080"/>
+          </w:tcPr>
+          <w:p>
+            <w:pPr>
+              <w:jc w:val="center"/>
+            </w:pPr>
+            <w:r/>
+            <w:r>
+              <w:rPr>
+                <w:rFonts w:ascii="맑은 고딕" w:hAnsi="맑은 고딕" w:eastAsia="맑은 고딕"/>
+                <w:b w:val="0"/>
+                <w:sz w:val="17"/>
+              </w:rPr>
+              <w:t>●</w:t>
+            </w:r>
+          </w:p>
+        </w:tc>
+        <w:tc>
+          <w:tcPr>
+            <w:tcW w:type="dxa" w:w="1080"/>
+          </w:tcPr>
+          <w:p>
+            <w:pPr>
+              <w:jc w:val="center"/>
+            </w:pPr>
+            <w:r/>
+            <w:r>
+              <w:rPr>
+                <w:rFonts w:ascii="맑은 고딕" w:hAnsi="맑은 고딕" w:eastAsia="맑은 고딕"/>
+                <w:b w:val="0"/>
+                <w:sz w:val="17"/>
+              </w:rPr>
+            </w:r>
+          </w:p>
+        </w:tc>
+        <w:tc>
+          <w:tcPr>
+            <w:tcW w:type="dxa" w:w="1080"/>
+          </w:tcPr>
+          <w:p>
+            <w:pPr>
+              <w:jc w:val="center"/>
+            </w:pPr>
+            <w:r/>
+            <w:r>
+              <w:rPr>
+                <w:rFonts w:ascii="맑은 고딕" w:hAnsi="맑은 고딕" w:eastAsia="맑은 고딕"/>
+                <w:b w:val="0"/>
+                <w:sz w:val="17"/>
+              </w:rPr>
+              <w:t>●</w:t>
+            </w:r>
+          </w:p>
+        </w:tc>
+        <w:tc>
+          <w:tcPr>
+            <w:tcW w:type="dxa" w:w="1080"/>
+          </w:tcPr>
+          <w:p>
+            <w:pPr>
+              <w:jc w:val="center"/>
+            </w:pPr>
+            <w:r/>
+            <w:r>
+              <w:rPr>
+                <w:rFonts w:ascii="맑은 고딕" w:hAnsi="맑은 고딕" w:eastAsia="맑은 고딕"/>
+                <w:b w:val="0"/>
+                <w:sz w:val="17"/>
+              </w:rPr>
+              <w:t>●</w:t>
+            </w:r>
+          </w:p>
+        </w:tc>
+      </w:tr>
+      <w:tr>
+        <w:tc>
+          <w:tcPr>
+            <w:tcW w:type="dxa" w:w="1080"/>
+          </w:tcPr>
+          <w:p>
+            <w:pPr>
+              <w:jc w:val="left"/>
+            </w:pPr>
+            <w:r/>
+            <w:r>
+              <w:rPr>
+                <w:rFonts w:ascii="맑은 고딕" w:hAnsi="맑은 고딕" w:eastAsia="맑은 고딕"/>
+                <w:b w:val="0"/>
+                <w:sz w:val="17"/>
+              </w:rPr>
+              <w:t>G. 강릉단오제(지역축제)</w:t>
+            </w:r>
+          </w:p>
+        </w:tc>
+        <w:tc>
+          <w:tcPr>
+            <w:tcW w:type="dxa" w:w="1080"/>
+          </w:tcPr>
+          <w:p>
+            <w:pPr>
+              <w:jc w:val="center"/>
+            </w:pPr>
+            <w:r/>
+            <w:r>
+              <w:rPr>
+                <w:rFonts w:ascii="맑은 고딕" w:hAnsi="맑은 고딕" w:eastAsia="맑은 고딕"/>
+                <w:b w:val="0"/>
+                <w:sz w:val="17"/>
+              </w:rPr>
+              <w:t>●</w:t>
+            </w:r>
+          </w:p>
+        </w:tc>
+        <w:tc>
+          <w:tcPr>
+            <w:tcW w:type="dxa" w:w="1080"/>
+          </w:tcPr>
+          <w:p>
+            <w:pPr>
+              <w:jc w:val="center"/>
+            </w:pPr>
+            <w:r/>
+            <w:r>
+              <w:rPr>
+                <w:rFonts w:ascii="맑은 고딕" w:hAnsi="맑은 고딕" w:eastAsia="맑은 고딕"/>
+                <w:b w:val="0"/>
+                <w:sz w:val="17"/>
+              </w:rPr>
+            </w:r>
+          </w:p>
+        </w:tc>
+        <w:tc>
+          <w:tcPr>
+            <w:tcW w:type="dxa" w:w="1080"/>
+          </w:tcPr>
+          <w:p>
+            <w:pPr>
+              <w:jc w:val="center"/>
+            </w:pPr>
+            <w:r/>
+            <w:r>
+              <w:rPr>
+                <w:rFonts w:ascii="맑은 고딕" w:hAnsi="맑은 고딕" w:eastAsia="맑은 고딕"/>
+                <w:b w:val="0"/>
+                <w:sz w:val="17"/>
+              </w:rPr>
+            </w:r>
+          </w:p>
+        </w:tc>
+        <w:tc>
+          <w:tcPr>
+            <w:tcW w:type="dxa" w:w="1080"/>
+          </w:tcPr>
+          <w:p>
+            <w:pPr>
+              <w:jc w:val="center"/>
+            </w:pPr>
+            <w:r/>
+            <w:r>
+              <w:rPr>
+                <w:rFonts w:ascii="맑은 고딕" w:hAnsi="맑은 고딕" w:eastAsia="맑은 고딕"/>
+                <w:b w:val="0"/>
+                <w:sz w:val="17"/>
+              </w:rPr>
+              <w:t>○</w:t>
+            </w:r>
+          </w:p>
+        </w:tc>
+        <w:tc>
+          <w:tcPr>
+            <w:tcW w:type="dxa" w:w="1080"/>
+          </w:tcPr>
+          <w:p>
+            <w:pPr>
+              <w:jc w:val="center"/>
+            </w:pPr>
+            <w:r/>
+            <w:r>
+              <w:rPr>
+                <w:rFonts w:ascii="맑은 고딕" w:hAnsi="맑은 고딕" w:eastAsia="맑은 고딕"/>
+                <w:b w:val="0"/>
+                <w:sz w:val="17"/>
+              </w:rPr>
+            </w:r>
+          </w:p>
+        </w:tc>
+        <w:tc>
+          <w:tcPr>
+            <w:tcW w:type="dxa" w:w="1080"/>
+          </w:tcPr>
+          <w:p>
+            <w:pPr>
+              <w:jc w:val="center"/>
+            </w:pPr>
+            <w:r/>
+            <w:r>
+              <w:rPr>
+                <w:rFonts w:ascii="맑은 고딕" w:hAnsi="맑은 고딕" w:eastAsia="맑은 고딕"/>
+                <w:b w:val="0"/>
+                <w:sz w:val="17"/>
+              </w:rPr>
+              <w:t>●</w:t>
+            </w:r>
+          </w:p>
+        </w:tc>
+        <w:tc>
+          <w:tcPr>
+            <w:tcW w:type="dxa" w:w="1080"/>
+          </w:tcPr>
+          <w:p>
+            <w:pPr>
+              <w:jc w:val="center"/>
+            </w:pPr>
+            <w:r/>
+            <w:r>
+              <w:rPr>
+                <w:rFonts w:ascii="맑은 고딕" w:hAnsi="맑은 고딕" w:eastAsia="맑은 고딕"/>
+                <w:b w:val="0"/>
+                <w:sz w:val="17"/>
+              </w:rPr>
+              <w:t>●</w:t>
+            </w:r>
+          </w:p>
+        </w:tc>
+      </w:tr>
+      <w:tr>
+        <w:tc>
+          <w:tcPr>
+            <w:tcW w:type="dxa" w:w="1080"/>
+          </w:tcPr>
+          <w:p>
+            <w:pPr>
+              <w:jc w:val="left"/>
+            </w:pPr>
+            <w:r/>
+            <w:r>
+              <w:rPr>
+                <w:rFonts w:ascii="맑은 고딕" w:hAnsi="맑은 고딕" w:eastAsia="맑은 고딕"/>
+                <w:b w:val="0"/>
+                <w:sz w:val="17"/>
+              </w:rPr>
+              <w:t>H. 프로야구 응원</w:t>
             </w:r>
           </w:p>
         </w:tc>
@@ -3983,7 +4866,158 @@
                 <w:b w:val="0"/>
                 <w:sz w:val="17"/>
               </w:rPr>
-              <w:t>E. 남아공 럭비(1995)</w:t>
+              <w:t>I. 코로나 시민연대(2020)</w:t>
+            </w:r>
+          </w:p>
+        </w:tc>
+        <w:tc>
+          <w:tcPr>
+            <w:tcW w:type="dxa" w:w="1080"/>
+          </w:tcPr>
+          <w:p>
+            <w:pPr>
+              <w:jc w:val="center"/>
+            </w:pPr>
+            <w:r/>
+            <w:r>
+              <w:rPr>
+                <w:rFonts w:ascii="맑은 고딕" w:hAnsi="맑은 고딕" w:eastAsia="맑은 고딕"/>
+                <w:b w:val="0"/>
+                <w:sz w:val="17"/>
+              </w:rPr>
+            </w:r>
+          </w:p>
+        </w:tc>
+        <w:tc>
+          <w:tcPr>
+            <w:tcW w:type="dxa" w:w="1080"/>
+          </w:tcPr>
+          <w:p>
+            <w:pPr>
+              <w:jc w:val="center"/>
+            </w:pPr>
+            <w:r/>
+            <w:r>
+              <w:rPr>
+                <w:rFonts w:ascii="맑은 고딕" w:hAnsi="맑은 고딕" w:eastAsia="맑은 고딕"/>
+                <w:b w:val="0"/>
+                <w:sz w:val="17"/>
+              </w:rPr>
+              <w:t>○</w:t>
+            </w:r>
+          </w:p>
+        </w:tc>
+        <w:tc>
+          <w:tcPr>
+            <w:tcW w:type="dxa" w:w="1080"/>
+          </w:tcPr>
+          <w:p>
+            <w:pPr>
+              <w:jc w:val="center"/>
+            </w:pPr>
+            <w:r/>
+            <w:r>
+              <w:rPr>
+                <w:rFonts w:ascii="맑은 고딕" w:hAnsi="맑은 고딕" w:eastAsia="맑은 고딕"/>
+                <w:b w:val="0"/>
+                <w:sz w:val="17"/>
+              </w:rPr>
+            </w:r>
+          </w:p>
+        </w:tc>
+        <w:tc>
+          <w:tcPr>
+            <w:tcW w:type="dxa" w:w="1080"/>
+          </w:tcPr>
+          <w:p>
+            <w:pPr>
+              <w:jc w:val="center"/>
+            </w:pPr>
+            <w:r/>
+            <w:r>
+              <w:rPr>
+                <w:rFonts w:ascii="맑은 고딕" w:hAnsi="맑은 고딕" w:eastAsia="맑은 고딕"/>
+                <w:b w:val="0"/>
+                <w:sz w:val="17"/>
+              </w:rPr>
+              <w:t>●</w:t>
+            </w:r>
+          </w:p>
+        </w:tc>
+        <w:tc>
+          <w:tcPr>
+            <w:tcW w:type="dxa" w:w="1080"/>
+          </w:tcPr>
+          <w:p>
+            <w:pPr>
+              <w:jc w:val="center"/>
+            </w:pPr>
+            <w:r/>
+            <w:r>
+              <w:rPr>
+                <w:rFonts w:ascii="맑은 고딕" w:hAnsi="맑은 고딕" w:eastAsia="맑은 고딕"/>
+                <w:b w:val="0"/>
+                <w:sz w:val="17"/>
+              </w:rPr>
+            </w:r>
+          </w:p>
+        </w:tc>
+        <w:tc>
+          <w:tcPr>
+            <w:tcW w:type="dxa" w:w="1080"/>
+          </w:tcPr>
+          <w:p>
+            <w:pPr>
+              <w:jc w:val="center"/>
+            </w:pPr>
+            <w:r/>
+            <w:r>
+              <w:rPr>
+                <w:rFonts w:ascii="맑은 고딕" w:hAnsi="맑은 고딕" w:eastAsia="맑은 고딕"/>
+                <w:b w:val="0"/>
+                <w:sz w:val="17"/>
+              </w:rPr>
+              <w:t>●</w:t>
+            </w:r>
+          </w:p>
+        </w:tc>
+        <w:tc>
+          <w:tcPr>
+            <w:tcW w:type="dxa" w:w="1080"/>
+          </w:tcPr>
+          <w:p>
+            <w:pPr>
+              <w:jc w:val="center"/>
+            </w:pPr>
+            <w:r/>
+            <w:r>
+              <w:rPr>
+                <w:rFonts w:ascii="맑은 고딕" w:hAnsi="맑은 고딕" w:eastAsia="맑은 고딕"/>
+                <w:b w:val="0"/>
+                <w:sz w:val="17"/>
+              </w:rPr>
+              <w:t>●</w:t>
+            </w:r>
+          </w:p>
+        </w:tc>
+      </w:tr>
+      <w:tr>
+        <w:tc>
+          <w:tcPr>
+            <w:tcW w:type="dxa" w:w="1080"/>
+          </w:tcPr>
+          <w:p>
+            <w:pPr>
+              <w:jc w:val="left"/>
+            </w:pPr>
+            <w:r/>
+            <w:r>
+              <w:rPr>
+                <w:rFonts w:ascii="맑은 고딕" w:hAnsi="맑은 고딕" w:eastAsia="맑은 고딕"/>
+                <w:b w:val="0"/>
+                <w:sz w:val="17"/>
+              </w:rPr>
+              <w:t>J. 남아공 럭비(1995)</w:t>
             </w:r>
           </w:p>
         </w:tc>
@@ -4133,7 +5167,7 @@
                 <w:b w:val="0"/>
                 <w:sz w:val="17"/>
               </w:rPr>
-              <w:t>F. 영국 빅 런치</w:t>
+              <w:t>K. 영국 빅 런치</w:t>
             </w:r>
           </w:p>
         </w:tc>
@@ -4284,7 +5318,7 @@
                 <w:b w:val="0"/>
                 <w:sz w:val="17"/>
               </w:rPr>
-              <w:t>G. 이웃의 날</w:t>
+              <w:t>L. 이웃의 날</w:t>
             </w:r>
           </w:p>
         </w:tc>
@@ -4434,7 +5468,7 @@
                 <w:b w:val="0"/>
                 <w:sz w:val="17"/>
               </w:rPr>
-              <w:t>H. 내셔널 나이트 아웃</w:t>
+              <w:t>M. 내셔널 나이트 아웃</w:t>
             </w:r>
           </w:p>
         </w:tc>
@@ -4585,6 +5619,20 @@
     </w:p>
     <w:p>
       <w:pPr>
+        <w:spacing w:after="40" w:before="0" w:line="312" w:lineRule="auto"/>
+        <w:ind w:left="1247"/>
+      </w:pPr>
+      <w:r>
+        <w:rPr>
+          <w:rFonts w:ascii="맑은 고딕" w:hAnsi="맑은 고딕" w:eastAsia="맑은 고딕"/>
+          <w:b w:val="0"/>
+          <w:sz w:val="21"/>
+        </w:rPr>
+        <w:t>· 국내 사례만으로도 전통(A)~위기극복(B·E·I)~축제(D·G·H)~생활공유(C·F) 전 유형 확보</w:t>
+      </w:r>
+    </w:p>
+    <w:p>
+      <w:pPr>
         <w:spacing w:before="160" w:after="80"/>
       </w:pPr>
       <w:r>
@@ -5090,7 +6138,7 @@
           <w:b/>
           <w:sz w:val="23"/>
         </w:rPr>
-        <w:t>□ 통합 경로는 두 갈래 — 제도형(하향식) 9개 사례(진실규명·재분배·다양성)와 경험형(상향식) 8개 사례(위기극복·축제·이웃공유)</w:t>
+        <w:t>□ 통합 경로는 두 갈래 — 제도형(하향식) 9개 사례(진실규명·재분배·다양성)와 경험형(상향식) 13개 사례(전통 상호부조·위기극복·축제·이웃 생활공유)</w:t>
       </w:r>
     </w:p>
     <w:p>

</xml_diff>